<commit_message>
No watch band: a line is favourable or it is not
The amber rating is gone with the tolerance that defined it. rag() returns
Favourable, Unfavourable or No baseline; calc_rag_watch_at is removed from the
settings, the config CSV and the packs; the summary chips count two states;
the attention chips carry one shape; and the amber styling — the KPI and
country dots, the scorecard dots, the .rag.a badge, the attention chip and the
decision card's left rule — is deleted rather than left unreachable. What
needs attention is simply what is unfavourable.

calc_rag_green_at still sets where favourable starts, and is now the whole of
the policy.

Co-Authored-By: Claude Opus 5 <noreply@anthropic.com>
Claude-Session: https://claude.ai/code/session_01P4DDZgm6WRNJpLjFRThM8B
</commit_message>
<xml_diff>
--- a/iwpb-sg-dashboard/IWPB_SG_Dashboard_README.docx
+++ b/iwpb-sg-dashboard/IWPB_SG_Dashboard_README.docx
@@ -1465,7 +1465,7 @@
         <w:t xml:space="preserve">Executive decisions</w:t>
       </w:r>
       <w:r>
-        <w:t xml:space="preserve"> panel the right, the two stretched to the same height. The panel is computed, never narrated: the lines outside the watch band rank worst-first as decision cards, each with a severity flag, the variance as its headline impact figure (233A / +11.5%), and the inferences the data supports — position vs the basis, the full-year gap to target, and the run-rate the remaining months must average — plus a </w:t>
+        <w:t xml:space="preserve"> panel the right, the two stretched to the same height. The panel is computed, never narrated: the unfavourable lines rank worst-first as decision cards, each with a severity flag, the variance as its headline impact figure (233A / +11.5%), and the inferences the data supports — position vs the basis, the full-year gap to target, and the run-rate the remaining months must average — plus a </w:t>
       </w:r>
       <w:r>
         <w:rPr>
@@ -1484,7 +1484,7 @@
         <w:ind w:left="360"/>
       </w:pPr>
       <w:r>
-        <w:t xml:space="preserve">A count badge carries the number of lines outside the watch band, cards cap at </w:t>
+        <w:t xml:space="preserve">A count badge carries the number of unfavourable lines, cards cap at </w:t>
       </w:r>
       <w:r>
         <w:rPr>
@@ -1494,7 +1494,7 @@
         <w:t xml:space="preserve">decisions_max</w:t>
       </w:r>
       <w:r>
-        <w:t xml:space="preserve"> (default 3) with the overflow noted, and a file with everything inside it says so instead. The Management commentary sits full-width beneath the pair. Clicking a tile (or a KPI in the left rail) points the trajectory and its actions at that line. The mix-analysis panel no longer shows on this page, though its view still feeds the one-page PPT export.</w:t>
+        <w:t xml:space="preserve"> (default 3) with the overflow noted, and a file with nothing unfavourable says so instead. The Management commentary sits full-width beneath the pair. Clicking a tile (or a KPI in the left rail) points the trajectory and its actions at that line. The mix-analysis panel no longer shows on this page, though its view still feeds the one-page PPT export.</w:t>
       </w:r>
     </w:p>
     <w:p>
@@ -5947,17 +5947,7 @@
         <w:t xml:space="preserve">Drivers</w:t>
       </w:r>
       <w:r>
-        <w:t xml:space="preserve"> section (Key = line or value, Value = driver note). RAG compares YTD actuals with the same prior-year months: green at or above prior year, amber within the </w:t>
-      </w:r>
-      <w:r>
-        <w:rPr>
-          <w:b/>
-          <w:bCs/>
-        </w:rPr>
-        <w:t xml:space="preserve">watch band</w:t>
-      </w:r>
-      <w:r>
-        <w:t xml:space="preserve"> below it, red beyond.</w:t>
+        <w:t xml:space="preserve"> section (Key = line or value, Value = driver note).</w:t>
       </w:r>
     </w:p>
     <w:p>
@@ -5965,7 +5955,17 @@
         <w:spacing w:after="140"/>
       </w:pPr>
       <w:r>
-        <w:t xml:space="preserve">How a line is rated is the pack's policy rather than something a reader tunes on the way past, so the thresholds live in the configuration alone — </w:t>
+        <w:t xml:space="preserve">RAG compares YTD actuals with the same prior-year months: </w:t>
+      </w:r>
+      <w:r>
+        <w:rPr>
+          <w:b/>
+          <w:bCs/>
+        </w:rPr>
+        <w:t xml:space="preserve">green at or above prior year, red below it</w:t>
+      </w:r>
+      <w:r>
+        <w:t xml:space="preserve">. There is no amber and no watch band — an in-between rating only ever meant "within a tolerance nobody agreed", and it let the same figure read three ways depending on a setting. </w:t>
       </w:r>
       <w:r>
         <w:rPr>
@@ -5975,27 +5975,7 @@
         <w:t xml:space="preserve">calc_rag_green_at</w:t>
       </w:r>
       <w:r>
-        <w:t xml:space="preserve"> sets where favourable starts and </w:t>
-      </w:r>
-      <w:r>
-        <w:rPr>
-          <w:rFonts w:ascii="Consolas" w:cs="Consolas" w:eastAsia="Consolas" w:hAnsi="Consolas"/>
-          <w:shd w:fill="F2F1ED" w:val="clear"/>
-        </w:rPr>
-        <w:t xml:space="preserve">calc_rag_watch_at</w:t>
-      </w:r>
-      <w:r>
-        <w:t xml:space="preserve"> how far below it the amber band runs (0.05 by default; set it to </w:t>
-      </w:r>
-      <w:r>
-        <w:rPr>
-          <w:rFonts w:ascii="Consolas" w:cs="Consolas" w:eastAsia="Consolas" w:hAnsi="Consolas"/>
-          <w:shd w:fill="F2F1ED" w:val="clear"/>
-        </w:rPr>
-        <w:t xml:space="preserve">0</w:t>
-      </w:r>
-      <w:r>
-        <w:t xml:space="preserve"> for green and red with no Watch band). There is no tolerance control in the left pane. Ratings are direction-aware — an increase in revenue rates Favourable while an increase in costs or ECL rates Unfavourable, whichever sign convention the file stores costs in (signed negatives or positive magnitudes).</w:t>
+        <w:t xml:space="preserve"> sets where favourable starts and is the whole of the policy; there is no tolerance control in the left pane. Ratings are direction-aware — an increase in revenue rates Favourable while an increase in costs or ECL rates Unfavourable, whichever sign convention the file stores costs in (signed negatives or positive magnitudes).</w:t>
       </w:r>
     </w:p>
     <w:p>
@@ -6228,7 +6208,7 @@
         <w:t xml:space="preserve">level2</w:t>
       </w:r>
       <w:r>
-        <w:t xml:space="preserve">), collapse of non-priority tiles, the RAG thresholds (</w:t>
+        <w:t xml:space="preserve">), collapse of non-priority tiles, the RAG threshold (</w:t>
       </w:r>
       <w:r>
         <w:rPr>
@@ -6236,16 +6216,6 @@
           <w:shd w:fill="F2F1ED" w:val="clear"/>
         </w:rPr>
         <w:t xml:space="preserve">calc_rag_green_at</w:t>
-      </w:r>
-      <w:r>
-        <w:t xml:space="preserve">, </w:t>
-      </w:r>
-      <w:r>
-        <w:rPr>
-          <w:rFonts w:ascii="Consolas" w:cs="Consolas" w:eastAsia="Consolas" w:hAnsi="Consolas"/>
-          <w:shd w:fill="F2F1ED" w:val="clear"/>
-        </w:rPr>
-        <w:t xml:space="preserve">calc_rag_watch_at</w:t>
       </w:r>
       <w:r>
         <w:t xml:space="preserve">), the regex patterns that recognise Forecast and Target columns, the cost/ECL direction patterns, the hidden-comparison patterns for target-only files, the My dashboard page size, and </w:t>

</xml_diff>

<commit_message>
Executive decisions rank on unfavourable, not on a tolerance
The panel still asks for the decisions, on the two ratings that remain: an
unfavourable line raises a card, worst-first, with its variance as the impact
figure and the same inferences beneath it; the badge counts the unfavourable
lines; the overflow note and the all-clear read "+10 more unfavourable lines"
and "Every line is favourable on YTD vs forecast — no decisions required"
rather than speaking of a tolerance that no longer exists. The dead amber rank
is gone from the sort.

Co-Authored-By: Claude Opus 5 <noreply@anthropic.com>
Claude-Session: https://claude.ai/code/session_01P4DDZgm6WRNJpLjFRThM8B
</commit_message>
<xml_diff>
--- a/iwpb-sg-dashboard/IWPB_SG_Dashboard_README.docx
+++ b/iwpb-sg-dashboard/IWPB_SG_Dashboard_README.docx
@@ -1465,7 +1465,17 @@
         <w:t xml:space="preserve">Executive decisions</w:t>
       </w:r>
       <w:r>
-        <w:t xml:space="preserve"> panel the right, the two stretched to the same height. The panel is computed, never narrated: the unfavourable lines rank worst-first as decision cards, each with a severity flag, the variance as its headline impact figure (233A / +11.5%), and the inferences the data supports — position vs the basis, the full-year gap to target, and the run-rate the remaining months must average — plus a </w:t>
+        <w:t xml:space="preserve"> panel the right, the two stretched to the same height. The panel is computed, never narrated: </w:t>
+      </w:r>
+      <w:r>
+        <w:rPr>
+          <w:b/>
+          <w:bCs/>
+        </w:rPr>
+        <w:t xml:space="preserve">a decision is asked for where a line is unfavourable</w:t>
+      </w:r>
+      <w:r>
+        <w:t xml:space="preserve">, so those lines rank worst-first as decision cards, each with the variance as its headline impact figure (233A / +11.5%), and the inferences the data supports — position vs the basis, the full-year gap to target, and the run-rate the remaining months must average — plus a </w:t>
       </w:r>
       <w:r>
         <w:rPr>

</xml_diff>

<commit_message>
Remove the run-rate arithmetic
Solving for the monthly figure the rest of the year "needs" spreads a target
evenly over the remaining months and calls the answer a requirement, which no
plan works that way. It is gone from the three places it appeared: the
decision card, the trajectory panel's inference list and the MI Assistant,
whose run-rate analysis, suggested question, keyword route and dispatch entry
are all removed — asking for one now gets the honest ask-back listing the
analyses that remain.

A decision card states position against the basis and the full-year gap to
target, which the file actually carries.

Co-Authored-By: Claude Opus 5 <noreply@anthropic.com>
Claude-Session: https://claude.ai/code/session_01P4DDZgm6WRNJpLjFRThM8B
</commit_message>
<xml_diff>
--- a/iwpb-sg-dashboard/IWPB_SG_Dashboard_README.docx
+++ b/iwpb-sg-dashboard/IWPB_SG_Dashboard_README.docx
@@ -962,7 +962,7 @@
         <w:t xml:space="preserve">▲15.6%</w:t>
       </w:r>
       <w:r>
-        <w:t xml:space="preserve">), never as a signed number that flips meaning between a file storing costs as negatives and one storing them as positives, so the text and the legend can never disagree with each other or with the tile they sit beside. Two figures that are demands rather than movements — the monthly run-rate a target needs, and the momentum of the last three months — say </w:t>
+        <w:t xml:space="preserve">), never as a signed number that flips meaning between a file storing costs as negatives and one storing them as positives, so the text and the legend can never disagree with each other or with the tile they sit beside. The momentum of the last three months is a reading rather than a movement, so it says </w:t>
       </w:r>
       <w:r>
         <w:rPr>
@@ -982,7 +982,7 @@
         <w:t xml:space="preserve">below</w:t>
       </w:r>
       <w:r>
-        <w:t xml:space="preserve"> the current pace in words and carry no favourability colour, because a bigger requirement is not a better or a worse result. The management commentary keeps the pack's F/A wording with the triangle joining the letter — </w:t>
+        <w:t xml:space="preserve"> the current pace in words and carries no favourability colour. The management commentary keeps the pack's F/A wording with the triangle joining the letter — </w:t>
       </w:r>
       <w:r>
         <w:rPr>
@@ -1475,7 +1475,7 @@
         <w:t xml:space="preserve">a decision is asked for where a line is unfavourable</w:t>
       </w:r>
       <w:r>
-        <w:t xml:space="preserve">, so those lines rank worst-first as decision cards, each with the variance as its headline impact figure (233A / +11.5%), and the inferences the data supports — position vs the basis, the full-year gap to target, and the run-rate the remaining months must average — plus a </w:t>
+        <w:t xml:space="preserve">, so those lines rank worst-first as decision cards, each with the variance as its headline impact figure (233A / +11.5%), and the inferences the data supports — position vs the basis and the full-year gap to target — plus a </w:t>
       </w:r>
       <w:r>
         <w:rPr>
@@ -5620,7 +5620,7 @@
         <w:t xml:space="preserve">plain language</w:t>
       </w:r>
       <w:r>
-        <w:t xml:space="preserve">: type the question in your own words and a comprehension layer works out the intent (how are we doing, why did it move, what is behind, break it down by X, monthly trend, run-rate, costs, ECL, target) together with anything the question names — a line, product, business line, region or country. Names are matched against the values actually in the loaded file, longest first, with the Global Business dimensions (business line, region, country) winning over the same text in an ordinary driller column — so "iwpb" reads as the business line, not the CG Level 1 code. Case does not matter except for codes that are also ordinary words (</w:t>
+        <w:t xml:space="preserve">: type the question in your own words and a comprehension layer works out the intent (how are we doing, why did it move, what is behind, break it down by X, monthly trend, costs, ECL, target) together with anything the question names — a line, product, business line, region or country. Names are matched against the values actually in the loaded file, longest first, with the Global Business dimensions (business line, region, country) winning over the same text in an ordinary driller column — so "iwpb" reads as the business line, not the CG Level 1 code. Case does not matter except for codes that are also ordinary words (</w:t>
       </w:r>
       <w:r>
         <w:rPr>
@@ -5675,7 +5675,7 @@
         <w:ind w:left="360"/>
       </w:pPr>
       <w:r>
-        <w:t xml:space="preserve">Behind it sit the approved analyses (performance, lines behind forecast, FY target, top/dragging products, costs, ECL, required run-rate, prior year, contribution mix, movement drivers, dimension breakdowns, monthly trend, geography comparisons) answered deterministically in the browser from the filtered data on the standard comparison basis, plus geography comparisons — countries, regions and business lines side by side with share and RAG.</w:t>
+        <w:t xml:space="preserve">Behind it sit the approved analyses (performance, lines behind forecast, FY target, top/dragging products, costs, ECL, prior year, contribution mix, movement drivers, dimension breakdowns, monthly trend, geography comparisons) answered deterministically in the browser from the filtered data on the standard comparison basis, plus geography comparisons — countries, regions and business lines side by side with share and RAG.</w:t>
       </w:r>
     </w:p>
     <w:p>

</xml_diff>

<commit_message>
Remove the rest of the run-rate arithmetic: no month is averaged
An average across months is a run-rate by another name, so the momentum
readings go with the requirement that went before them: the trajectory
panel's "the last three actual months average X against Y before", the same
sentence in a trend chart's commentary, the assistant's ECL monthly average
and its average of the remaining forecast months. Each is replaced by
something the file actually carries — the strongest actual month, the first
and last forecast months, the latest actual on its own.

check_norunrate.js now reads the page's innerText rather than its
textContent (the page carries its own source in a script tag) and fails on
any averaging language anywhere on the summary.

Co-Authored-By: Claude Opus 5 <noreply@anthropic.com>
Claude-Session: https://claude.ai/code/session_01P4DDZgm6WRNJpLjFRThM8B
</commit_message>
<xml_diff>
--- a/iwpb-sg-dashboard/IWPB_SG_Dashboard_README.docx
+++ b/iwpb-sg-dashboard/IWPB_SG_Dashboard_README.docx
@@ -943,16 +943,7 @@
         <w:t xml:space="preserve">colour is what that movement means</w:t>
       </w:r>
       <w:r>
-        <w:t xml:space="preserve"> — a cost or ECL going up is ▲ red, revenue or a balance going up is ▲ green, a cost coming down is ▼ green.</w:t>
-      </w:r>
-    </w:p>
-    <w:p>
-      <w:pPr>
-        <w:spacing w:after="100"/>
-        <w:ind w:left="360"/>
-      </w:pPr>
-      <w:r>
-        <w:t xml:space="preserve">Percentages are written as magnitudes (</w:t>
+        <w:t xml:space="preserve"> — a cost or ECL going up is ▲ red, revenue or a balance going up is ▲ green, a cost coming down is ▼ green. Percentages are written as magnitudes (</w:t>
       </w:r>
       <w:r>
         <w:rPr>
@@ -962,27 +953,7 @@
         <w:t xml:space="preserve">▲15.6%</w:t>
       </w:r>
       <w:r>
-        <w:t xml:space="preserve">), never as a signed number that flips meaning between a file storing costs as negatives and one storing them as positives, so the text and the legend can never disagree with each other or with the tile they sit beside. The momentum of the last three months is a reading rather than a movement, so it says </w:t>
-      </w:r>
-      <w:r>
-        <w:rPr>
-          <w:b/>
-          <w:bCs/>
-        </w:rPr>
-        <w:t xml:space="preserve">above</w:t>
-      </w:r>
-      <w:r>
-        <w:t xml:space="preserve"> or </w:t>
-      </w:r>
-      <w:r>
-        <w:rPr>
-          <w:b/>
-          <w:bCs/>
-        </w:rPr>
-        <w:t xml:space="preserve">below</w:t>
-      </w:r>
-      <w:r>
-        <w:t xml:space="preserve"> the current pace in words and carries no favourability colour. The management commentary keeps the pack's F/A wording with the triangle joining the letter — </w:t>
+        <w:t xml:space="preserve">), never as a signed number that flips meaning between a file storing costs as negatives and one storing them as positives, so the text and the legend can never disagree with each other or with the tile they sit beside. The management commentary keeps the pack's F/A wording with the triangle joining the letter — </w:t>
       </w:r>
       <w:r>
         <w:rPr>

</xml_diff>

<commit_message>
README: the country dropdown keeps the Business · Region association
Co-Authored-By: Claude Opus 5 <noreply@anthropic.com>
Claude-Session: https://claude.ai/code/session_01P4DDZgm6WRNJpLjFRThM8B
</commit_message>
<xml_diff>
--- a/iwpb-sg-dashboard/IWPB_SG_Dashboard_README.docx
+++ b/iwpb-sg-dashboard/IWPB_SG_Dashboard_README.docx
@@ -769,6 +769,44 @@
       </w:r>
       <w:r>
         <w:t xml:space="preserve">, each the sum of its countries), with the countries in the picker beneath.</w:t>
+      </w:r>
+    </w:p>
+    <w:p>
+      <w:pPr>
+        <w:spacing w:after="140"/>
+      </w:pPr>
+      <w:r>
+        <w:t xml:space="preserve">The scope bar's </w:t>
+      </w:r>
+      <w:r>
+        <w:rPr>
+          <w:b/>
+          <w:bCs/>
+        </w:rPr>
+        <w:t xml:space="preserve">country dropdown keeps the same association</w:t>
+      </w:r>
+      <w:r>
+        <w:t xml:space="preserve">: countries are grouped under their </w:t>
+      </w:r>
+      <w:r>
+        <w:rPr>
+          <w:rFonts w:ascii="Consolas" w:cs="Consolas" w:eastAsia="Consolas" w:hAnsi="Consolas"/>
+          <w:shd w:fill="F2F1ED" w:val="clear"/>
+        </w:rPr>
+        <w:t xml:space="preserve">Business · Region</w:t>
+      </w:r>
+      <w:r>
+        <w:t xml:space="preserve"> headings rather than listed flat, and picking Singapore under </w:t>
+      </w:r>
+      <w:r>
+        <w:rPr>
+          <w:rFonts w:ascii="Consolas" w:cs="Consolas" w:eastAsia="Consolas" w:hAnsi="Consolas"/>
+          <w:shd w:fill="F2F1ED" w:val="clear"/>
+        </w:rPr>
+        <w:t xml:space="preserve">CIB · Asia</w:t>
+      </w:r>
+      <w:r>
+        <w:t xml:space="preserve"> scopes to CIB's Singapore, not to every Singapore.</w:t>
       </w:r>
     </w:p>
     <w:p>

</xml_diff>

<commit_message>
The top of the tree is named Group where a consolidation exists
A file carrying a Group tab showed "Global" — its CountryHierarchy's Level 1
label — at the top of the strip and as the region dropdown's everything
option, so the Group was on the page but never named. Where the file carries
a consolidation the strip's top row and the dropdown's everything-option now
read Group; a file without one keeps its hierarchy's own name.

Co-Authored-By: Claude Opus 5 <noreply@anthropic.com>
Claude-Session: https://claude.ai/code/session_01P4DDZgm6WRNJpLjFRThM8B
</commit_message>
<xml_diff>
--- a/iwpb-sg-dashboard/IWPB_SG_Dashboard_README.docx
+++ b/iwpb-sg-dashboard/IWPB_SG_Dashboard_README.docx
@@ -806,7 +806,17 @@
         <w:t xml:space="preserve">CIB · Asia</w:t>
       </w:r>
       <w:r>
-        <w:t xml:space="preserve"> scopes to CIB's Singapore, not to every Singapore.</w:t>
+        <w:t xml:space="preserve"> scopes to CIB's Singapore, not to every Singapore. And wherever the file carries a Group consolidation, the top of the tree and the dropdowns' everything-option are named </w:t>
+      </w:r>
+      <w:r>
+        <w:rPr>
+          <w:b/>
+          <w:bCs/>
+        </w:rPr>
+        <w:t xml:space="preserve">Group</w:t>
+      </w:r>
+      <w:r>
+        <w:t xml:space="preserve"> — choosing it reads the consolidation, so it says so, rather than whatever the CountryHierarchy calls its Level 1.</w:t>
       </w:r>
     </w:p>
     <w:p>

</xml_diff>

<commit_message>
Prove the hierarchy never leaks into the dropdowns
An entry the CountryHierarchy knows but the loaded file does not carry is
not offered anywhere — that was already how every picker is built (from the
loaded rows, never the hierarchy), and check_biztiers now pins it: thirty
hierarchy countries across five regions against a two-country file, with
nothing hierarchy-only offered in the dropdowns, the strip or the picker.

Co-Authored-By: Claude Opus 5 <noreply@anthropic.com>
Claude-Session: https://claude.ai/code/session_01P4DDZgm6WRNJpLjFRThM8B
</commit_message>
<xml_diff>
--- a/iwpb-sg-dashboard/IWPB_SG_Dashboard_README.docx
+++ b/iwpb-sg-dashboard/IWPB_SG_Dashboard_README.docx
@@ -817,6 +817,14 @@
       </w:r>
       <w:r>
         <w:t xml:space="preserve"> — choosing it reads the consolidation, so it says so, rather than whatever the CountryHierarchy calls its Level 1.</w:t>
+      </w:r>
+    </w:p>
+    <w:p>
+      <w:pPr>
+        <w:spacing w:after="140"/>
+      </w:pPr>
+      <w:r>
+        <w:t xml:space="preserve">The hierarchy never leaks the other way: an entry with no tab in the loaded file — a country or a whole region the CountryHierarchy knows but this month's driller does not carry — is not offered in any dropdown, strip row or picker. The hierarchy places what is loaded; it never invents entries.</w:t>
       </w:r>
     </w:p>
     <w:p>

</xml_diff>

<commit_message>
Group and Global are different words for different things
The Group is every business together, summed or read from the Group tab; a
Global business is one business consolidated across its regions. So a
single-business file with no Group tab is now headed Global IWPB — the strip
top row and the region dropdown's everything-option alike — where it used to
borrow the hierarchy's Level 1 label. A multi-business file's dropdown reads
Group even without a tab, because choosing it sums every business, which is
the Group. Files with a Group tab keep reading Group with the Consol tag.

Co-Authored-By: Claude Opus 5 <noreply@anthropic.com>
Claude-Session: https://claude.ai/code/session_01P4DDZgm6WRNJpLjFRThM8B
</commit_message>
<xml_diff>
--- a/iwpb-sg-dashboard/IWPB_SG_Dashboard_README.docx
+++ b/iwpb-sg-dashboard/IWPB_SG_Dashboard_README.docx
@@ -825,6 +825,51 @@
       </w:pPr>
       <w:r>
         <w:t xml:space="preserve">The hierarchy never leaks the other way: an entry with no tab in the loaded file — a country or a whole region the CountryHierarchy knows but this month's driller does not carry — is not offered in any dropdown, strip row or picker. The hierarchy places what is loaded; it never invents entries.</w:t>
+      </w:r>
+    </w:p>
+    <w:p>
+      <w:pPr>
+        <w:spacing w:after="140"/>
+      </w:pPr>
+      <w:r>
+        <w:rPr>
+          <w:b/>
+          <w:bCs/>
+        </w:rPr>
+        <w:t xml:space="preserve">Group and Global are different words for different things.</w:t>
+      </w:r>
+      <w:r>
+        <w:t xml:space="preserve"> The </w:t>
+      </w:r>
+      <w:r>
+        <w:rPr>
+          <w:b/>
+          <w:bCs/>
+        </w:rPr>
+        <w:t xml:space="preserve">Group</w:t>
+      </w:r>
+      <w:r>
+        <w:t xml:space="preserve"> is every business together — summed, or read from the Group tab — so the top of a multi-business file, and of any file carrying a Group tab, is named Group. A </w:t>
+      </w:r>
+      <w:r>
+        <w:rPr>
+          <w:b/>
+          <w:bCs/>
+        </w:rPr>
+        <w:t xml:space="preserve">Global business</w:t>
+      </w:r>
+      <w:r>
+        <w:t xml:space="preserve"> is one business consolidated across its regions, so a single-business file with no Group tab is headed </w:t>
+      </w:r>
+      <w:r>
+        <w:rPr>
+          <w:b/>
+          <w:bCs/>
+        </w:rPr>
+        <w:t xml:space="preserve">Global IWPB</w:t>
+      </w:r>
+      <w:r>
+        <w:t xml:space="preserve">, never Group.</w:t>
       </w:r>
     </w:p>
     <w:p>

</xml_diff>

<commit_message>
README Word document regenerated for the six-basis variance selector
Co-Authored-By: Claude Fable 5 <noreply@anthropic.com>
Claude-Session: https://claude.ai/code/session_01P4DDZgm6WRNJpLjFRThM8B
</commit_message>
<xml_diff>
--- a/iwpb-sg-dashboard/IWPB_SG_Dashboard_README.docx
+++ b/iwpb-sg-dashboard/IWPB_SG_Dashboard_README.docx
@@ -6448,7 +6448,7 @@
           <w:ilvl w:val="0"/>
           <w:numId w:val="3"/>
         </w:numPr>
-        <w:spacing w:after="80"/>
+        <w:spacing w:after="100"/>
       </w:pPr>
       <w:r>
         <w:rPr>
@@ -6548,7 +6548,76 @@
         <w:t xml:space="preserve">variance_periods</w:t>
       </w:r>
       <w:r>
-        <w:t xml:space="preserve"> — the ordered list of comparison bases offered in the left pane (any of </w:t>
+        <w:t xml:space="preserve"> — the ordered list of comparison bases offered in the left pane.</w:t>
+      </w:r>
+    </w:p>
+    <w:p>
+      <w:pPr>
+        <w:spacing w:after="100"/>
+        <w:ind w:left="360"/>
+      </w:pPr>
+      <w:r>
+        <w:t xml:space="preserve">By default this is exactly the six comparisons the All Commentaries pack writes, in the pack's order — </w:t>
+      </w:r>
+      <w:r>
+        <w:rPr>
+          <w:rFonts w:ascii="Consolas" w:cs="Consolas" w:eastAsia="Consolas" w:hAnsi="Consolas"/>
+          <w:shd w:fill="F2F1ED" w:val="clear"/>
+        </w:rPr>
+        <w:t xml:space="preserve">qtr_py</w:t>
+      </w:r>
+      <w:r>
+        <w:t xml:space="preserve">, </w:t>
+      </w:r>
+      <w:r>
+        <w:rPr>
+          <w:rFonts w:ascii="Consolas" w:cs="Consolas" w:eastAsia="Consolas" w:hAnsi="Consolas"/>
+          <w:shd w:fill="F2F1ED" w:val="clear"/>
+        </w:rPr>
+        <w:t xml:space="preserve">ytd_tgt</w:t>
+      </w:r>
+      <w:r>
+        <w:t xml:space="preserve">, </w:t>
+      </w:r>
+      <w:r>
+        <w:rPr>
+          <w:rFonts w:ascii="Consolas" w:cs="Consolas" w:eastAsia="Consolas" w:hAnsi="Consolas"/>
+          <w:shd w:fill="F2F1ED" w:val="clear"/>
+        </w:rPr>
+        <w:t xml:space="preserve">mth_fc</w:t>
+      </w:r>
+      <w:r>
+        <w:t xml:space="preserve">, </w:t>
+      </w:r>
+      <w:r>
+        <w:rPr>
+          <w:rFonts w:ascii="Consolas" w:cs="Consolas" w:eastAsia="Consolas" w:hAnsi="Consolas"/>
+          <w:shd w:fill="F2F1ED" w:val="clear"/>
+        </w:rPr>
+        <w:t xml:space="preserve">fy_pfc</w:t>
+      </w:r>
+      <w:r>
+        <w:t xml:space="preserve">, </w:t>
+      </w:r>
+      <w:r>
+        <w:rPr>
+          <w:rFonts w:ascii="Consolas" w:cs="Consolas" w:eastAsia="Consolas" w:hAnsi="Consolas"/>
+          <w:shd w:fill="F2F1ED" w:val="clear"/>
+        </w:rPr>
+        <w:t xml:space="preserve">fy_py</w:t>
+      </w:r>
+      <w:r>
+        <w:t xml:space="preserve">, </w:t>
+      </w:r>
+      <w:r>
+        <w:rPr>
+          <w:rFonts w:ascii="Consolas" w:cs="Consolas" w:eastAsia="Consolas" w:hAnsi="Consolas"/>
+          <w:shd w:fill="F2F1ED" w:val="clear"/>
+        </w:rPr>
+        <w:t xml:space="preserve">fy_tgt</w:t>
+      </w:r>
+      <w:r>
+        <w:t xml:space="preserve"> — so the selector and the pack read one basis list; the page lands on the first of them the file can serve. A config can still narrow or extend the list (</w:t>
       </w:r>
       <w:r>
         <w:rPr>
@@ -6585,7 +6654,7 @@
           <w:rFonts w:ascii="Consolas" w:cs="Consolas" w:eastAsia="Consolas" w:hAnsi="Consolas"/>
           <w:shd w:fill="F2F1ED" w:val="clear"/>
         </w:rPr>
-        <w:t xml:space="preserve">ytd_tgt</w:t>
+        <w:t xml:space="preserve">mom</w:t>
       </w:r>
       <w:r>
         <w:t xml:space="preserve">, </w:t>
@@ -6595,7 +6664,7 @@
           <w:rFonts w:ascii="Consolas" w:cs="Consolas" w:eastAsia="Consolas" w:hAnsi="Consolas"/>
           <w:shd w:fill="F2F1ED" w:val="clear"/>
         </w:rPr>
-        <w:t xml:space="preserve">mom</w:t>
+        <w:t xml:space="preserve">mth_py</w:t>
       </w:r>
       <w:r>
         <w:t xml:space="preserve">, </w:t>
@@ -6605,50 +6674,10 @@
           <w:rFonts w:ascii="Consolas" w:cs="Consolas" w:eastAsia="Consolas" w:hAnsi="Consolas"/>
           <w:shd w:fill="F2F1ED" w:val="clear"/>
         </w:rPr>
-        <w:t xml:space="preserve">mth_py</w:t>
-      </w:r>
-      <w:r>
-        <w:t xml:space="preserve">, </w:t>
-      </w:r>
-      <w:r>
-        <w:rPr>
-          <w:rFonts w:ascii="Consolas" w:cs="Consolas" w:eastAsia="Consolas" w:hAnsi="Consolas"/>
-          <w:shd w:fill="F2F1ED" w:val="clear"/>
-        </w:rPr>
         <w:t xml:space="preserve">mth_tgt</w:t>
       </w:r>
       <w:r>
-        <w:t xml:space="preserve">, </w:t>
-      </w:r>
-      <w:r>
-        <w:rPr>
-          <w:rFonts w:ascii="Consolas" w:cs="Consolas" w:eastAsia="Consolas" w:hAnsi="Consolas"/>
-          <w:shd w:fill="F2F1ED" w:val="clear"/>
-        </w:rPr>
-        <w:t xml:space="preserve">mth_fc</w:t>
-      </w:r>
-      <w:r>
-        <w:t xml:space="preserve">, </w:t>
-      </w:r>
-      <w:r>
-        <w:rPr>
-          <w:rFonts w:ascii="Consolas" w:cs="Consolas" w:eastAsia="Consolas" w:hAnsi="Consolas"/>
-          <w:shd w:fill="F2F1ED" w:val="clear"/>
-        </w:rPr>
-        <w:t xml:space="preserve">fy_tgt</w:t>
-      </w:r>
-      <w:r>
-        <w:t xml:space="preserve">, </w:t>
-      </w:r>
-      <w:r>
-        <w:rPr>
-          <w:rFonts w:ascii="Consolas" w:cs="Consolas" w:eastAsia="Consolas" w:hAnsi="Consolas"/>
-          <w:shd w:fill="F2F1ED" w:val="clear"/>
-        </w:rPr>
-        <w:t xml:space="preserve">fy_py</w:t>
-      </w:r>
-      <w:r>
-        <w:t xml:space="preserve">; entries a file cannot serve are hidden automatically).</w:t>
+        <w:t xml:space="preserve"> remain understood); entries a file cannot serve are hidden automatically.</w:t>
       </w:r>
     </w:p>
     <w:p>

</xml_diff>

<commit_message>
Commentary templates onboard from the left pane
A Commentary templates section in the left pane takes a template
written the way the reader writes it: a name, a token pattern, and a
live preview that words the file's first statement line as they type.
Saving makes it the active style and offers it on both selectors
beside the config's templates; it is kept in the browser across
sessions, a template saved under a config style's name overrides that
style for this reader alone, and deleting the active template falls
back to the pack narrative. Download as config rows turns the saved
set into CommentaryTemplates CSV rows for promoting a personal style
into the shared workbook.

Co-Authored-By: Claude Fable 5 <noreply@anthropic.com>
Claude-Session: https://claude.ai/code/session_01P4DDZgm6WRNJpLjFRThM8B
</commit_message>
<xml_diff>
--- a/iwpb-sg-dashboard/IWPB_SG_Dashboard_README.docx
+++ b/iwpb-sg-dashboard/IWPB_SG_Dashboard_README.docx
@@ -4765,6 +4765,52 @@
       </w:r>
       <w:r>
         <w:t xml:space="preserve"> in Settings names the default style, and the reader's own pick on the panel is remembered. The Word and PPT exports carry whichever style is on the page.</w:t>
+      </w:r>
+    </w:p>
+    <w:p>
+      <w:pPr>
+        <w:spacing w:after="140"/>
+        <w:ind w:left="360"/>
+      </w:pPr>
+      <w:r>
+        <w:rPr>
+          <w:b/>
+          <w:bCs/>
+        </w:rPr>
+        <w:t xml:space="preserve">Onboarding templates from the left pane.</w:t>
+      </w:r>
+      <w:r>
+        <w:t xml:space="preserve"> The </w:t>
+      </w:r>
+      <w:r>
+        <w:rPr>
+          <w:b/>
+          <w:bCs/>
+        </w:rPr>
+        <w:t xml:space="preserve">Commentary templates</w:t>
+      </w:r>
+      <w:r>
+        <w:t xml:space="preserve"> section in the left pane takes a template written the way you write it: name it, type the pattern, and a live preview words the file's first statement line as you type. Saving makes it the active style and offers it on both selectors alongside the config's templates; it is kept in the browser across sessions, and a template saved under a config style's name overrides that style for you alone. </w:t>
+      </w:r>
+      <w:r>
+        <w:rPr>
+          <w:b/>
+          <w:bCs/>
+        </w:rPr>
+        <w:t xml:space="preserve">Download as config rows</w:t>
+      </w:r>
+      <w:r>
+        <w:t xml:space="preserve"> turns your saved templates into </w:t>
+      </w:r>
+      <w:r>
+        <w:rPr>
+          <w:rFonts w:ascii="Consolas" w:cs="Consolas" w:eastAsia="Consolas" w:hAnsi="Consolas"/>
+          <w:shd w:fill="F2F1ED" w:val="clear"/>
+        </w:rPr>
+        <w:t xml:space="preserve">CommentaryTemplates</w:t>
+      </w:r>
+      <w:r>
+        <w:t xml:space="preserve"> CSV rows ready to paste into the config workbook when a personal style should become the team's.</w:t>
       </w:r>
     </w:p>
     <w:p>

</xml_diff>

<commit_message>
A whole template set onboards in one upload
An Upload templates button in the pane reads a workbook or CSV of
Style | Scope | Pattern rows and merges every row into the saved set
in one go - no pasting per template. The merge is keyed by style AND
scope, so one style keeps its global, regional and country rows and a
re-upload updates in place rather than duplicating; nothing else in
the configuration is touched, and uploaded rows outrank the config's
on the same scope. sample/My_Commentary_Templates.xlsx shows the
shape.

Co-Authored-By: Claude Fable 5 <noreply@anthropic.com>
Claude-Session: https://claude.ai/code/session_01P4DDZgm6WRNJpLjFRThM8B
</commit_message>
<xml_diff>
--- a/iwpb-sg-dashboard/IWPB_SG_Dashboard_README.docx
+++ b/iwpb-sg-dashboard/IWPB_SG_Dashboard_README.docx
@@ -5002,6 +5002,81 @@
       </w:r>
       <w:r>
         <w:t xml:space="preserve"> CSV rows ready to paste into the config workbook when a personal style should become the team's.</w:t>
+      </w:r>
+    </w:p>
+    <w:p>
+      <w:pPr>
+        <w:spacing w:after="140"/>
+        <w:ind w:left="360"/>
+      </w:pPr>
+      <w:r>
+        <w:rPr>
+          <w:b/>
+          <w:bCs/>
+        </w:rPr>
+        <w:t xml:space="preserve">Onboarding a whole set at once — no pasting.</w:t>
+      </w:r>
+      <w:r>
+        <w:t xml:space="preserve"> Keep your templates in their own workbook or CSV of </w:t>
+      </w:r>
+      <w:r>
+        <w:rPr>
+          <w:rFonts w:ascii="Consolas" w:cs="Consolas" w:eastAsia="Consolas" w:hAnsi="Consolas"/>
+          <w:shd w:fill="F2F1ED" w:val="clear"/>
+        </w:rPr>
+        <w:t xml:space="preserve">Style | Scope | Pattern</w:t>
+      </w:r>
+      <w:r>
+        <w:t xml:space="preserve"> rows and press </w:t>
+      </w:r>
+      <w:r>
+        <w:rPr>
+          <w:b/>
+          <w:bCs/>
+        </w:rPr>
+        <w:t xml:space="preserve">⤒ Upload templates</w:t>
+      </w:r>
+      <w:r>
+        <w:t xml:space="preserve"> in the pane: every row merges into your saved set in one go, keyed by style </w:t>
+      </w:r>
+      <w:r>
+        <w:rPr>
+          <w:i/>
+          <w:iCs/>
+        </w:rPr>
+        <w:t xml:space="preserve">and</w:t>
+      </w:r>
+      <w:r>
+        <w:t xml:space="preserve"> scope so one style keeps its global, regional and country rows and a re-upload updates in place rather than duplicating.</w:t>
+      </w:r>
+    </w:p>
+    <w:p>
+      <w:pPr>
+        <w:spacing w:after="140"/>
+        <w:ind w:left="360"/>
+      </w:pPr>
+      <w:r>
+        <w:t xml:space="preserve">Nothing else in the configuration is touched — unlike a config upload, which replaces the whole configuration. Your uploaded rows outrank the config's on the same scope, and </w:t>
+      </w:r>
+      <w:r>
+        <w:rPr>
+          <w:rFonts w:ascii="Consolas" w:cs="Consolas" w:eastAsia="Consolas" w:hAnsi="Consolas"/>
+          <w:shd w:fill="F2F1ED" w:val="clear"/>
+        </w:rPr>
+        <w:t xml:space="preserve">sample/My_Commentary_Templates.xlsx</w:t>
+      </w:r>
+      <w:r>
+        <w:t xml:space="preserve"> shows the shape. For a set the whole team should have without anyone uploading anything, put the same rows in the config pack's </w:t>
+      </w:r>
+      <w:r>
+        <w:rPr>
+          <w:rFonts w:ascii="Consolas" w:cs="Consolas" w:eastAsia="Consolas" w:hAnsi="Consolas"/>
+          <w:shd w:fill="F2F1ED" w:val="clear"/>
+        </w:rPr>
+        <w:t xml:space="preserve">CommentaryTemplates</w:t>
+      </w:r>
+      <w:r>
+        <w:t xml:space="preserve"> tab instead — they arrive with the config and the browser remembers them across sessions.</w:t>
       </w:r>
     </w:p>
     <w:p>

</xml_diff>

<commit_message>
README covers the style on every surface
Co-Authored-By: Claude Fable 5 <noreply@anthropic.com>
Claude-Session: https://claude.ai/code/session_01P4DDZgm6WRNJpLjFRThM8B
</commit_message>
<xml_diff>
--- a/iwpb-sg-dashboard/IWPB_SG_Dashboard_README.docx
+++ b/iwpb-sg-dashboard/IWPB_SG_Dashboard_README.docx
@@ -4940,6 +4940,52 @@
       </w:r>
       <w:r>
         <w:t xml:space="preserve"> when IWPB is selected. A scope with no template defined speaks the pack narrative, so IWPB can have its own voice while CIB reads the standard one until CIB defines its own. Both packs ship worked examples; a hand-picked style always overrides the scope.</w:t>
+      </w:r>
+    </w:p>
+    <w:p>
+      <w:pPr>
+        <w:spacing w:after="140"/>
+        <w:ind w:left="360"/>
+      </w:pPr>
+      <w:r>
+        <w:rPr>
+          <w:b/>
+          <w:bCs/>
+        </w:rPr>
+        <w:t xml:space="preserve">The style speaks on every composed surface.</w:t>
+      </w:r>
+      <w:r>
+        <w:t xml:space="preserve"> The active style — Auto-resolved or hand-picked — words the Management Commentary, each </w:t>
+      </w:r>
+      <w:r>
+        <w:rPr>
+          <w:b/>
+          <w:bCs/>
+        </w:rPr>
+        <w:t xml:space="preserve">All Commentaries</w:t>
+      </w:r>
+      <w:r>
+        <w:t xml:space="preserve"> section (on that section's own basis, so the same sentence shape reads vs PY in one section and vs Target in the next), and the </w:t>
+      </w:r>
+      <w:r>
+        <w:rPr>
+          <w:b/>
+          <w:bCs/>
+        </w:rPr>
+        <w:t xml:space="preserve">graph commentary's</w:t>
+      </w:r>
+      <w:r>
+        <w:t xml:space="preserve"> movement sentence beneath the mix panel, the builder and the dashboard widgets. The analytical reads stay the writer's own — the section heads, the "largest line" opener, shares and concentration — and choosing </w:t>
+      </w:r>
+      <w:r>
+        <w:rPr>
+          <w:b/>
+          <w:bCs/>
+        </w:rPr>
+        <w:t xml:space="preserve">Pack narrative</w:t>
+      </w:r>
+      <w:r>
+        <w:t xml:space="preserve"> restores every surface at once. The Word and PPT exports carry whichever style is on the page.</w:t>
       </w:r>
     </w:p>
     <w:p>

</xml_diff>

<commit_message>
The configuration decides which tiles show
tile_hidden parks the tiles it names - exact names or patterns matched
against the whole name, so cost.* parks every cost line - and a new
tile_visible keeps only the named tiles and parks the rest. Parked
tiles stay one click away behind the Show parked strip, the reader's
own show/hide toggle still wins on their screen (kept as a restore
even against a pattern or the show-list), and uploading a
configuration re-baselines the tiles so its policy is not shadowed by
toggles made under the previous one. Both packs and the CSV surface
the two settings.

Co-Authored-By: Claude Fable 5 <noreply@anthropic.com>
Claude-Session: https://claude.ai/code/session_01P4DDZgm6WRNJpLjFRThM8B
</commit_message>
<xml_diff>
--- a/iwpb-sg-dashboard/IWPB_SG_Dashboard_README.docx
+++ b/iwpb-sg-dashboard/IWPB_SG_Dashboard_README.docx
@@ -7179,7 +7179,7 @@
           <w:ilvl w:val="0"/>
           <w:numId w:val="3"/>
         </w:numPr>
-        <w:spacing w:after="100"/>
+        <w:spacing w:after="80"/>
       </w:pPr>
       <w:r>
         <w:rPr>
@@ -7259,7 +7259,47 @@
         <w:t xml:space="preserve">level2</w:t>
       </w:r>
       <w:r>
-        <w:t xml:space="preserve">), collapse of non-priority tiles, the RAG threshold (</w:t>
+        <w:t xml:space="preserve">), collapse of non-priority tiles, which tiles show at all (</w:t>
+      </w:r>
+      <w:r>
+        <w:rPr>
+          <w:rFonts w:ascii="Consolas" w:cs="Consolas" w:eastAsia="Consolas" w:hAnsi="Consolas"/>
+          <w:shd w:fill="F2F1ED" w:val="clear"/>
+        </w:rPr>
+        <w:t xml:space="preserve">tile_hidden</w:t>
+      </w:r>
+      <w:r>
+        <w:t xml:space="preserve"> parks the named tiles — exact names or patterns, so </w:t>
+      </w:r>
+      <w:r>
+        <w:rPr>
+          <w:rFonts w:ascii="Consolas" w:cs="Consolas" w:eastAsia="Consolas" w:hAnsi="Consolas"/>
+          <w:shd w:fill="F2F1ED" w:val="clear"/>
+        </w:rPr>
+        <w:t xml:space="preserve">cost.*</w:t>
+      </w:r>
+      <w:r>
+        <w:t xml:space="preserve"> parks every cost line; </w:t>
+      </w:r>
+      <w:r>
+        <w:rPr>
+          <w:rFonts w:ascii="Consolas" w:cs="Consolas" w:eastAsia="Consolas" w:hAnsi="Consolas"/>
+          <w:shd w:fill="F2F1ED" w:val="clear"/>
+        </w:rPr>
+        <w:t xml:space="preserve">tile_visible</w:t>
+      </w:r>
+      <w:r>
+        <w:t xml:space="preserve"> keeps </w:t>
+      </w:r>
+      <w:r>
+        <w:rPr>
+          <w:b/>
+          <w:bCs/>
+        </w:rPr>
+        <w:t xml:space="preserve">only</w:t>
+      </w:r>
+      <w:r>
+        <w:t xml:space="preserve"> the named ones and parks the rest; parked tiles stay one click away behind the "Show parked tiles" strip, a reader's own show/hide toggle still wins on their screen, and uploading a configuration re-baselines the tiles to its policy), the RAG threshold (</w:t>
       </w:r>
       <w:r>
         <w:rPr>
@@ -7279,16 +7319,7 @@
         <w:t xml:space="preserve">variance_periods</w:t>
       </w:r>
       <w:r>
-        <w:t xml:space="preserve"> — the ordered list of comparison bases offered in the left pane.</w:t>
-      </w:r>
-    </w:p>
-    <w:p>
-      <w:pPr>
-        <w:spacing w:after="100"/>
-        <w:ind w:left="360"/>
-      </w:pPr>
-      <w:r>
-        <w:t xml:space="preserve">By default this is exactly the six comparisons the All Commentaries pack writes, in the pack's order — </w:t>
+        <w:t xml:space="preserve"> — the ordered list of comparison bases offered in the left pane. By default this is exactly the six comparisons the All Commentaries pack writes, in the pack's order — </w:t>
       </w:r>
       <w:r>
         <w:rPr>

</xml_diff>

<commit_message>
One config file drives the whole book
Group_dashboard_config_pack.xlsx merges the IWPB and CIB packs into a
single source of truth: the combined CountryHierarchy, both businesses'
product and account hierarchies, metrics, written commentary and scoped
commentary templates side by side, the six-basis variance periods and
the tile controls, under one Group branding. Uploaded alone it serves
the Group, either business, any region and any country - verified on a
two-business driller with zero unmapped tabs and each business adopting
its own template. The per-business packs remain as worked examples of
the same format.

Co-Authored-By: Claude Fable 5 <noreply@anthropic.com>
Claude-Session: https://claude.ai/code/session_01P4DDZgm6WRNJpLjFRThM8B
</commit_message>
<xml_diff>
--- a/iwpb-sg-dashboard/IWPB_SG_Dashboard_README.docx
+++ b/iwpb-sg-dashboard/IWPB_SG_Dashboard_README.docx
@@ -4038,6 +4038,85 @@
       </w:r>
       <w:r>
         <w:t xml:space="preserve"> (default 2) caps how many loose paragraphs any one block can carry, so a long document never buries the page's own commentary.</w:t>
+      </w:r>
+    </w:p>
+    <w:p>
+      <w:pPr>
+        <w:pStyle w:val="ListParagraph"/>
+        <w:numPr>
+          <w:ilvl w:val="0"/>
+          <w:numId w:val="3"/>
+        </w:numPr>
+        <w:spacing w:after="100"/>
+      </w:pPr>
+      <w:r>
+        <w:rPr>
+          <w:b/>
+          <w:bCs/>
+        </w:rPr>
+        <w:t xml:space="preserve">One config file drives everything</w:t>
+      </w:r>
+      <w:r>
+        <w:t xml:space="preserve"> — </w:t>
+      </w:r>
+      <w:r>
+        <w:rPr>
+          <w:rFonts w:ascii="Consolas" w:cs="Consolas" w:eastAsia="Consolas" w:hAnsi="Consolas"/>
+          <w:shd w:fill="F2F1ED" w:val="clear"/>
+        </w:rPr>
+        <w:t xml:space="preserve">Group_dashboard_config_pack.xlsx</w:t>
+      </w:r>
+      <w:r>
+        <w:t xml:space="preserve"> is the single source of truth: it carries every business side by side — the merged CountryHierarchy (all businesses, regions and countries), both businesses' Product and Account hierarchies, their metrics, written commentary and scoped commentary templates (</w:t>
+      </w:r>
+      <w:r>
+        <w:rPr>
+          <w:rFonts w:ascii="Consolas" w:cs="Consolas" w:eastAsia="Consolas" w:hAnsi="Consolas"/>
+          <w:shd w:fill="F2F1ED" w:val="clear"/>
+        </w:rPr>
+        <w:t xml:space="preserve">IWPB Global</w:t>
+      </w:r>
+      <w:r>
+        <w:t xml:space="preserve"> … </w:t>
+      </w:r>
+      <w:r>
+        <w:rPr>
+          <w:rFonts w:ascii="Consolas" w:cs="Consolas" w:eastAsia="Consolas" w:hAnsi="Consolas"/>
+          <w:shd w:fill="F2F1ED" w:val="clear"/>
+        </w:rPr>
+        <w:t xml:space="preserve">CIB Country</w:t>
+      </w:r>
+      <w:r>
+        <w:t xml:space="preserve">), the six-basis variance periods and the tile controls — under one Group branding.</w:t>
+      </w:r>
+    </w:p>
+    <w:p>
+      <w:pPr>
+        <w:spacing w:after="100"/>
+        <w:ind w:left="360"/>
+      </w:pPr>
+      <w:r>
+        <w:t xml:space="preserve">Upload this one workbook and the page serves the Group, either business, any region and any country from it; maintain this one file and nothing else. The per-business packs (</w:t>
+      </w:r>
+      <w:r>
+        <w:rPr>
+          <w:rFonts w:ascii="Consolas" w:cs="Consolas" w:eastAsia="Consolas" w:hAnsi="Consolas"/>
+          <w:shd w:fill="F2F1ED" w:val="clear"/>
+        </w:rPr>
+        <w:t xml:space="preserve">IWPB_dashboard_config_pack.xlsx</w:t>
+      </w:r>
+      <w:r>
+        <w:t xml:space="preserve">, </w:t>
+      </w:r>
+      <w:r>
+        <w:rPr>
+          <w:rFonts w:ascii="Consolas" w:cs="Consolas" w:eastAsia="Consolas" w:hAnsi="Consolas"/>
+          <w:shd w:fill="F2F1ED" w:val="clear"/>
+        </w:rPr>
+        <w:t xml:space="preserve">CIB_dashboard_config_pack.xlsx</w:t>
+      </w:r>
+      <w:r>
+        <w:t xml:space="preserve">) remain as worked single-business examples of the same format.</w:t>
       </w:r>
     </w:p>
     <w:p>

</xml_diff>

<commit_message>
Config template rows are written commentary, pattern auto-detected
The CommentaryTemplates rows of the config now speak in commentary
form: each Pattern cell is a real written sentence, and the pattern is
derived from it automatically at use - every row without {tokens}
passes through the same write-up recognition as Template tabs and
uploads, with the derivation re-run against each new file's own line
names. The vs-phrase recognition learned to stop where the next clause
begins, so "vs the YTD target across the Group" keeps its
across-clause, and "vs target on the back of ..." keeps its movers.
The Group pack's tab is rewritten in commentary form as the worked
example.

Co-Authored-By: Claude Fable 5 <noreply@anthropic.com>
Claude-Session: https://claude.ai/code/session_01P4DDZgm6WRNJpLjFRThM8B
</commit_message>
<xml_diff>
--- a/iwpb-sg-dashboard/IWPB_SG_Dashboard_README.docx
+++ b/iwpb-sg-dashboard/IWPB_SG_Dashboard_README.docx
@@ -5217,7 +5217,37 @@
         <w:t xml:space="preserve">A write-up instead of a pattern.</w:t>
       </w:r>
       <w:r>
-        <w:t xml:space="preserve"> Nobody has to think in tokens: a written commentary — </w:t>
+        <w:t xml:space="preserve"> This is the normal form: the Group pack's </w:t>
+      </w:r>
+      <w:r>
+        <w:rPr>
+          <w:rFonts w:ascii="Consolas" w:cs="Consolas" w:eastAsia="Consolas" w:hAnsi="Consolas"/>
+          <w:shd w:fill="F2F1ED" w:val="clear"/>
+        </w:rPr>
+        <w:t xml:space="preserve">CommentaryTemplates</w:t>
+      </w:r>
+      <w:r>
+        <w:t xml:space="preserve"> rows are themselves written as commentary sentences, and the pattern is detected automatically wherever a Pattern cell carries no </w:t>
+      </w:r>
+      <w:r>
+        <w:rPr>
+          <w:rFonts w:ascii="Consolas" w:cs="Consolas" w:eastAsia="Consolas" w:hAnsi="Consolas"/>
+          <w:shd w:fill="F2F1ED" w:val="clear"/>
+        </w:rPr>
+        <w:t xml:space="preserve">{tokens}</w:t>
+      </w:r>
+      <w:r>
+        <w:t xml:space="preserve"> — in the config rows, in </w:t>
+      </w:r>
+      <w:r>
+        <w:rPr>
+          <w:rFonts w:ascii="Consolas" w:cs="Consolas" w:eastAsia="Consolas" w:hAnsi="Consolas"/>
+          <w:shd w:fill="F2F1ED" w:val="clear"/>
+        </w:rPr>
+        <w:t xml:space="preserve">Template &lt;scope&gt;</w:t>
+      </w:r>
+      <w:r>
+        <w:t xml:space="preserve"> tabs, in template uploads and in the pane alike.  Nobody has to think in tokens: a written commentary — </w:t>
       </w:r>
       <w:r>
         <w:rPr>
@@ -5227,7 +5257,16 @@
         <w:t xml:space="preserve">"Revenue of $4,193m was up $102m (2.5%) vs Q2 2025, led by Mutual Funds and Deposits."</w:t>
       </w:r>
       <w:r>
-        <w:t xml:space="preserve"> — is read and turned into its pattern automatically, a token placed where each figure sits and every other word kept exactly as written. A write-up is accepted three ways: a template upload whose </w:t>
+        <w:t xml:space="preserve"> — is read and turned into its pattern automatically, a token placed where each figure sits and every other word kept exactly as written.</w:t>
+      </w:r>
+    </w:p>
+    <w:p>
+      <w:pPr>
+        <w:spacing w:after="140"/>
+        <w:ind w:left="360"/>
+      </w:pPr>
+      <w:r>
+        <w:t xml:space="preserve">A write-up is accepted three ways: a template upload whose </w:t>
       </w:r>
       <w:r>
         <w:rPr>

</xml_diff>

<commit_message>
Placeholder write-ups fill from the selected variance period
Template packs are written with placeholders where the figures go, and
the write-up recognition now reads that grammar: $Xm up/down is the
movement, x% the percentage, a bare $Xm the figure itself, and a named
basis - "(Month) Actuals Vs Forecast", "FY Forecast vs Target", "YTD
vs PY" - becomes the selected variance period. A config commentary
written that way fills every value from whichever basis the left pane
has selected and re-fills when the reader changes it, instead of
printing its placeholders literally.

Co-Authored-By: Claude Fable 5 <noreply@anthropic.com>
Claude-Session: https://claude.ai/code/session_01P4DDZgm6WRNJpLjFRThM8B
</commit_message>
<xml_diff>
--- a/iwpb-sg-dashboard/IWPB_SG_Dashboard_README.docx
+++ b/iwpb-sg-dashboard/IWPB_SG_Dashboard_README.docx
@@ -5356,7 +5356,7 @@
         <w:t xml:space="preserve">prose typed straight into the pane's pattern box</w:t>
       </w:r>
       <w:r>
-        <w:t xml:space="preserve">, where the preview shows the derived pattern before anything is saved.</w:t>
+        <w:t xml:space="preserve">, where the preview shows the derived pattern before anything is saved. The recognition covers the movement clause (up/down amounts, F/A notation), the vs-phrase, an against/from base, percentages, mover lists after "led by", "driven by", "on the back of" or "reflecting", the subject line matched against the file's own line names, and place or business names, which become the scope.</w:t>
       </w:r>
     </w:p>
     <w:p>
@@ -5365,7 +5365,54 @@
         <w:ind w:left="360"/>
       </w:pPr>
       <w:r>
-        <w:t xml:space="preserve">The recognition covers the movement clause (up/down amounts, F/A notation), the vs-phrase, an against/from base, percentages, mover lists after "led by", "driven by", "on the back of" or "reflecting", the subject line matched against the file's own line names, and place or business names, which become the scope. Once derived it is an ordinary scoped template — adopted by Auto, previewed, exported and overridden like any other — and as always the tokens fill from the page's computed figures, so the example's own numbers never survive into the output.</w:t>
+        <w:rPr>
+          <w:b/>
+          <w:bCs/>
+        </w:rPr>
+        <w:t xml:space="preserve">Placeholder figures are recognised too</w:t>
+      </w:r>
+      <w:r>
+        <w:t xml:space="preserve">, the way template packs are actually written: </w:t>
+      </w:r>
+      <w:r>
+        <w:rPr>
+          <w:rFonts w:ascii="Consolas" w:cs="Consolas" w:eastAsia="Consolas" w:hAnsi="Consolas"/>
+          <w:shd w:fill="F2F1ED" w:val="clear"/>
+        </w:rPr>
+        <w:t xml:space="preserve">$Xm up/down</w:t>
+      </w:r>
+      <w:r>
+        <w:t xml:space="preserve"> reads as the movement, </w:t>
+      </w:r>
+      <w:r>
+        <w:rPr>
+          <w:rFonts w:ascii="Consolas" w:cs="Consolas" w:eastAsia="Consolas" w:hAnsi="Consolas"/>
+          <w:shd w:fill="F2F1ED" w:val="clear"/>
+        </w:rPr>
+        <w:t xml:space="preserve">x%</w:t>
+      </w:r>
+      <w:r>
+        <w:t xml:space="preserve"> as the percentage, a bare </w:t>
+      </w:r>
+      <w:r>
+        <w:rPr>
+          <w:rFonts w:ascii="Consolas" w:cs="Consolas" w:eastAsia="Consolas" w:hAnsi="Consolas"/>
+          <w:shd w:fill="F2F1ED" w:val="clear"/>
+        </w:rPr>
+        <w:t xml:space="preserve">$Xm</w:t>
+      </w:r>
+      <w:r>
+        <w:t xml:space="preserve"> as the figure itself, and a named basis — "(Month) Actuals Vs Forecast", "FY Forecast vs Target" — reads as the </w:t>
+      </w:r>
+      <w:r>
+        <w:rPr>
+          <w:b/>
+          <w:bCs/>
+        </w:rPr>
+        <w:t xml:space="preserve">selected variance period</w:t>
+      </w:r>
+      <w:r>
+        <w:t xml:space="preserve">, so a write-up built on placeholders fills from whichever basis the left pane has selected and re-fills when it changes. Once derived it is an ordinary scoped template — adopted by Auto, previewed, exported and overridden like any other — and as always the tokens fill from the page's computed figures, so the example's own numbers never survive into the output.</w:t>
       </w:r>
     </w:p>
     <w:p>

</xml_diff>

<commit_message>
The style dropdown offers only the configuration's styles
The Active style selectors now list Auto plus the styles the config
(and the reader's own saves) define - the built-in Pack narrative and
House cascade writers are offered only in a file with no templates at
all, staying otherwise as the silent fallback where no scoped template
matches rather than a menu entry. A writer set programmatically stays
visible while active. A new check pins that the adopted template stays
applied on every variance period, re-filling its figures, vs-phrase
and period label from each basis in turn.

Co-Authored-By: Claude Fable 5 <noreply@anthropic.com>
Claude-Session: https://claude.ai/code/session_01P4DDZgm6WRNJpLjFRThM8B
</commit_message>
<xml_diff>
--- a/iwpb-sg-dashboard/IWPB_SG_Dashboard_README.docx
+++ b/iwpb-sg-dashboard/IWPB_SG_Dashboard_README.docx
@@ -5019,6 +5019,42 @@
       </w:r>
       <w:r>
         <w:t xml:space="preserve"> when IWPB is selected. A scope with no template defined speaks the pack narrative, so IWPB can have its own voice while CIB reads the standard one until CIB defines its own. Both packs ship worked examples; a hand-picked style always overrides the scope.</w:t>
+      </w:r>
+    </w:p>
+    <w:p>
+      <w:pPr>
+        <w:spacing w:after="140"/>
+        <w:ind w:left="360"/>
+      </w:pPr>
+      <w:r>
+        <w:rPr>
+          <w:b/>
+          <w:bCs/>
+        </w:rPr>
+        <w:t xml:space="preserve">The Style dropdown speaks the configuration's language.</w:t>
+      </w:r>
+      <w:r>
+        <w:t xml:space="preserve"> It offers </w:t>
+      </w:r>
+      <w:r>
+        <w:rPr>
+          <w:b/>
+          <w:bCs/>
+        </w:rPr>
+        <w:t xml:space="preserve">Auto — match the scope</w:t>
+      </w:r>
+      <w:r>
+        <w:t xml:space="preserve"> plus the styles the config (and the reader's own saves) define — nothing else. The built-in Pack narrative and House cascade writers appear as choices only in a file with no templates defined at all; with templates present they remain the silent fallback wherever no scoped template matches, not a menu entry. And whichever </w:t>
+      </w:r>
+      <w:r>
+        <w:rPr>
+          <w:b/>
+          <w:bCs/>
+        </w:rPr>
+        <w:t xml:space="preserve">variance period</w:t>
+      </w:r>
+      <w:r>
+        <w:t xml:space="preserve"> is selected, the adopted template stays applied and re-fills from that basis — figures, vs-phrase and period label alike.</w:t>
       </w:r>
     </w:p>
     <w:p>

</xml_diff>

<commit_message>
The pane picks; the config authors
The left pane's Commentary templates section is reduced to the Active
style picker. The template name box, the Applies to selector, the
pattern editor and preview, Save, Upload templates, Download as config
rows and the saved-templates list are gone: templates come from the
one configuration workbook - the CommentaryTemplates tab and Template
<scope> write-up tabs - and nowhere else. A pick from the pane still
drives every surface and stays in step with the panel's own selector.

Co-Authored-By: Claude Fable 5 <noreply@anthropic.com>
Claude-Session: https://claude.ai/code/session_01P4DDZgm6WRNJpLjFRThM8B
</commit_message>
<xml_diff>
--- a/iwpb-sg-dashboard/IWPB_SG_Dashboard_README.docx
+++ b/iwpb-sg-dashboard/IWPB_SG_Dashboard_README.docx
@@ -5113,30 +5113,40 @@
           <w:b/>
           <w:bCs/>
         </w:rPr>
-        <w:t xml:space="preserve">Onboarding templates from the left pane.</w:t>
-      </w:r>
-      <w:r>
-        <w:t xml:space="preserve"> The </w:t>
-      </w:r>
-      <w:r>
-        <w:rPr>
-          <w:b/>
-          <w:bCs/>
-        </w:rPr>
-        <w:t xml:space="preserve">Commentary templates</w:t>
-      </w:r>
-      <w:r>
-        <w:t xml:space="preserve"> section in the left pane takes a template written the way you write it: name it, choose what it applies to (anywhere, a tier, or a business tier such as </w:t>
-      </w:r>
-      <w:r>
-        <w:rPr>
-          <w:rFonts w:ascii="Consolas" w:cs="Consolas" w:eastAsia="Consolas" w:hAnsi="Consolas"/>
-          <w:shd w:fill="F2F1ED" w:val="clear"/>
-        </w:rPr>
-        <w:t xml:space="preserve">IWPB Global</w:t>
-      </w:r>
-      <w:r>
-        <w:t xml:space="preserve">), type the pattern, and a live preview words the file's first statement line as you type. A scoped template saved while Auto is on joins the rotation — the page adopts it wherever it applies; a plain named one becomes the active style and appears on both selectors alongside the config's templates; it is kept in the browser across sessions, and a template saved under a config style's name overrides that style for you alone.</w:t>
+        <w:t xml:space="preserve">The pane picks; the config authors.</w:t>
+      </w:r>
+      <w:r>
+        <w:t xml:space="preserve"> The left pane's Commentary templates section is a picker, nothing more: the </w:t>
+      </w:r>
+      <w:r>
+        <w:rPr>
+          <w:b/>
+          <w:bCs/>
+        </w:rPr>
+        <w:t xml:space="preserve">Active style</w:t>
+      </w:r>
+      <w:r>
+        <w:t xml:space="preserve"> selector, offering Auto and the styles the configuration defines. All template authoring lives in the one config workbook — the </w:t>
+      </w:r>
+      <w:r>
+        <w:rPr>
+          <w:rFonts w:ascii="Consolas" w:cs="Consolas" w:eastAsia="Consolas" w:hAnsi="Consolas"/>
+          <w:shd w:fill="F2F1ED" w:val="clear"/>
+        </w:rPr>
+        <w:t xml:space="preserve">CommentaryTemplates</w:t>
+      </w:r>
+      <w:r>
+        <w:t xml:space="preserve"> tab and </w:t>
+      </w:r>
+      <w:r>
+        <w:rPr>
+          <w:rFonts w:ascii="Consolas" w:cs="Consolas" w:eastAsia="Consolas" w:hAnsi="Consolas"/>
+          <w:shd w:fill="F2F1ED" w:val="clear"/>
+        </w:rPr>
+        <w:t xml:space="preserve">Template &lt;scope&gt;</w:t>
+      </w:r>
+      <w:r>
+        <w:t xml:space="preserve"> tabs — so there is a single place templates come from and nothing to paste or upload in the page itself.</w:t>
       </w:r>
     </w:p>
     <w:p>
@@ -5149,10 +5159,10 @@
           <w:b/>
           <w:bCs/>
         </w:rPr>
-        <w:t xml:space="preserve">Download as config rows</w:t>
-      </w:r>
-      <w:r>
-        <w:t xml:space="preserve"> turns your saved templates into </w:t>
+        <w:t xml:space="preserve">A write-up instead of a pattern.</w:t>
+      </w:r>
+      <w:r>
+        <w:t xml:space="preserve"> This is the normal form: the Group pack's </w:t>
       </w:r>
       <w:r>
         <w:rPr>
@@ -5162,7 +5172,37 @@
         <w:t xml:space="preserve">CommentaryTemplates</w:t>
       </w:r>
       <w:r>
-        <w:t xml:space="preserve"> CSV rows ready to paste into the config workbook when a personal style should become the team's.</w:t>
+        <w:t xml:space="preserve"> rows are themselves written as commentary sentences, and the pattern is detected automatically wherever a Pattern cell carries no </w:t>
+      </w:r>
+      <w:r>
+        <w:rPr>
+          <w:rFonts w:ascii="Consolas" w:cs="Consolas" w:eastAsia="Consolas" w:hAnsi="Consolas"/>
+          <w:shd w:fill="F2F1ED" w:val="clear"/>
+        </w:rPr>
+        <w:t xml:space="preserve">{tokens}</w:t>
+      </w:r>
+      <w:r>
+        <w:t xml:space="preserve"> — in the config rows, in </w:t>
+      </w:r>
+      <w:r>
+        <w:rPr>
+          <w:rFonts w:ascii="Consolas" w:cs="Consolas" w:eastAsia="Consolas" w:hAnsi="Consolas"/>
+          <w:shd w:fill="F2F1ED" w:val="clear"/>
+        </w:rPr>
+        <w:t xml:space="preserve">Template &lt;scope&gt;</w:t>
+      </w:r>
+      <w:r>
+        <w:t xml:space="preserve"> tabs, in template uploads and in the pane alike.  Nobody has to think in tokens: a written commentary — </w:t>
+      </w:r>
+      <w:r>
+        <w:rPr>
+          <w:i/>
+          <w:iCs/>
+        </w:rPr>
+        <w:t xml:space="preserve">"Revenue of $4,193m was up $102m (2.5%) vs Q2 2025, led by Mutual Funds and Deposits."</w:t>
+      </w:r>
+      <w:r>
+        <w:t xml:space="preserve"> — is read and turned into its pattern automatically, a token placed where each figure sits and every other word kept exactly as written.</w:t>
       </w:r>
     </w:p>
     <w:p>
@@ -5171,63 +5211,7 @@
         <w:ind w:left="360"/>
       </w:pPr>
       <w:r>
-        <w:rPr>
-          <w:b/>
-          <w:bCs/>
-        </w:rPr>
-        <w:t xml:space="preserve">Onboarding a whole set at once — no pasting.</w:t>
-      </w:r>
-      <w:r>
-        <w:t xml:space="preserve"> Keep your templates in their own workbook or CSV of </w:t>
-      </w:r>
-      <w:r>
-        <w:rPr>
-          <w:rFonts w:ascii="Consolas" w:cs="Consolas" w:eastAsia="Consolas" w:hAnsi="Consolas"/>
-          <w:shd w:fill="F2F1ED" w:val="clear"/>
-        </w:rPr>
-        <w:t xml:space="preserve">Style | Scope | Pattern</w:t>
-      </w:r>
-      <w:r>
-        <w:t xml:space="preserve"> rows and press </w:t>
-      </w:r>
-      <w:r>
-        <w:rPr>
-          <w:b/>
-          <w:bCs/>
-        </w:rPr>
-        <w:t xml:space="preserve">⤒ Upload templates</w:t>
-      </w:r>
-      <w:r>
-        <w:t xml:space="preserve"> in the pane: every row merges into your saved set in one go, keyed by style </w:t>
-      </w:r>
-      <w:r>
-        <w:rPr>
-          <w:i/>
-          <w:iCs/>
-        </w:rPr>
-        <w:t xml:space="preserve">and</w:t>
-      </w:r>
-      <w:r>
-        <w:t xml:space="preserve"> scope so one style keeps its global, regional and country rows and a re-upload updates in place rather than duplicating.</w:t>
-      </w:r>
-    </w:p>
-    <w:p>
-      <w:pPr>
-        <w:spacing w:after="140"/>
-        <w:ind w:left="360"/>
-      </w:pPr>
-      <w:r>
-        <w:t xml:space="preserve">Nothing else in the configuration is touched — unlike a config upload, which replaces the whole configuration. Your uploaded rows outrank the config's on the same scope, and </w:t>
-      </w:r>
-      <w:r>
-        <w:rPr>
-          <w:rFonts w:ascii="Consolas" w:cs="Consolas" w:eastAsia="Consolas" w:hAnsi="Consolas"/>
-          <w:shd w:fill="F2F1ED" w:val="clear"/>
-        </w:rPr>
-        <w:t xml:space="preserve">sample/My_Commentary_Templates.xlsx</w:t>
-      </w:r>
-      <w:r>
-        <w:t xml:space="preserve"> shows the shape. For a set the whole team should have without anyone uploading anything, put the same rows in the config pack's </w:t>
+        <w:t xml:space="preserve">A write-up lives in the config workbook: a </w:t>
       </w:r>
       <w:r>
         <w:rPr>
@@ -5237,139 +5221,14 @@
         <w:t xml:space="preserve">CommentaryTemplates</w:t>
       </w:r>
       <w:r>
-        <w:t xml:space="preserve"> tab instead — they arrive with the config and the browser remembers them across sessions.</w:t>
-      </w:r>
-    </w:p>
-    <w:p>
-      <w:pPr>
-        <w:spacing w:after="140"/>
-        <w:ind w:left="360"/>
-      </w:pPr>
-      <w:r>
-        <w:rPr>
-          <w:b/>
-          <w:bCs/>
-        </w:rPr>
-        <w:t xml:space="preserve">A write-up instead of a pattern.</w:t>
-      </w:r>
-      <w:r>
-        <w:t xml:space="preserve"> This is the normal form: the Group pack's </w:t>
-      </w:r>
-      <w:r>
-        <w:rPr>
-          <w:rFonts w:ascii="Consolas" w:cs="Consolas" w:eastAsia="Consolas" w:hAnsi="Consolas"/>
-          <w:shd w:fill="F2F1ED" w:val="clear"/>
-        </w:rPr>
-        <w:t xml:space="preserve">CommentaryTemplates</w:t>
-      </w:r>
-      <w:r>
-        <w:t xml:space="preserve"> rows are themselves written as commentary sentences, and the pattern is detected automatically wherever a Pattern cell carries no </w:t>
-      </w:r>
-      <w:r>
-        <w:rPr>
-          <w:rFonts w:ascii="Consolas" w:cs="Consolas" w:eastAsia="Consolas" w:hAnsi="Consolas"/>
-          <w:shd w:fill="F2F1ED" w:val="clear"/>
-        </w:rPr>
-        <w:t xml:space="preserve">{tokens}</w:t>
-      </w:r>
-      <w:r>
-        <w:t xml:space="preserve"> — in the config rows, in </w:t>
-      </w:r>
-      <w:r>
-        <w:rPr>
-          <w:rFonts w:ascii="Consolas" w:cs="Consolas" w:eastAsia="Consolas" w:hAnsi="Consolas"/>
-          <w:shd w:fill="F2F1ED" w:val="clear"/>
-        </w:rPr>
-        <w:t xml:space="preserve">Template &lt;scope&gt;</w:t>
-      </w:r>
-      <w:r>
-        <w:t xml:space="preserve"> tabs, in template uploads and in the pane alike.  Nobody has to think in tokens: a written commentary — </w:t>
-      </w:r>
-      <w:r>
-        <w:rPr>
-          <w:i/>
-          <w:iCs/>
-        </w:rPr>
-        <w:t xml:space="preserve">"Revenue of $4,193m was up $102m (2.5%) vs Q2 2025, led by Mutual Funds and Deposits."</w:t>
-      </w:r>
-      <w:r>
-        <w:t xml:space="preserve"> — is read and turned into its pattern automatically, a token placed where each figure sits and every other word kept exactly as written.</w:t>
-      </w:r>
-    </w:p>
-    <w:p>
-      <w:pPr>
-        <w:spacing w:after="140"/>
-        <w:ind w:left="360"/>
-      </w:pPr>
-      <w:r>
-        <w:t xml:space="preserve">A write-up is accepted three ways: a template upload whose </w:t>
-      </w:r>
-      <w:r>
-        <w:rPr>
-          <w:b/>
-          <w:bCs/>
-        </w:rPr>
-        <w:t xml:space="preserve">tabs are write-ups</w:t>
-      </w:r>
-      <w:r>
-        <w:t xml:space="preserve">, one tab per scope named for it (</w:t>
-      </w:r>
-      <w:r>
-        <w:rPr>
-          <w:rFonts w:ascii="Consolas" w:cs="Consolas" w:eastAsia="Consolas" w:hAnsi="Consolas"/>
-          <w:shd w:fill="F2F1ED" w:val="clear"/>
-        </w:rPr>
-        <w:t xml:space="preserve">IWPB Global</w:t>
-      </w:r>
-      <w:r>
-        <w:t xml:space="preserve">, </w:t>
-      </w:r>
-      <w:r>
-        <w:rPr>
-          <w:rFonts w:ascii="Consolas" w:cs="Consolas" w:eastAsia="Consolas" w:hAnsi="Consolas"/>
-          <w:shd w:fill="F2F1ED" w:val="clear"/>
-        </w:rPr>
-        <w:t xml:space="preserve">CIB Regional</w:t>
-      </w:r>
-      <w:r>
-        <w:t xml:space="preserve">, </w:t>
-      </w:r>
-      <w:r>
-        <w:rPr>
-          <w:rFonts w:ascii="Consolas" w:cs="Consolas" w:eastAsia="Consolas" w:hAnsi="Consolas"/>
-          <w:shd w:fill="F2F1ED" w:val="clear"/>
-        </w:rPr>
-        <w:t xml:space="preserve">Group</w:t>
-      </w:r>
-      <w:r>
-        <w:t xml:space="preserve">, </w:t>
-      </w:r>
-      <w:r>
-        <w:rPr>
-          <w:rFonts w:ascii="Consolas" w:cs="Consolas" w:eastAsia="Consolas" w:hAnsi="Consolas"/>
-          <w:shd w:fill="F2F1ED" w:val="clear"/>
-        </w:rPr>
-        <w:t xml:space="preserve">Singapore</w:t>
-      </w:r>
-      <w:r>
-        <w:t xml:space="preserve"> — </w:t>
-      </w:r>
-      <w:r>
-        <w:rPr>
-          <w:rFonts w:ascii="Consolas" w:cs="Consolas" w:eastAsia="Consolas" w:hAnsi="Consolas"/>
-          <w:shd w:fill="F2F1ED" w:val="clear"/>
-        </w:rPr>
-        <w:t xml:space="preserve">sample/My_Commentary_Writeups.xlsx</w:t>
-      </w:r>
-      <w:r>
-        <w:t xml:space="preserve"> shows the shape); a </w:t>
-      </w:r>
-      <w:r>
-        <w:rPr>
-          <w:b/>
-          <w:bCs/>
-        </w:rPr>
-        <w:t xml:space="preserve">`Template &lt;scope&gt;` tab in the config workbook</w:t>
+        <w:t xml:space="preserve"> row whose Pattern cell is prose, or a </w:t>
+      </w:r>
+      <w:r>
+        <w:rPr>
+          <w:b/>
+          <w:bCs/>
+        </w:rPr>
+        <w:t xml:space="preserve">`Template &lt;scope&gt;` tab</w:t>
       </w:r>
       <w:r>
         <w:t xml:space="preserve"> (e.g. </w:t>
@@ -5382,17 +5241,7 @@
         <w:t xml:space="preserve">Template IWPB Global</w:t>
       </w:r>
       <w:r>
-        <w:t xml:space="preserve">), which travels with the config and overrides the CommentaryTemplates sheet's row for the same scope; or </w:t>
-      </w:r>
-      <w:r>
-        <w:rPr>
-          <w:b/>
-          <w:bCs/>
-        </w:rPr>
-        <w:t xml:space="preserve">prose typed straight into the pane's pattern box</w:t>
-      </w:r>
-      <w:r>
-        <w:t xml:space="preserve">, where the preview shows the derived pattern before anything is saved. The recognition covers the movement clause (up/down amounts, F/A notation), the vs-phrase, an against/from base, percentages, mover lists after "led by", "driven by", "on the back of" or "reflecting", the subject line matched against the file's own line names, and place or business names, which become the scope.</w:t>
+        <w:t xml:space="preserve">) holding a longer write-up, which overrides the sheet's row for the same scope. The recognition covers the movement clause (up/down amounts, F/A notation), the vs-phrase, an against/from base, percentages, mover lists after "led by", "driven by", "on the back of" or "reflecting", the subject line matched against the file's own line names, and place or business names, which become the scope.</w:t>
       </w:r>
     </w:p>
     <w:p>

</xml_diff>

<commit_message>
The commentary panel loses its Style selector
A style pinned to one basis beside a trajectory and tiles that follow
the Variance period selector can contradict them - a template named
vs Prior Year filling from vs Target reads as two different pages. The
Management Commentary panel therefore carries no Style dropdown: the
narrative follows the scope and the selected variance period exactly
as the graph and tiles above it, and the left pane's Active style is
the one deliberate override, kept in step across every surface.

Co-Authored-By: Claude Fable 5 <noreply@anthropic.com>
Claude-Session: https://claude.ai/code/session_01P4DDZgm6WRNJpLjFRThM8B
</commit_message>
<xml_diff>
--- a/iwpb-sg-dashboard/IWPB_SG_Dashboard_README.docx
+++ b/iwpb-sg-dashboard/IWPB_SG_Dashboard_README.docx
@@ -5019,6 +5019,42 @@
       </w:r>
       <w:r>
         <w:t xml:space="preserve"> when IWPB is selected. A scope with no template defined speaks the pack narrative, so IWPB can have its own voice while CIB reads the standard one until CIB defines its own. Both packs ship worked examples; a hand-picked style always overrides the scope.</w:t>
+      </w:r>
+    </w:p>
+    <w:p>
+      <w:pPr>
+        <w:spacing w:after="140"/>
+        <w:ind w:left="360"/>
+      </w:pPr>
+      <w:r>
+        <w:rPr>
+          <w:b/>
+          <w:bCs/>
+        </w:rPr>
+        <w:t xml:space="preserve">One selector, in the pane.</w:t>
+      </w:r>
+      <w:r>
+        <w:t xml:space="preserve"> The Management Commentary panel carries no Style dropdown of its own: the narrative follows the scope and the </w:t>
+      </w:r>
+      <w:r>
+        <w:rPr>
+          <w:b/>
+          <w:bCs/>
+        </w:rPr>
+        <w:t xml:space="preserve">selected variance period</w:t>
+      </w:r>
+      <w:r>
+        <w:t xml:space="preserve">, exactly as the trajectory and tiles above it — a style pinned to one basis can never contradict the graph beside it. The left pane's </w:t>
+      </w:r>
+      <w:r>
+        <w:rPr>
+          <w:b/>
+          <w:bCs/>
+        </w:rPr>
+        <w:t xml:space="preserve">Active style</w:t>
+      </w:r>
+      <w:r>
+        <w:t xml:space="preserve"> is the single deliberate override.</w:t>
       </w:r>
     </w:p>
     <w:p>

</xml_diff>

<commit_message>
A plain-language Tiles tab decides what shows
The Settings sheet is the expert surface; hiding a tile should not
mean reading regex rows. A Tiles tab in the config - one row per tile,
its name and Y or N - now decides: N parks the tile, a named Y shows
it, and a tab of only-Y rows shows just those. The tab speaks before
the tile_hidden/tile_visible settings rows, which remain for pattern
work, and the reader's own restore still wins on their screen. The
Group pack carries the tab ready to fill, placed right after Settings.

Co-Authored-By: Claude Fable 5 <noreply@anthropic.com>
Claude-Session: https://claude.ai/code/session_01P4DDZgm6WRNJpLjFRThM8B
</commit_message>
<xml_diff>
--- a/iwpb-sg-dashboard/IWPB_SG_Dashboard_README.docx
+++ b/iwpb-sg-dashboard/IWPB_SG_Dashboard_README.docx
@@ -7265,7 +7265,7 @@
           <w:ilvl w:val="0"/>
           <w:numId w:val="3"/>
         </w:numPr>
-        <w:spacing w:after="80"/>
+        <w:spacing w:after="100"/>
       </w:pPr>
       <w:r>
         <w:rPr>
@@ -7345,7 +7345,66 @@
         <w:t xml:space="preserve">level2</w:t>
       </w:r>
       <w:r>
-        <w:t xml:space="preserve">), collapse of non-priority tiles, which tiles show at all (</w:t>
+        <w:t xml:space="preserve">), collapse of non-priority tiles, which tiles show at all (the plain-language form is the </w:t>
+      </w:r>
+      <w:r>
+        <w:rPr>
+          <w:b/>
+          <w:bCs/>
+        </w:rPr>
+        <w:t xml:space="preserve">`Tiles` tab</w:t>
+      </w:r>
+      <w:r>
+        <w:t xml:space="preserve"> — one row per tile, its name in column A, </w:t>
+      </w:r>
+      <w:r>
+        <w:rPr>
+          <w:rFonts w:ascii="Consolas" w:cs="Consolas" w:eastAsia="Consolas" w:hAnsi="Consolas"/>
+          <w:shd w:fill="F2F1ED" w:val="clear"/>
+        </w:rPr>
+        <w:t xml:space="preserve">Y</w:t>
+      </w:r>
+      <w:r>
+        <w:t xml:space="preserve"> or </w:t>
+      </w:r>
+      <w:r>
+        <w:rPr>
+          <w:rFonts w:ascii="Consolas" w:cs="Consolas" w:eastAsia="Consolas" w:hAnsi="Consolas"/>
+          <w:shd w:fill="F2F1ED" w:val="clear"/>
+        </w:rPr>
+        <w:t xml:space="preserve">N</w:t>
+      </w:r>
+      <w:r>
+        <w:t xml:space="preserve"> in column B; </w:t>
+      </w:r>
+      <w:r>
+        <w:rPr>
+          <w:rFonts w:ascii="Consolas" w:cs="Consolas" w:eastAsia="Consolas" w:hAnsi="Consolas"/>
+          <w:shd w:fill="F2F1ED" w:val="clear"/>
+        </w:rPr>
+        <w:t xml:space="preserve">N</w:t>
+      </w:r>
+      <w:r>
+        <w:t xml:space="preserve"> parks it, and a tab of only-</w:t>
+      </w:r>
+      <w:r>
+        <w:rPr>
+          <w:rFonts w:ascii="Consolas" w:cs="Consolas" w:eastAsia="Consolas" w:hAnsi="Consolas"/>
+          <w:shd w:fill="F2F1ED" w:val="clear"/>
+        </w:rPr>
+        <w:t xml:space="preserve">Y</w:t>
+      </w:r>
+      <w:r>
+        <w:t xml:space="preserve"> rows shows just those.</w:t>
+      </w:r>
+    </w:p>
+    <w:p>
+      <w:pPr>
+        <w:spacing w:after="100"/>
+        <w:ind w:left="360"/>
+      </w:pPr>
+      <w:r>
+        <w:t xml:space="preserve">The Settings rows remain for pattern work: </w:t>
       </w:r>
       <w:r>
         <w:rPr>
@@ -7365,7 +7424,7 @@
         <w:t xml:space="preserve">cost.*</w:t>
       </w:r>
       <w:r>
-        <w:t xml:space="preserve"> parks every cost line; </w:t>
+        <w:t xml:space="preserve"> parks every cost line — and </w:t>
       </w:r>
       <w:r>
         <w:rPr>
@@ -7385,7 +7444,7 @@
         <w:t xml:space="preserve">only</w:t>
       </w:r>
       <w:r>
-        <w:t xml:space="preserve"> the named ones and parks the rest; parked tiles stay one click away behind the "Show parked tiles" strip, a reader's own show/hide toggle still wins on their screen, and uploading a configuration re-baselines the tiles to its policy), the RAG threshold (</w:t>
+        <w:t xml:space="preserve"> the named ones; parked tiles stay one click away behind the "Show parked tiles" strip, a reader's own show/hide toggle still wins on their screen, and uploading a configuration re-baselines the tiles to its policy), the RAG threshold (</w:t>
       </w:r>
       <w:r>
         <w:rPr>
@@ -7405,7 +7464,16 @@
         <w:t xml:space="preserve">variance_periods</w:t>
       </w:r>
       <w:r>
-        <w:t xml:space="preserve"> — the ordered list of comparison bases offered in the left pane. By default this is exactly the six comparisons the All Commentaries pack writes, in the pack's order — </w:t>
+        <w:t xml:space="preserve"> — the ordered list of comparison bases offered in the left pane.</w:t>
+      </w:r>
+    </w:p>
+    <w:p>
+      <w:pPr>
+        <w:spacing w:after="100"/>
+        <w:ind w:left="360"/>
+      </w:pPr>
+      <w:r>
+        <w:t xml:space="preserve">By default this is exactly the six comparisons the All Commentaries pack writes, in the pack's order — </w:t>
       </w:r>
       <w:r>
         <w:rPr>

</xml_diff>

<commit_message>
The Active style lists scopes, not style names
A config that names a style per basis filled the picker with a row per
name. The selector now shows one entry per Scope value from the
CommentaryTemplates - Group, IWPB, CIB, HK, UK, whatever the column
defines - plus Auto, with deliberately unscoped styles still offered
by name. Picking a scope forces that scope's template, its
last-defined row winning, filled as ever from the selected variance
period. A scope value is as valid a stored selection as a style name.

Co-Authored-By: Claude Fable 5 <noreply@anthropic.com>
Claude-Session: https://claude.ai/code/session_01P4DDZgm6WRNJpLjFRThM8B
</commit_message>
<xml_diff>
--- a/iwpb-sg-dashboard/IWPB_SG_Dashboard_README.docx
+++ b/iwpb-sg-dashboard/IWPB_SG_Dashboard_README.docx
@@ -5019,6 +5019,82 @@
       </w:r>
       <w:r>
         <w:t xml:space="preserve"> when IWPB is selected. A scope with no template defined speaks the pack narrative, so IWPB can have its own voice while CIB reads the standard one until CIB defines its own. Both packs ship worked examples; a hand-picked style always overrides the scope.</w:t>
+      </w:r>
+    </w:p>
+    <w:p>
+      <w:pPr>
+        <w:spacing w:after="140"/>
+        <w:ind w:left="360"/>
+      </w:pPr>
+      <w:r>
+        <w:rPr>
+          <w:b/>
+          <w:bCs/>
+        </w:rPr>
+        <w:t xml:space="preserve">The Active style lists scopes, not style names.</w:t>
+      </w:r>
+      <w:r>
+        <w:t xml:space="preserve"> However many named styles the config carries, the pane's selector shows one entry per </w:t>
+      </w:r>
+      <w:r>
+        <w:rPr>
+          <w:b/>
+          <w:bCs/>
+        </w:rPr>
+        <w:t xml:space="preserve">Scope</w:t>
+      </w:r>
+      <w:r>
+        <w:t xml:space="preserve"> value — </w:t>
+      </w:r>
+      <w:r>
+        <w:rPr>
+          <w:rFonts w:ascii="Consolas" w:cs="Consolas" w:eastAsia="Consolas" w:hAnsi="Consolas"/>
+          <w:shd w:fill="F2F1ED" w:val="clear"/>
+        </w:rPr>
+        <w:t xml:space="preserve">Group</w:t>
+      </w:r>
+      <w:r>
+        <w:t xml:space="preserve">, </w:t>
+      </w:r>
+      <w:r>
+        <w:rPr>
+          <w:rFonts w:ascii="Consolas" w:cs="Consolas" w:eastAsia="Consolas" w:hAnsi="Consolas"/>
+          <w:shd w:fill="F2F1ED" w:val="clear"/>
+        </w:rPr>
+        <w:t xml:space="preserve">IWPB</w:t>
+      </w:r>
+      <w:r>
+        <w:t xml:space="preserve">, </w:t>
+      </w:r>
+      <w:r>
+        <w:rPr>
+          <w:rFonts w:ascii="Consolas" w:cs="Consolas" w:eastAsia="Consolas" w:hAnsi="Consolas"/>
+          <w:shd w:fill="F2F1ED" w:val="clear"/>
+        </w:rPr>
+        <w:t xml:space="preserve">CIB</w:t>
+      </w:r>
+      <w:r>
+        <w:t xml:space="preserve">, </w:t>
+      </w:r>
+      <w:r>
+        <w:rPr>
+          <w:rFonts w:ascii="Consolas" w:cs="Consolas" w:eastAsia="Consolas" w:hAnsi="Consolas"/>
+          <w:shd w:fill="F2F1ED" w:val="clear"/>
+        </w:rPr>
+        <w:t xml:space="preserve">HK</w:t>
+      </w:r>
+      <w:r>
+        <w:t xml:space="preserve">, </w:t>
+      </w:r>
+      <w:r>
+        <w:rPr>
+          <w:rFonts w:ascii="Consolas" w:cs="Consolas" w:eastAsia="Consolas" w:hAnsi="Consolas"/>
+          <w:shd w:fill="F2F1ED" w:val="clear"/>
+        </w:rPr>
+        <w:t xml:space="preserve">UK</w:t>
+      </w:r>
+      <w:r>
+        <w:t xml:space="preserve">, whatever the CommentaryTemplates' Scope column defines — plus Auto, and any style whose rows are deliberately unscoped, by its own name. Picking a scope forces that scope's template (its last-defined row), still filled from the selected variance period.</w:t>
       </w:r>
     </w:p>
     <w:p>

</xml_diff>

<commit_message>
The selected period speaks through its own row on a tile
A tile keeps its three comparisons — prior year, forecast, target — and its
year-to-date headline. Every variance period is one of those three
comparisons at some grain, so the selected period no longer leaves the tiles
untouched and never adds a fourth row: it takes over its own family's row,
in its own words. Current QTR vs PY puts the quarter movement in the PY row
as "vs Q2 2025"; Month vs Forecast reads "vs JUN-26 forecast" in the
forecast row; FY vs Target reads "vs FY26 target" in the target row. The
other two rows stay at the year-to-date grain of the headline, and balances
follow the same rule at closing. The tile changes as the period changes; the
headline does not.

Co-Authored-By: Claude Opus 5 <noreply@anthropic.com>
Claude-Session: https://claude.ai/code/session_01P4DDZgm6WRNJpLjFRThM8B
</commit_message>
<xml_diff>
--- a/iwpb-sg-dashboard/IWPB_SG_Dashboard_README.docx
+++ b/iwpb-sg-dashboard/IWPB_SG_Dashboard_README.docx
@@ -1656,37 +1656,27 @@
         <w:t xml:space="preserve">Three comparisons on a tile, and no more</w:t>
       </w:r>
       <w:r>
-        <w:t xml:space="preserve"> — </w:t>
-      </w:r>
-      <w:r>
-        <w:rPr>
-          <w:rFonts w:ascii="Consolas" w:cs="Consolas" w:eastAsia="Consolas" w:hAnsi="Consolas"/>
-          <w:shd w:fill="F2F1ED" w:val="clear"/>
-        </w:rPr>
-        <w:t xml:space="preserve">vs PY</w:t>
-      </w:r>
-      <w:r>
-        <w:t xml:space="preserve">, </w:t>
-      </w:r>
-      <w:r>
-        <w:rPr>
-          <w:rFonts w:ascii="Consolas" w:cs="Consolas" w:eastAsia="Consolas" w:hAnsi="Consolas"/>
-          <w:shd w:fill="F2F1ED" w:val="clear"/>
-        </w:rPr>
-        <w:t xml:space="preserve">vs Fcst</w:t>
-      </w:r>
-      <w:r>
-        <w:t xml:space="preserve">, </w:t>
-      </w:r>
-      <w:r>
-        <w:rPr>
-          <w:rFonts w:ascii="Consolas" w:cs="Consolas" w:eastAsia="Consolas" w:hAnsi="Consolas"/>
-          <w:shd w:fill="F2F1ED" w:val="clear"/>
-        </w:rPr>
-        <w:t xml:space="preserve">vs Tgt</w:t>
-      </w:r>
-      <w:r>
-        <w:t xml:space="preserve">, all at the grain of the headline, balances included. The variance period the page is reading drives the trajectory, the commentary and the reporting pack; it does not add a fourth row to a tile.</w:t>
+        <w:t xml:space="preserve"> — the prior year, the forecast and the target, balances included. Every variance period is one of those three comparisons at some grain, so the selected period never adds a fourth row: it takes over its own family's row, in its own words — Current QTR vs PY puts the quarter movement in the PY row as </w:t>
+      </w:r>
+      <w:r>
+        <w:rPr>
+          <w:rFonts w:ascii="Consolas" w:cs="Consolas" w:eastAsia="Consolas" w:hAnsi="Consolas"/>
+          <w:shd w:fill="F2F1ED" w:val="clear"/>
+        </w:rPr>
+        <w:t xml:space="preserve">vs Q2 2025</w:t>
+      </w:r>
+      <w:r>
+        <w:t xml:space="preserve">, FY vs Target puts the full-year read in the target row as </w:t>
+      </w:r>
+      <w:r>
+        <w:rPr>
+          <w:rFonts w:ascii="Consolas" w:cs="Consolas" w:eastAsia="Consolas" w:hAnsi="Consolas"/>
+          <w:shd w:fill="F2F1ED" w:val="clear"/>
+        </w:rPr>
+        <w:t xml:space="preserve">vs FY26 target</w:t>
+      </w:r>
+      <w:r>
+        <w:t xml:space="preserve"> — and the other two stay at the year-to-date grain of the headline. The tile changes as the period changes; the headline does not.</w:t>
       </w:r>
     </w:p>
     <w:p>

</xml_diff>

<commit_message>
The period offers actual months only
The YTD-through selector listed the forecast months as selectable "(FC)"
entries. With the tiles pinned to the last actual month they changed nothing
on the page a reader was looking at, and made it look as if the page could
be reading a month that hasn't happened. The selector now stops at the last
actual month. The forecast still feeds everything it should — the FY bases,
the trajectory's forecast tail and the full-year outlook.

Co-Authored-By: Claude Opus 5 <noreply@anthropic.com>
Claude-Session: https://claude.ai/code/session_01P4DDZgm6WRNJpLjFRThM8B
</commit_message>
<xml_diff>
--- a/iwpb-sg-dashboard/IWPB_SG_Dashboard_README.docx
+++ b/iwpb-sg-dashboard/IWPB_SG_Dashboard_README.docx
@@ -1606,7 +1606,7 @@
           <w:ilvl w:val="0"/>
           <w:numId w:val="3"/>
         </w:numPr>
-        <w:spacing w:after="80"/>
+        <w:spacing w:after="100"/>
       </w:pPr>
       <w:r>
         <w:rPr>
@@ -1626,7 +1626,36 @@
         <w:t xml:space="preserve">JUN YTD</w:t>
       </w:r>
       <w:r>
-        <w:t xml:space="preserve">). Selecting a forecast month, or ticking the forecast month in, moves the rest of the page but never that figure. Balances keep their closing balance, labelled the same way (</w:t>
+        <w:t xml:space="preserve">).</w:t>
+      </w:r>
+    </w:p>
+    <w:p>
+      <w:pPr>
+        <w:spacing w:after="100"/>
+        <w:ind w:left="360"/>
+      </w:pPr>
+      <w:r>
+        <w:t xml:space="preserve">The </w:t>
+      </w:r>
+      <w:r>
+        <w:rPr>
+          <w:b/>
+          <w:bCs/>
+        </w:rPr>
+        <w:t xml:space="preserve">YTD through</w:t>
+      </w:r>
+      <w:r>
+        <w:t xml:space="preserve"> selector offers actual months only — pick MAY and every tile reads </w:t>
+      </w:r>
+      <w:r>
+        <w:rPr>
+          <w:rFonts w:ascii="Consolas" w:cs="Consolas" w:eastAsia="Consolas" w:hAnsi="Consolas"/>
+          <w:shd w:fill="F2F1ED" w:val="clear"/>
+        </w:rPr>
+        <w:t xml:space="preserve">MAY YTD</w:t>
+      </w:r>
+      <w:r>
+        <w:t xml:space="preserve">; forecast months are not offered, so the page never looks like it is reading a month that hasn't happened. The forecast still feeds everything it should: the FY bases, the trajectory's forecast tail and the full-year outlook. Balances keep their closing balance, labelled the same way (</w:t>
       </w:r>
       <w:r>
         <w:rPr>

</xml_diff>

<commit_message>
One configuration file, and tiles from the distinct MICA Level 2 lines
The Group workbook is the one configuration everything drives from. The flat
CSV that shipped beside it read as a second config; it moves under sample/ as
a test fixture, and the README says plainly: one file, a sheet per section.

In the Group pack the tiles now come from the file's own MICA Level 2 lines
(tile_level: level2), each distinct name one tile, rather than from the
merged Metrics union that named the same lines twice; the Metrics tab keeps
driving the KPI scorecard and the metric scopes as before.

Co-Authored-By: Claude Opus 5 <noreply@anthropic.com>
Claude-Session: https://claude.ai/code/session_01P4DDZgm6WRNJpLjFRThM8B
</commit_message>
<xml_diff>
--- a/iwpb-sg-dashboard/IWPB_SG_Dashboard_README.docx
+++ b/iwpb-sg-dashboard/IWPB_SG_Dashboard_README.docx
@@ -7547,30 +7547,27 @@
         <w:t xml:space="preserve">left pane → Configuration → Upload config</w:t>
       </w:r>
       <w:r>
-        <w:t xml:space="preserve">. Two formats are accepted, both parsed locally:</w:t>
-      </w:r>
-    </w:p>
-    <w:p>
-      <w:pPr>
-        <w:pStyle w:val="ListParagraph"/>
-        <w:numPr>
-          <w:ilvl w:val="0"/>
-          <w:numId w:val="3"/>
-        </w:numPr>
-        <w:spacing w:after="80"/>
-      </w:pPr>
-      <w:r>
-        <w:t xml:space="preserve">an </w:t>
-      </w:r>
-      <w:r>
-        <w:rPr>
-          <w:b/>
-          <w:bCs/>
-        </w:rPr>
-        <w:t xml:space="preserve">xlsx workbook with a sheet per section</w:t>
-      </w:r>
-      <w:r>
-        <w:t xml:space="preserve"> — </w:t>
+        <w:t xml:space="preserve">. There is </w:t>
+      </w:r>
+      <w:r>
+        <w:rPr>
+          <w:b/>
+          <w:bCs/>
+        </w:rPr>
+        <w:t xml:space="preserve">one configuration file</w:t>
+      </w:r>
+      <w:r>
+        <w:t xml:space="preserve">: </w:t>
+      </w:r>
+      <w:r>
+        <w:rPr>
+          <w:rFonts w:ascii="Consolas" w:cs="Consolas" w:eastAsia="Consolas" w:hAnsi="Consolas"/>
+          <w:shd w:fill="F2F1ED" w:val="clear"/>
+        </w:rPr>
+        <w:t xml:space="preserve">Group_dashboard_config_pack.xlsx</w:t>
+      </w:r>
+      <w:r>
+        <w:t xml:space="preserve"> in this folder, an xlsx workbook with a sheet per section — </w:t>
       </w:r>
       <w:r>
         <w:rPr>
@@ -7587,6 +7584,16 @@
           <w:rFonts w:ascii="Consolas" w:cs="Consolas" w:eastAsia="Consolas" w:hAnsi="Consolas"/>
           <w:shd w:fill="F2F1ED" w:val="clear"/>
         </w:rPr>
+        <w:t xml:space="preserve">Tiles</w:t>
+      </w:r>
+      <w:r>
+        <w:t xml:space="preserve">, </w:t>
+      </w:r>
+      <w:r>
+        <w:rPr>
+          <w:rFonts w:ascii="Consolas" w:cs="Consolas" w:eastAsia="Consolas" w:hAnsi="Consolas"/>
+          <w:shd w:fill="F2F1ED" w:val="clear"/>
+        </w:rPr>
         <w:t xml:space="preserve">TilePriority</w:t>
       </w:r>
       <w:r>
@@ -7609,28 +7616,38 @@
         </w:rPr>
         <w:t xml:space="preserve">Views</w:t>
       </w:r>
-    </w:p>
-    <w:p>
-      <w:pPr>
-        <w:pStyle w:val="ListParagraph"/>
-        <w:numPr>
-          <w:ilvl w:val="0"/>
-          <w:numId w:val="3"/>
-        </w:numPr>
-        <w:spacing w:after="80"/>
-      </w:pPr>
-      <w:r>
-        <w:t xml:space="preserve">a </w:t>
-      </w:r>
-      <w:r>
-        <w:rPr>
-          <w:b/>
-          <w:bCs/>
-        </w:rPr>
-        <w:t xml:space="preserve">flat CSV</w:t>
-      </w:r>
-      <w:r>
-        <w:t xml:space="preserve"> with columns </w:t>
+      <w:r>
+        <w:t xml:space="preserve">, </w:t>
+      </w:r>
+      <w:r>
+        <w:rPr>
+          <w:rFonts w:ascii="Consolas" w:cs="Consolas" w:eastAsia="Consolas" w:hAnsi="Consolas"/>
+          <w:shd w:fill="F2F1ED" w:val="clear"/>
+        </w:rPr>
+        <w:t xml:space="preserve">Metrics</w:t>
+      </w:r>
+      <w:r>
+        <w:t xml:space="preserve">, </w:t>
+      </w:r>
+      <w:r>
+        <w:rPr>
+          <w:rFonts w:ascii="Consolas" w:cs="Consolas" w:eastAsia="Consolas" w:hAnsi="Consolas"/>
+          <w:shd w:fill="F2F1ED" w:val="clear"/>
+        </w:rPr>
+        <w:t xml:space="preserve">Commentary</w:t>
+      </w:r>
+      <w:r>
+        <w:t xml:space="preserve">, </w:t>
+      </w:r>
+      <w:r>
+        <w:rPr>
+          <w:rFonts w:ascii="Consolas" w:cs="Consolas" w:eastAsia="Consolas" w:hAnsi="Consolas"/>
+          <w:shd w:fill="F2F1ED" w:val="clear"/>
+        </w:rPr>
+        <w:t xml:space="preserve">CommentaryTemplates</w:t>
+      </w:r>
+      <w:r>
+        <w:t xml:space="preserve">, the hierarchies. Everything the page does is driven from it. (A flat CSV with columns </w:t>
       </w:r>
       <w:r>
         <w:rPr>
@@ -7640,17 +7657,17 @@
         <w:t xml:space="preserve">Sheet,Key,Value,Extra1,Extra2,Extra3</w:t>
       </w:r>
       <w:r>
-        <w:t xml:space="preserve"> (</w:t>
-      </w:r>
-      <w:r>
-        <w:rPr>
-          <w:rFonts w:ascii="Consolas" w:cs="Consolas" w:eastAsia="Consolas" w:hAnsi="Consolas"/>
-          <w:shd w:fill="F2F1ED" w:val="clear"/>
-        </w:rPr>
-        <w:t xml:space="preserve">IWPB_SG_dashboard_config.csv</w:t>
-      </w:r>
-      <w:r>
-        <w:t xml:space="preserve"> in this folder is the template, also downloadable in-app)</w:t>
+        <w:t xml:space="preserve"> is also accepted for tooling that emits CSV; the in-app download offers it. A sample lives under </w:t>
+      </w:r>
+      <w:r>
+        <w:rPr>
+          <w:rFonts w:ascii="Consolas" w:cs="Consolas" w:eastAsia="Consolas" w:hAnsi="Consolas"/>
+          <w:shd w:fill="F2F1ED" w:val="clear"/>
+        </w:rPr>
+        <w:t xml:space="preserve">sample/</w:t>
+      </w:r>
+      <w:r>
+        <w:t xml:space="preserve">.)</w:t>
       </w:r>
     </w:p>
     <w:p>

</xml_diff>

<commit_message>
Tiles carry only the file's own lines, compared three fixed ways
The tile grid stopped inventing lines: it is the file's own MICA lines — or
a tile_lines list the configuration names explicitly — and nothing else. The
Metrics sheet still feeds the KPI scorecard and the metric scopes, but
metrics reach the grid only when the configuration says tile_metrics: Y in
so many words; the old 'auto' put every metric of a merged pack on the grid,
which is where the extra tiles were coming from. The CIB pack fixture, which
exists to exercise the metric-tile route, now says Y explicitly.

The comparisons on a tile are vs PY, vs Fcst and vs Tgt, in those words, at
the grain of the headline — the variance-period takeover that relabelled a
row ("vs Q2 2025") is gone. The period drives the trajectory, the commentary
and the pack; tiles move only with the YTD-through month.

Co-Authored-By: Claude Opus 5 <noreply@anthropic.com>
Claude-Session: https://claude.ai/code/session_01P4DDZgm6WRNJpLjFRThM8B
</commit_message>
<xml_diff>
--- a/iwpb-sg-dashboard/IWPB_SG_Dashboard_README.docx
+++ b/iwpb-sg-dashboard/IWPB_SG_Dashboard_README.docx
@@ -1685,27 +1685,107 @@
         <w:t xml:space="preserve">Three comparisons on a tile, and no more</w:t>
       </w:r>
       <w:r>
-        <w:t xml:space="preserve"> — the prior year, the forecast and the target, balances included. Every variance period is one of those three comparisons at some grain, so the selected period never adds a fourth row: it takes over its own family's row, in its own words — Current QTR vs PY puts the quarter movement in the PY row as </w:t>
-      </w:r>
-      <w:r>
-        <w:rPr>
-          <w:rFonts w:ascii="Consolas" w:cs="Consolas" w:eastAsia="Consolas" w:hAnsi="Consolas"/>
-          <w:shd w:fill="F2F1ED" w:val="clear"/>
-        </w:rPr>
-        <w:t xml:space="preserve">vs Q2 2025</w:t>
-      </w:r>
-      <w:r>
-        <w:t xml:space="preserve">, FY vs Target puts the full-year read in the target row as </w:t>
-      </w:r>
-      <w:r>
-        <w:rPr>
-          <w:rFonts w:ascii="Consolas" w:cs="Consolas" w:eastAsia="Consolas" w:hAnsi="Consolas"/>
-          <w:shd w:fill="F2F1ED" w:val="clear"/>
-        </w:rPr>
-        <w:t xml:space="preserve">vs FY26 target</w:t>
-      </w:r>
-      <w:r>
-        <w:t xml:space="preserve"> — and the other two stay at the year-to-date grain of the headline. The tile changes as the period changes; the headline does not.</w:t>
+        <w:t xml:space="preserve"> — </w:t>
+      </w:r>
+      <w:r>
+        <w:rPr>
+          <w:rFonts w:ascii="Consolas" w:cs="Consolas" w:eastAsia="Consolas" w:hAnsi="Consolas"/>
+          <w:shd w:fill="F2F1ED" w:val="clear"/>
+        </w:rPr>
+        <w:t xml:space="preserve">vs PY</w:t>
+      </w:r>
+      <w:r>
+        <w:t xml:space="preserve">, </w:t>
+      </w:r>
+      <w:r>
+        <w:rPr>
+          <w:rFonts w:ascii="Consolas" w:cs="Consolas" w:eastAsia="Consolas" w:hAnsi="Consolas"/>
+          <w:shd w:fill="F2F1ED" w:val="clear"/>
+        </w:rPr>
+        <w:t xml:space="preserve">vs Fcst</w:t>
+      </w:r>
+      <w:r>
+        <w:t xml:space="preserve">, </w:t>
+      </w:r>
+      <w:r>
+        <w:rPr>
+          <w:rFonts w:ascii="Consolas" w:cs="Consolas" w:eastAsia="Consolas" w:hAnsi="Consolas"/>
+          <w:shd w:fill="F2F1ED" w:val="clear"/>
+        </w:rPr>
+        <w:t xml:space="preserve">vs Tgt</w:t>
+      </w:r>
+      <w:r>
+        <w:t xml:space="preserve">, in those words, at the grain of the headline: year to date for a P&amp;L line, closing for a balance. The variance period drives the trajectory, the commentary and the reporting pack; it never renames or replaces a tile row. Tiles move only with the </w:t>
+      </w:r>
+      <w:r>
+        <w:rPr>
+          <w:b/>
+          <w:bCs/>
+        </w:rPr>
+        <w:t xml:space="preserve">YTD through</w:t>
+      </w:r>
+      <w:r>
+        <w:t xml:space="preserve"> month.</w:t>
+      </w:r>
+    </w:p>
+    <w:p>
+      <w:pPr>
+        <w:pStyle w:val="ListParagraph"/>
+        <w:numPr>
+          <w:ilvl w:val="0"/>
+          <w:numId w:val="3"/>
+        </w:numPr>
+        <w:spacing w:after="80"/>
+      </w:pPr>
+      <w:r>
+        <w:rPr>
+          <w:b/>
+          <w:bCs/>
+        </w:rPr>
+        <w:t xml:space="preserve">Tiles never invent lines.</w:t>
+      </w:r>
+      <w:r>
+        <w:t xml:space="preserve"> The grid is the file's own MICA lines — or a </w:t>
+      </w:r>
+      <w:r>
+        <w:rPr>
+          <w:rFonts w:ascii="Consolas" w:cs="Consolas" w:eastAsia="Consolas" w:hAnsi="Consolas"/>
+          <w:shd w:fill="F2F1ED" w:val="clear"/>
+        </w:rPr>
+        <w:t xml:space="preserve">tile_lines</w:t>
+      </w:r>
+      <w:r>
+        <w:t xml:space="preserve"> list the config names explicitly. The </w:t>
+      </w:r>
+      <w:r>
+        <w:rPr>
+          <w:rFonts w:ascii="Consolas" w:cs="Consolas" w:eastAsia="Consolas" w:hAnsi="Consolas"/>
+          <w:shd w:fill="F2F1ED" w:val="clear"/>
+        </w:rPr>
+        <w:t xml:space="preserve">Metrics</w:t>
+      </w:r>
+      <w:r>
+        <w:t xml:space="preserve"> sheet feeds the KPI scorecard and the metric scopes, but metrics reach the tile grid only when the config says </w:t>
+      </w:r>
+      <w:r>
+        <w:rPr>
+          <w:rFonts w:ascii="Consolas" w:cs="Consolas" w:eastAsia="Consolas" w:hAnsi="Consolas"/>
+          <w:shd w:fill="F2F1ED" w:val="clear"/>
+        </w:rPr>
+        <w:t xml:space="preserve">tile_metrics: Y</w:t>
+      </w:r>
+      <w:r>
+        <w:t xml:space="preserve"> in so many words; the old </w:t>
+      </w:r>
+      <w:r>
+        <w:rPr>
+          <w:rFonts w:ascii="Consolas" w:cs="Consolas" w:eastAsia="Consolas" w:hAnsi="Consolas"/>
+          <w:shd w:fill="F2F1ED" w:val="clear"/>
+        </w:rPr>
+        <w:t xml:space="preserve">auto</w:t>
+      </w:r>
+      <w:r>
+        <w:t xml:space="preserve"> no longer puts every metric on the grid.</w:t>
       </w:r>
     </w:p>
     <w:p>

</xml_diff>

<commit_message>
Tiles read MICA Level 1 and Level 2 together
The default tile set is now both levels of the cascade: every MICA Level 2
line and every Level 1 rollup, one tile each, on the grid, the slide deck
and the left-hand KPI nav alike. The dedupe drops a rollup that adds nothing
over its only child, a P&L rollup's figure excludes the balance memo lines
filed beneath it (a result and a balance are never added), and clicking a
rollup tile scopes to the Level 1 line. tile_level: level1 / level2 still
narrows the grid to one level; the one config goes back to auto so the field
file reads its seven Level 2 lines with the PBT rollup beside them.

Co-Authored-By: Claude Opus 5 <noreply@anthropic.com>
Claude-Session: https://claude.ai/code/session_01P4DDZgm6WRNJpLjFRThM8B
</commit_message>
<xml_diff>
--- a/iwpb-sg-dashboard/IWPB_SG_Dashboard_README.docx
+++ b/iwpb-sg-dashboard/IWPB_SG_Dashboard_README.docx
@@ -1745,7 +1745,37 @@
         <w:t xml:space="preserve">Tiles never invent lines.</w:t>
       </w:r>
       <w:r>
-        <w:t xml:space="preserve"> The grid is the file's own MICA lines — or a </w:t>
+        <w:t xml:space="preserve"> The grid is the file's own MICA lines — </w:t>
+      </w:r>
+      <w:r>
+        <w:rPr>
+          <w:b/>
+          <w:bCs/>
+        </w:rPr>
+        <w:t xml:space="preserve">Level 1 and Level 2 together</w:t>
+      </w:r>
+      <w:r>
+        <w:t xml:space="preserve">: every Level 2 line and every Level 1 rollup, one tile each (a rollup that adds nothing over its only child is dropped, and a P&amp;L rollup's figure excludes the balance memo lines filed beneath it, so a result and a balance are never added). </w:t>
+      </w:r>
+      <w:r>
+        <w:rPr>
+          <w:rFonts w:ascii="Consolas" w:cs="Consolas" w:eastAsia="Consolas" w:hAnsi="Consolas"/>
+          <w:shd w:fill="F2F1ED" w:val="clear"/>
+        </w:rPr>
+        <w:t xml:space="preserve">tile_level: level1</w:t>
+      </w:r>
+      <w:r>
+        <w:t xml:space="preserve"> or </w:t>
+      </w:r>
+      <w:r>
+        <w:rPr>
+          <w:rFonts w:ascii="Consolas" w:cs="Consolas" w:eastAsia="Consolas" w:hAnsi="Consolas"/>
+          <w:shd w:fill="F2F1ED" w:val="clear"/>
+        </w:rPr>
+        <w:t xml:space="preserve">level2</w:t>
+      </w:r>
+      <w:r>
+        <w:t xml:space="preserve"> narrows the grid to one level; a </w:t>
       </w:r>
       <w:r>
         <w:rPr>
@@ -1755,7 +1785,7 @@
         <w:t xml:space="preserve">tile_lines</w:t>
       </w:r>
       <w:r>
-        <w:t xml:space="preserve"> list the config names explicitly. The </w:t>
+        <w:t xml:space="preserve"> list names the set explicitly. The </w:t>
       </w:r>
       <w:r>
         <w:rPr>

</xml_diff>

<commit_message>
A "+" row on the Tiles tab adds a line to the grid
How to get Banking NII on the tiles: one row in the Tiles tab — Banking NII
| + — and it is there. A "+" row adds a line the default grid does not carry,
resolved the way tile_lines resolves (a Metrics definition first, then down
the MICA levels — tile_line_levels now reaches micaL3 and micaL4 by default),
without touching the rest of the grid: it never turns the tab into a
show-list, never hides behind the top-KPIs collapse, and joins the slide
deck and the left-hand nav like any other tile. The Group pack carries the
Banking NII row.

Co-Authored-By: Claude Opus 5 <noreply@anthropic.com>
Claude-Session: https://claude.ai/code/session_01P4DDZgm6WRNJpLjFRThM8B
</commit_message>
<xml_diff>
--- a/iwpb-sg-dashboard/IWPB_SG_Dashboard_README.docx
+++ b/iwpb-sg-dashboard/IWPB_SG_Dashboard_README.docx
@@ -1507,7 +1507,7 @@
         <w:t xml:space="preserve">↺</w:t>
       </w:r>
       <w:r>
-        <w:t xml:space="preserve"> on a dimmed tile restores it to the grid. The choice is remembered in the browser (alongside the drag-to-reorder order) and the PowerPoint tile grid follows the page, so a parked line is off the one-pager too.</w:t>
+        <w:t xml:space="preserve"> on a dimmed tile restores it to the grid. The choice is remembered in the browser (alongside the drag-to-reorder order) and the PowerPoint tile grid follows the page, so a parked line is off the one-pager too. Nothing is recalculated by hiding — a parked tile is only out of view, and the reporting pack, the Financial Summary and the KPI scorecard still carry the line in full.</w:t>
       </w:r>
     </w:p>
     <w:p>
@@ -1516,7 +1516,7 @@
         <w:ind w:left="360"/>
       </w:pPr>
       <w:r>
-        <w:t xml:space="preserve">Nothing is recalculated by hiding — a parked tile is only out of view, and the reporting pack, the Financial Summary and the KPI scorecard still carry the line in full. Set </w:t>
+        <w:t xml:space="preserve">Set </w:t>
       </w:r>
       <w:r>
         <w:rPr>
@@ -1566,7 +1566,7 @@
         <w:t xml:space="preserve">Y</w:t>
       </w:r>
       <w:r>
-        <w:t xml:space="preserve"> to show and </w:t>
+        <w:t xml:space="preserve"> to show, </w:t>
       </w:r>
       <w:r>
         <w:rPr>
@@ -1586,7 +1586,47 @@
         <w:t xml:space="preserve">Y</w:t>
       </w:r>
       <w:r>
-        <w:t xml:space="preserve"> rows shows just those), with an optional </w:t>
+        <w:t xml:space="preserve"> rows shows just those), and </w:t>
+      </w:r>
+      <w:r>
+        <w:rPr>
+          <w:rFonts w:ascii="Consolas" w:cs="Consolas" w:eastAsia="Consolas" w:hAnsi="Consolas"/>
+          <w:shd w:fill="F2F1ED" w:val="clear"/>
+        </w:rPr>
+        <w:t xml:space="preserve">+</w:t>
+      </w:r>
+      <w:r>
+        <w:t xml:space="preserve"> to </w:t>
+      </w:r>
+      <w:r>
+        <w:rPr>
+          <w:b/>
+          <w:bCs/>
+        </w:rPr>
+        <w:t xml:space="preserve">add</w:t>
+      </w:r>
+      <w:r>
+        <w:t xml:space="preserve"> a line the default grid does not carry — resolved from the </w:t>
+      </w:r>
+      <w:r>
+        <w:rPr>
+          <w:rFonts w:ascii="Consolas" w:cs="Consolas" w:eastAsia="Consolas" w:hAnsi="Consolas"/>
+          <w:shd w:fill="F2F1ED" w:val="clear"/>
+        </w:rPr>
+        <w:t xml:space="preserve">Metrics</w:t>
+      </w:r>
+      <w:r>
+        <w:t xml:space="preserve"> sheet or any MICA level, so </w:t>
+      </w:r>
+      <w:r>
+        <w:rPr>
+          <w:rFonts w:ascii="Consolas" w:cs="Consolas" w:eastAsia="Consolas" w:hAnsi="Consolas"/>
+          <w:shd w:fill="F2F1ED" w:val="clear"/>
+        </w:rPr>
+        <w:t xml:space="preserve">Banking NII | +</w:t>
+      </w:r>
+      <w:r>
+        <w:t xml:space="preserve"> puts Banking NII on the grid, always visible, without touching the rest. An optional </w:t>
       </w:r>
       <w:r>
         <w:rPr>
@@ -1596,7 +1636,7 @@
         <w:t xml:space="preserve">Nets with</w:t>
       </w:r>
       <w:r>
-        <w:t xml:space="preserve"> column naming the lines that tile nets in.</w:t>
+        <w:t xml:space="preserve"> column names the lines a tile nets in.</w:t>
       </w:r>
     </w:p>
     <w:p>

</xml_diff>

<commit_message>
Banking NII defined as Revenue less Net Insurance Revenue
A metric is a row selection, and the selection grammar now excludes as well
as keeps: dim=value keeps rows, dim!=value drops them. Banking NII in the
Group pack is defined the way the business defines it — micaL2=Revenue;
micaL3!=Net Insurance Revenue — the Revenue block less its insurance line,
with every figure on the tile computed over exactly those rows. The Tiles
tab's "+" row carries it onto the grid; the workbook parser now accepts "+"
in the Show column (the prose guard was swallowing it). The field-shaped
fixture gains a Net Insurance Revenue line so the definition is exercised.

Co-Authored-By: Claude Opus 5 <noreply@anthropic.com>
Claude-Session: https://claude.ai/code/session_01P4DDZgm6WRNJpLjFRThM8B
</commit_message>
<xml_diff>
--- a/iwpb-sg-dashboard/IWPB_SG_Dashboard_README.docx
+++ b/iwpb-sg-dashboard/IWPB_SG_Dashboard_README.docx
@@ -1626,7 +1626,16 @@
         <w:t xml:space="preserve">Banking NII | +</w:t>
       </w:r>
       <w:r>
-        <w:t xml:space="preserve"> puts Banking NII on the grid, always visible, without touching the rest. An optional </w:t>
+        <w:t xml:space="preserve"> puts Banking NII on the grid, always visible, without touching the rest.</w:t>
+      </w:r>
+    </w:p>
+    <w:p>
+      <w:pPr>
+        <w:spacing w:after="100"/>
+        <w:ind w:left="360"/>
+      </w:pPr>
+      <w:r>
+        <w:t xml:space="preserve">An optional </w:t>
       </w:r>
       <w:r>
         <w:rPr>
@@ -1636,7 +1645,57 @@
         <w:t xml:space="preserve">Nets with</w:t>
       </w:r>
       <w:r>
-        <w:t xml:space="preserve"> column names the lines a tile nets in.</w:t>
+        <w:t xml:space="preserve"> column names the lines a tile nets in. A </w:t>
+      </w:r>
+      <w:r>
+        <w:rPr>
+          <w:rFonts w:ascii="Consolas" w:cs="Consolas" w:eastAsia="Consolas" w:hAnsi="Consolas"/>
+          <w:shd w:fill="F2F1ED" w:val="clear"/>
+        </w:rPr>
+        <w:t xml:space="preserve">Metrics</w:t>
+      </w:r>
+      <w:r>
+        <w:t xml:space="preserve"> row defines a named selection the grid can carry: </w:t>
+      </w:r>
+      <w:r>
+        <w:rPr>
+          <w:rFonts w:ascii="Consolas" w:cs="Consolas" w:eastAsia="Consolas" w:hAnsi="Consolas"/>
+          <w:shd w:fill="F2F1ED" w:val="clear"/>
+        </w:rPr>
+        <w:t xml:space="preserve">dim=value</w:t>
+      </w:r>
+      <w:r>
+        <w:t xml:space="preserve"> keeps rows, </w:t>
+      </w:r>
+      <w:r>
+        <w:rPr>
+          <w:rFonts w:ascii="Consolas" w:cs="Consolas" w:eastAsia="Consolas" w:hAnsi="Consolas"/>
+          <w:shd w:fill="F2F1ED" w:val="clear"/>
+        </w:rPr>
+        <w:t xml:space="preserve">dim!=value</w:t>
+      </w:r>
+      <w:r>
+        <w:t xml:space="preserve"> excludes them — so </w:t>
+      </w:r>
+      <w:r>
+        <w:rPr>
+          <w:rFonts w:ascii="Consolas" w:cs="Consolas" w:eastAsia="Consolas" w:hAnsi="Consolas"/>
+          <w:shd w:fill="F2F1ED" w:val="clear"/>
+        </w:rPr>
+        <w:t xml:space="preserve">Banking NII</w:t>
+      </w:r>
+      <w:r>
+        <w:t xml:space="preserve"> is defined as </w:t>
+      </w:r>
+      <w:r>
+        <w:rPr>
+          <w:rFonts w:ascii="Consolas" w:cs="Consolas" w:eastAsia="Consolas" w:hAnsi="Consolas"/>
+          <w:shd w:fill="F2F1ED" w:val="clear"/>
+        </w:rPr>
+        <w:t xml:space="preserve">micaL2=Revenue; micaL3!=Net Insurance Revenue</w:t>
+      </w:r>
+      <w:r>
+        <w:t xml:space="preserve">, the Revenue block less its insurance line, and every figure on the tile is computed over exactly those rows.</w:t>
       </w:r>
     </w:p>
     <w:p>

</xml_diff>

<commit_message>
One metric name, a different definition per business
Banking NII is not the same calculation in IWPB and CIB, so the Metrics
sheet gains an Applies-to column: the same name may be defined once per
business, each business's rows judged by the definition that business wrote,
an unscoped row covering the businesses that wrote none. A group view is the
sum of every business read its own way — never one business's definition
forced on another's rows — and scoping to a business keeps only its own
reading. The Group pack defines Banking NII both ways: IWPB as
micaL2=Revenue; micaL3!=Net Insurance Revenue, CIB as accH3=Banking NII.
A row's business is its business dimension, else its CG level.

Co-Authored-By: Claude Opus 5 <noreply@anthropic.com>
Claude-Session: https://claude.ai/code/session_01P4DDZgm6WRNJpLjFRThM8B
</commit_message>
<xml_diff>
--- a/iwpb-sg-dashboard/IWPB_SG_Dashboard_README.docx
+++ b/iwpb-sg-dashboard/IWPB_SG_Dashboard_README.docx
@@ -1626,7 +1626,17 @@
         <w:t xml:space="preserve">Banking NII | +</w:t>
       </w:r>
       <w:r>
-        <w:t xml:space="preserve"> puts Banking NII on the grid, always visible, without touching the rest.</w:t>
+        <w:t xml:space="preserve"> puts Banking NII on the grid, always visible, without touching the rest. An optional </w:t>
+      </w:r>
+      <w:r>
+        <w:rPr>
+          <w:b/>
+          <w:bCs/>
+        </w:rPr>
+        <w:t xml:space="preserve">Nets with</w:t>
+      </w:r>
+      <w:r>
+        <w:t xml:space="preserve"> column names the lines a tile nets in.</w:t>
       </w:r>
     </w:p>
     <w:p>
@@ -1635,17 +1645,7 @@
         <w:ind w:left="360"/>
       </w:pPr>
       <w:r>
-        <w:t xml:space="preserve">An optional </w:t>
-      </w:r>
-      <w:r>
-        <w:rPr>
-          <w:b/>
-          <w:bCs/>
-        </w:rPr>
-        <w:t xml:space="preserve">Nets with</w:t>
-      </w:r>
-      <w:r>
-        <w:t xml:space="preserve"> column names the lines a tile nets in. A </w:t>
+        <w:t xml:space="preserve">A </w:t>
       </w:r>
       <w:r>
         <w:rPr>
@@ -1696,6 +1696,65 @@
       </w:r>
       <w:r>
         <w:t xml:space="preserve">, the Revenue block less its insurance line, and every figure on the tile is computed over exactly those rows.</w:t>
+      </w:r>
+    </w:p>
+    <w:p>
+      <w:pPr>
+        <w:spacing w:after="100"/>
+        <w:ind w:left="360"/>
+      </w:pPr>
+      <w:r>
+        <w:t xml:space="preserve">The same name may carry a </w:t>
+      </w:r>
+      <w:r>
+        <w:rPr>
+          <w:b/>
+          <w:bCs/>
+        </w:rPr>
+        <w:t xml:space="preserve">different definition per business</w:t>
+      </w:r>
+      <w:r>
+        <w:t xml:space="preserve"> — an optional </w:t>
+      </w:r>
+      <w:r>
+        <w:rPr>
+          <w:rFonts w:ascii="Consolas" w:cs="Consolas" w:eastAsia="Consolas" w:hAnsi="Consolas"/>
+          <w:shd w:fill="F2F1ED" w:val="clear"/>
+        </w:rPr>
+        <w:t xml:space="preserve">Applies to</w:t>
+      </w:r>
+      <w:r>
+        <w:t xml:space="preserve"> column names whose definition each row is (</w:t>
+      </w:r>
+      <w:r>
+        <w:rPr>
+          <w:rFonts w:ascii="Consolas" w:cs="Consolas" w:eastAsia="Consolas" w:hAnsi="Consolas"/>
+          <w:shd w:fill="F2F1ED" w:val="clear"/>
+        </w:rPr>
+        <w:t xml:space="preserve">Banking NII | micaL2=Revenue; micaL3!=Net Insurance Revenue | IWPB</w:t>
+      </w:r>
+      <w:r>
+        <w:t xml:space="preserve"> beside </w:t>
+      </w:r>
+      <w:r>
+        <w:rPr>
+          <w:rFonts w:ascii="Consolas" w:cs="Consolas" w:eastAsia="Consolas" w:hAnsi="Consolas"/>
+          <w:shd w:fill="F2F1ED" w:val="clear"/>
+        </w:rPr>
+        <w:t xml:space="preserve">Banking NII | accH3=Banking NII | CIB</w:t>
+      </w:r>
+      <w:r>
+        <w:t xml:space="preserve">): each business's rows are judged by the definition that business wrote, a row with no </w:t>
+      </w:r>
+      <w:r>
+        <w:rPr>
+          <w:rFonts w:ascii="Consolas" w:cs="Consolas" w:eastAsia="Consolas" w:hAnsi="Consolas"/>
+          <w:shd w:fill="F2F1ED" w:val="clear"/>
+        </w:rPr>
+        <w:t xml:space="preserve">Applies to</w:t>
+      </w:r>
+      <w:r>
+        <w:t xml:space="preserve"> covers the businesses that wrote none, and a group view is simply the sum of every business read its own way — never one business's definition forced on another's rows.</w:t>
       </w:r>
     </w:p>
     <w:p>

</xml_diff>

<commit_message>
The Definitions tab: a calculation's lineage, by business, in the config
The best form of a business-defined calculation is the one an auditor can
read: a Definitions tab where each row is one component — the calculation's
name, whose business the definition is, a line of the driller named in the
file's own words, and + or − for whether it is included or carved out. No
dim= syntax, no guessing, no hardcoding: what the tab reads is exactly what
the tile computes, row for row equal to the equivalent dim= selection, and
the tile's tooltip reads the lineage back word for word. A Definitions entry
speaks over a Metrics row written for the same calculation and business.
Banking NII in the Group pack now lives there: IWPB as + Revenue − Net
Insurance Revenue, CIB as + Banking NII.

Co-Authored-By: Claude Opus 5 <noreply@anthropic.com>
Claude-Session: https://claude.ai/code/session_01P4DDZgm6WRNJpLjFRThM8B
</commit_message>
<xml_diff>
--- a/iwpb-sg-dashboard/IWPB_SG_Dashboard_README.docx
+++ b/iwpb-sg-dashboard/IWPB_SG_Dashboard_README.docx
@@ -1754,7 +1754,104 @@
         <w:t xml:space="preserve">Applies to</w:t>
       </w:r>
       <w:r>
-        <w:t xml:space="preserve"> covers the businesses that wrote none, and a group view is simply the sum of every business read its own way — never one business's definition forced on another's rows.</w:t>
+        <w:t xml:space="preserve"> covers the businesses that wrote none, and a group view is simply the sum of every business read its own way — never one business's definition forced on another's rows. The plain-language form is the </w:t>
+      </w:r>
+      <w:r>
+        <w:rPr>
+          <w:b/>
+          <w:bCs/>
+        </w:rPr>
+        <w:t xml:space="preserve">Definitions</w:t>
+      </w:r>
+      <w:r>
+        <w:t xml:space="preserve"> tab — the calculation's lineage, one component per row, in the file's own line names:</w:t>
+      </w:r>
+    </w:p>
+    <w:p>
+      <w:pPr>
+        <w:shd w:fill="F2F1ED" w:val="clear"/>
+        <w:spacing w:after="0"/>
+      </w:pPr>
+      <w:r>
+        <w:rPr>
+          <w:rFonts w:ascii="Consolas" w:cs="Consolas" w:eastAsia="Consolas" w:hAnsi="Consolas"/>
+          <w:sz w:val="18"/>
+          <w:szCs w:val="18"/>
+        </w:rPr>
+        <w:t xml:space="preserve">Calculation  | Business | Line                   | Include</w:t>
+      </w:r>
+    </w:p>
+    <w:p>
+      <w:pPr>
+        <w:shd w:fill="F2F1ED" w:val="clear"/>
+        <w:spacing w:after="0"/>
+      </w:pPr>
+      <w:r>
+        <w:rPr>
+          <w:rFonts w:ascii="Consolas" w:cs="Consolas" w:eastAsia="Consolas" w:hAnsi="Consolas"/>
+          <w:sz w:val="18"/>
+          <w:szCs w:val="18"/>
+        </w:rPr>
+        <w:t xml:space="preserve">Banking NII  | IWPB     | Revenue                |   +</w:t>
+      </w:r>
+    </w:p>
+    <w:p>
+      <w:pPr>
+        <w:shd w:fill="F2F1ED" w:val="clear"/>
+        <w:spacing w:after="0"/>
+      </w:pPr>
+      <w:r>
+        <w:rPr>
+          <w:rFonts w:ascii="Consolas" w:cs="Consolas" w:eastAsia="Consolas" w:hAnsi="Consolas"/>
+          <w:sz w:val="18"/>
+          <w:szCs w:val="18"/>
+        </w:rPr>
+        <w:t xml:space="preserve">Banking NII  | IWPB     | Net Insurance Revenue  |   −</w:t>
+      </w:r>
+    </w:p>
+    <w:p>
+      <w:pPr>
+        <w:shd w:fill="F2F1ED" w:val="clear"/>
+        <w:spacing w:after="0"/>
+      </w:pPr>
+      <w:r>
+        <w:rPr>
+          <w:rFonts w:ascii="Consolas" w:cs="Consolas" w:eastAsia="Consolas" w:hAnsi="Consolas"/>
+          <w:sz w:val="18"/>
+          <w:szCs w:val="18"/>
+        </w:rPr>
+        <w:t xml:space="preserve">Banking NII  | CIB      | Banking NII            |   +</w:t>
+      </w:r>
+    </w:p>
+    <w:p>
+      <w:pPr>
+        <w:spacing w:after="120"/>
+      </w:pPr>
+    </w:p>
+    <w:p>
+      <w:pPr>
+        <w:spacing w:after="140"/>
+        <w:ind w:left="360"/>
+      </w:pPr>
+      <w:r>
+        <w:rPr>
+          <w:rFonts w:ascii="Consolas" w:cs="Consolas" w:eastAsia="Consolas" w:hAnsi="Consolas"/>
+          <w:shd w:fill="F2F1ED" w:val="clear"/>
+        </w:rPr>
+        <w:t xml:space="preserve">+</w:t>
+      </w:r>
+      <w:r>
+        <w:t xml:space="preserve"> includes the named line (from any MICA or hierarchy level), </w:t>
+      </w:r>
+      <w:r>
+        <w:rPr>
+          <w:rFonts w:ascii="Consolas" w:cs="Consolas" w:eastAsia="Consolas" w:hAnsi="Consolas"/>
+          <w:shd w:fill="F2F1ED" w:val="clear"/>
+        </w:rPr>
+        <w:t xml:space="preserve">−</w:t>
+      </w:r>
+      <w:r>
+        <w:t xml:space="preserve"> carves it out, blank Business covers every business that wrote none. What the tab reads is exactly what the tile computes — the tile's tooltip reads the lineage back word for word — and a Definitions entry speaks over a Metrics row written for the same calculation and business, so there is one place to look and it wins.</w:t>
       </w:r>
     </w:p>
     <w:p>

</xml_diff>

<commit_message>
Definitions carry their level and follow through by themselves
Two more columns on the Definitions tab. MICA level pins each component to
the level its name lives at — L1..L4 for MICA, or a hierarchy key like accH3
— so a name that exists at two levels is never guessed; blank still searches
every level. And a defined calculation now follows through on its own: it
joins the tile grid, the slide deck, the KPI nav and the tile-driven
commentary with no separate Tiles row (Tile: N keeps it a definition only).
The pack's Banking NII rows carry their levels and the Tiles-tab "+" row
retires — the Definitions tab is the one place the calculation lives.

Co-Authored-By: Claude Opus 5 <noreply@anthropic.com>
Claude-Session: https://claude.ai/code/session_01P4DDZgm6WRNJpLjFRThM8B
</commit_message>
<xml_diff>
--- a/iwpb-sg-dashboard/IWPB_SG_Dashboard_README.docx
+++ b/iwpb-sg-dashboard/IWPB_SG_Dashboard_README.docx
@@ -1778,7 +1778,7 @@
           <w:sz w:val="18"/>
           <w:szCs w:val="18"/>
         </w:rPr>
-        <w:t xml:space="preserve">Calculation  | Business | Line                   | Include</w:t>
+        <w:t xml:space="preserve">Calculation  | Business | Line                   | Include | MICA level | Tile</w:t>
       </w:r>
     </w:p>
     <w:p>
@@ -1792,7 +1792,7 @@
           <w:sz w:val="18"/>
           <w:szCs w:val="18"/>
         </w:rPr>
-        <w:t xml:space="preserve">Banking NII  | IWPB     | Revenue                |   +</w:t>
+        <w:t xml:space="preserve">Banking NII  | IWPB     | Revenue                |   +     |    L2      |</w:t>
       </w:r>
     </w:p>
     <w:p>
@@ -1806,7 +1806,7 @@
           <w:sz w:val="18"/>
           <w:szCs w:val="18"/>
         </w:rPr>
-        <w:t xml:space="preserve">Banking NII  | IWPB     | Net Insurance Revenue  |   −</w:t>
+        <w:t xml:space="preserve">Banking NII  | IWPB     | Net Insurance Revenue  |   −     |    L3      |</w:t>
       </w:r>
     </w:p>
     <w:p>
@@ -1820,7 +1820,7 @@
           <w:sz w:val="18"/>
           <w:szCs w:val="18"/>
         </w:rPr>
-        <w:t xml:space="preserve">Banking NII  | CIB      | Banking NII            |   +</w:t>
+        <w:t xml:space="preserve">Banking NII  | CIB      | Banking NII            |   +     |   accH3    |</w:t>
       </w:r>
     </w:p>
     <w:p>
@@ -1841,7 +1841,7 @@
         <w:t xml:space="preserve">+</w:t>
       </w:r>
       <w:r>
-        <w:t xml:space="preserve"> includes the named line (from any MICA or hierarchy level), </w:t>
+        <w:t xml:space="preserve"> includes the named line, </w:t>
       </w:r>
       <w:r>
         <w:rPr>
@@ -1851,7 +1851,86 @@
         <w:t xml:space="preserve">−</w:t>
       </w:r>
       <w:r>
-        <w:t xml:space="preserve"> carves it out, blank Business covers every business that wrote none. What the tab reads is exactly what the tile computes — the tile's tooltip reads the lineage back word for word — and a Definitions entry speaks over a Metrics row written for the same calculation and business, so there is one place to look and it wins.</w:t>
+        <w:t xml:space="preserve"> carves it out, blank Business covers every business that wrote none. </w:t>
+      </w:r>
+      <w:r>
+        <w:rPr>
+          <w:b/>
+          <w:bCs/>
+        </w:rPr>
+        <w:t xml:space="preserve">MICA level</w:t>
+      </w:r>
+      <w:r>
+        <w:t xml:space="preserve"> pins the name to the level it lives at — </w:t>
+      </w:r>
+      <w:r>
+        <w:rPr>
+          <w:rFonts w:ascii="Consolas" w:cs="Consolas" w:eastAsia="Consolas" w:hAnsi="Consolas"/>
+          <w:shd w:fill="F2F1ED" w:val="clear"/>
+        </w:rPr>
+        <w:t xml:space="preserve">L1</w:t>
+      </w:r>
+      <w:r>
+        <w:t xml:space="preserve">..</w:t>
+      </w:r>
+      <w:r>
+        <w:rPr>
+          <w:rFonts w:ascii="Consolas" w:cs="Consolas" w:eastAsia="Consolas" w:hAnsi="Consolas"/>
+          <w:shd w:fill="F2F1ED" w:val="clear"/>
+        </w:rPr>
+        <w:t xml:space="preserve">L4</w:t>
+      </w:r>
+      <w:r>
+        <w:t xml:space="preserve"> for MICA, or a hierarchy key like </w:t>
+      </w:r>
+      <w:r>
+        <w:rPr>
+          <w:rFonts w:ascii="Consolas" w:cs="Consolas" w:eastAsia="Consolas" w:hAnsi="Consolas"/>
+          <w:shd w:fill="F2F1ED" w:val="clear"/>
+        </w:rPr>
+        <w:t xml:space="preserve">accH3</w:t>
+      </w:r>
+      <w:r>
+        <w:t xml:space="preserve"> — so a name that exists at two levels is never guessed (blank searches every level).</w:t>
+      </w:r>
+    </w:p>
+    <w:p>
+      <w:pPr>
+        <w:spacing w:after="140"/>
+        <w:ind w:left="360"/>
+      </w:pPr>
+      <w:r>
+        <w:t xml:space="preserve">A defined calculation </w:t>
+      </w:r>
+      <w:r>
+        <w:rPr>
+          <w:b/>
+          <w:bCs/>
+        </w:rPr>
+        <w:t xml:space="preserve">follows through by itself</w:t>
+      </w:r>
+      <w:r>
+        <w:t xml:space="preserve">: it joins the tile grid, the slide deck, the KPI nav and the tile-driven commentary with no further wiring — put </w:t>
+      </w:r>
+      <w:r>
+        <w:rPr>
+          <w:rFonts w:ascii="Consolas" w:cs="Consolas" w:eastAsia="Consolas" w:hAnsi="Consolas"/>
+          <w:shd w:fill="F2F1ED" w:val="clear"/>
+        </w:rPr>
+        <w:t xml:space="preserve">N</w:t>
+      </w:r>
+      <w:r>
+        <w:t xml:space="preserve"> in the </w:t>
+      </w:r>
+      <w:r>
+        <w:rPr>
+          <w:b/>
+          <w:bCs/>
+        </w:rPr>
+        <w:t xml:space="preserve">Tile</w:t>
+      </w:r>
+      <w:r>
+        <w:t xml:space="preserve"> column to keep it a definition only. What the tab reads is exactly what the tile computes — the tile's tooltip reads the lineage back word for word, level included — and a Definitions entry speaks over a Metrics row written for the same calculation and business, so there is one place to look and it wins.</w:t>
       </w:r>
     </w:p>
     <w:p>

</xml_diff>

<commit_message>
README: the deck mirrors the screen
Co-Authored-By: Claude Opus 5 <noreply@anthropic.com>
Claude-Session: https://claude.ai/code/session_01P4DDZgm6WRNJpLjFRThM8B
</commit_message>
<xml_diff>
--- a/iwpb-sg-dashboard/IWPB_SG_Dashboard_README.docx
+++ b/iwpb-sg-dashboard/IWPB_SG_Dashboard_README.docx
@@ -1192,7 +1192,7 @@
           <w:ilvl w:val="0"/>
           <w:numId w:val="3"/>
         </w:numPr>
-        <w:spacing w:after="80"/>
+        <w:spacing w:after="100"/>
       </w:pPr>
       <w:r>
         <w:rPr>
@@ -1232,7 +1232,16 @@
         <w:t xml:space="preserve">vs Target</w:t>
       </w:r>
       <w:r>
-        <w:t xml:space="preserve">) showing the variance amount and % with direction triangles — the triangle tracks the business movement (revenue up ▲, cost up ▲) and the colour the favourability (green favourable, red unfavourable). The </w:t>
+        <w:t xml:space="preserve">) showing the variance amount and % with direction triangles — the triangle tracks the business movement (revenue up ▲, cost up ▲) and the colour the favourability (green favourable, red unfavourable).</w:t>
+      </w:r>
+    </w:p>
+    <w:p>
+      <w:pPr>
+        <w:spacing w:after="100"/>
+        <w:ind w:left="360"/>
+      </w:pPr>
+      <w:r>
+        <w:t xml:space="preserve">The </w:t>
       </w:r>
       <w:r>
         <w:rPr>
@@ -1242,7 +1251,7 @@
         <w:t xml:space="preserve">⤓ PPT</w:t>
       </w:r>
       <w:r>
-        <w:t xml:space="preserve"> button beside Export to Excel produces the same tile grid as a single widescreen slide, built natively in PowerPoint.</w:t>
+        <w:t xml:space="preserve"> button beside Export to Excel produces the same tile grid as a single widescreen slide, built natively in PowerPoint. The deck mirrors the screen exactly: the tiles the summary is showing right now, in their rendered order — a tile behind "Show all" or parked stays off the deck, and a panel the screen hides never becomes a slide — followed by the page's own commentary: the hero line, the trajectory and Mix notes where those panels are visible, and the Management Commentary on its own slides.</w:t>
       </w:r>
     </w:p>
     <w:p>

</xml_diff>

<commit_message>
The left pane slims to what only it can do
Four sections leave the rail: Countries (the strip and the picker), the
KPIs · MICA Level 2 shortcut list, Output fields and the per-column Filters.
Their jobs live elsewhere or in defaults: scoping is the top scope bar and
the summary chips (fillScopeBar now outlives the strip that used to feed
it — the bar's context is computed regardless and only the strip DOM is
skipped); the Data view and Excel exports carry the default column set; the
tiles and their click-through cover what the KPI list duplicated. The pane
keeps the dashboards navigation, Configuration, Period & RAG and the
Commentary templates picker. Checks that tested the removed surfaces are
retired; those that used them as load signals or cross-checks now read the
surviving surfaces.

Co-Authored-By: Claude Opus 5 <noreply@anthropic.com>
Claude-Session: https://claude.ai/code/session_01P4DDZgm6WRNJpLjFRThM8B
</commit_message>
<xml_diff>
--- a/iwpb-sg-dashboard/IWPB_SG_Dashboard_README.docx
+++ b/iwpb-sg-dashboard/IWPB_SG_Dashboard_README.docx
@@ -877,27 +877,17 @@
         <w:spacing w:after="140"/>
       </w:pPr>
       <w:r>
-        <w:t xml:space="preserve">A </w:t>
-      </w:r>
-      <w:r>
-        <w:rPr>
-          <w:b/>
-          <w:bCs/>
-        </w:rPr>
-        <w:t xml:space="preserve">Countries strip</w:t>
-      </w:r>
-      <w:r>
-        <w:t xml:space="preserve"> appears in the left pane: the Group/Region row — the consolidation where the file carries one, else the sum of every country — then one row per country with its P&amp;L YTD and RAG; click a row to scope every page, chart, export and simulation to that country (the Country filter group mirrors the choice). The strip stays quiet: the whole section folds from its header like the other left-pane sections, the tree stops at business lines and regions (business rows carry a persistent expand/collapse caret), and countries live in a </w:t>
-      </w:r>
-      <w:r>
-        <w:rPr>
-          <w:b/>
-          <w:bCs/>
-        </w:rPr>
-        <w:t xml:space="preserve">country dropdown</w:t>
-      </w:r>
-      <w:r>
-        <w:t xml:space="preserve"> beneath the tree — a picker showing the current selection with its RAG dot and value, opening a searchable panel of countries grouped by business line and region.</w:t>
+        <w:t xml:space="preserve">Scoping lives in the </w:t>
+      </w:r>
+      <w:r>
+        <w:rPr>
+          <w:b/>
+          <w:bCs/>
+        </w:rPr>
+        <w:t xml:space="preserve">top scope bar</w:t>
+      </w:r>
+      <w:r>
+        <w:t xml:space="preserve">: the business line, region and country dropdowns beside Units (each narrowed to the level above it), with the active scope shown as removable chips on the Summary. Picking a scope there drives every page, chart, export and simulation, and clearing a chip restores the wider view.</w:t>
       </w:r>
     </w:p>
     <w:p>
@@ -905,7 +895,7 @@
         <w:spacing w:after="140"/>
       </w:pPr>
       <w:r>
-        <w:t xml:space="preserve">Picking a country scopes the whole app (keeping the business-line scope), a clear row restores the wider scope, and scoping from anywhere else keeps the picker in sync. Region consolidation keeps all the standing rules: YTD from YTD columns, balances as closing positions in </w:t>
+        <w:t xml:space="preserve">Region consolidation keeps all the standing rules: YTD from YTD columns, balances as closing positions in </w:t>
       </w:r>
       <w:r>
         <w:rPr>
@@ -7892,7 +7882,17 @@
         <w:spacing w:after="140"/>
       </w:pPr>
       <w:r>
-        <w:t xml:space="preserve">The design follows HSBC management-reporting conventions: a light left pane with a red brand block, section headers and pink-highlighted active items; a red uppercase eyebrow over large page titles; flat white stat tiles with big numbers (negatives in red brackets); and red monochrome charts with a grey prior-year series. The left pane hosts the dashboards navigation and a KPI shortcut list (each MICA Level 2 line with its RAG dot and YTD value — click to analyse it in Mix analysis, drag onto My dashboard to add it). Below the KPI list, the left pane holds the controls: period settings (YTD-through month, variance period, include-forecast), then a checkbox filter for EVERY dimension column in the file — each column expands to its distinct values with All/None shortcuts and a search box for long lists, and any combination applies to every view, chart and export.</w:t>
+        <w:t xml:space="preserve">The design follows HSBC management-reporting conventions: a light left pane with a red brand block, section headers and pink-highlighted active items; a red uppercase eyebrow over large page titles; flat white stat tiles with big numbers (negatives in red brackets); and red monochrome charts with a grey prior-year series. The left pane is deliberately spare: the dashboards navigation, the Configuration section, the period controls (YTD-through month and variance period) and the Commentary templates picker — scoping happens in the top scope bar, and the Data view and Excel exports carry the default column set RAG compares YTD actuals with the same prior-year months: </w:t>
+      </w:r>
+      <w:r>
+        <w:rPr>
+          <w:b/>
+          <w:bCs/>
+        </w:rPr>
+        <w:t xml:space="preserve">green at or above prior year, red below it</w:t>
+      </w:r>
+      <w:r>
+        <w:t xml:space="preserve">.</w:t>
       </w:r>
     </w:p>
     <w:p>
@@ -7900,23 +7900,8 @@
         <w:spacing w:after="140"/>
       </w:pPr>
       <w:r>
-        <w:t xml:space="preserve">Below that, an Output fields section with checkboxes chooses which dimension columns and period column groups appear in the Data view and in Excel exports. RAG compares YTD actuals with the same prior-year months: </w:t>
-      </w:r>
-      <w:r>
-        <w:rPr>
-          <w:b/>
-          <w:bCs/>
-        </w:rPr>
-        <w:t xml:space="preserve">green at or above prior year, red below it</w:t>
-      </w:r>
-      <w:r>
-        <w:t xml:space="preserve">. There is no amber and no watch band — an in-between rating only ever meant "within a tolerance nobody agreed", and it let the same figure read three ways depending on a setting.</w:t>
-      </w:r>
-    </w:p>
-    <w:p>
-      <w:pPr>
-        <w:spacing w:after="140"/>
-      </w:pPr>
+        <w:t xml:space="preserve">There is no amber and no watch band — an in-between rating only ever meant "within a tolerance nobody agreed", and it let the same figure read three ways depending on a setting. </w:t>
+      </w:r>
       <w:r>
         <w:rPr>
           <w:rFonts w:ascii="Consolas" w:cs="Consolas" w:eastAsia="Consolas" w:hAnsi="Consolas"/>

</xml_diff>

<commit_message>
The Data drill down retires; the Query builder is the row export
The Data drill down page and its nav entry are removed — the Query builder
already covers drilling into the source rows, with filters, column choice
and sort, and its Results panel carries the Export to Excel that downloads
exactly what the query returned. The units check that exercised the old
raw-rows export now exports through the Query builder instead.

Co-Authored-By: Claude Opus 5 <noreply@anthropic.com>
Claude-Session: https://claude.ai/code/session_01P4DDZgm6WRNJpLjFRThM8B
</commit_message>
<xml_diff>
--- a/iwpb-sg-dashboard/IWPB_SG_Dashboard_README.docx
+++ b/iwpb-sg-dashboard/IWPB_SG_Dashboard_README.docx
@@ -7882,7 +7882,35 @@
         <w:spacing w:after="140"/>
       </w:pPr>
       <w:r>
-        <w:t xml:space="preserve">The design follows HSBC management-reporting conventions: a light left pane with a red brand block, section headers and pink-highlighted active items; a red uppercase eyebrow over large page titles; flat white stat tiles with big numbers (negatives in red brackets); and red monochrome charts with a grey prior-year series. The left pane is deliberately spare: the dashboards navigation, the Configuration section, the period controls (YTD-through month and variance period) and the Commentary templates picker — scoping happens in the top scope bar, and the Data view and Excel exports carry the default column set RAG compares YTD actuals with the same prior-year months: </w:t>
+        <w:t xml:space="preserve">The design follows HSBC management-reporting conventions: a light left pane with a red brand block, section headers and pink-highlighted active items; a red uppercase eyebrow over large page titles; flat white stat tiles with big numbers (negatives in red brackets); and red monochrome charts with a grey prior-year series. The left pane is deliberately spare: the dashboards navigation, the Configuration section, the period controls (YTD-through month and variance period) and the Commentary templates picker — scoping happens in the top scope bar, and the Excel exports carry the default column set.</w:t>
+      </w:r>
+    </w:p>
+    <w:p>
+      <w:pPr>
+        <w:spacing w:after="140"/>
+      </w:pPr>
+      <w:r>
+        <w:t xml:space="preserve">The old Data drill down page is retired — the </w:t>
+      </w:r>
+      <w:r>
+        <w:rPr>
+          <w:b/>
+          <w:bCs/>
+        </w:rPr>
+        <w:t xml:space="preserve">Query builder</w:t>
+      </w:r>
+      <w:r>
+        <w:t xml:space="preserve"> covers it: drag the columns you want, filter and sort, run, and </w:t>
+      </w:r>
+      <w:r>
+        <w:rPr>
+          <w:b/>
+          <w:bCs/>
+        </w:rPr>
+        <w:t xml:space="preserve">⤓ Export to Excel</w:t>
+      </w:r>
+      <w:r>
+        <w:t xml:space="preserve"> on the Results panel downloads the result RAG compares YTD actuals with the same prior-year months: </w:t>
       </w:r>
       <w:r>
         <w:rPr>
@@ -7892,16 +7920,13 @@
         <w:t xml:space="preserve">green at or above prior year, red below it</w:t>
       </w:r>
       <w:r>
-        <w:t xml:space="preserve">.</w:t>
+        <w:t xml:space="preserve">. There is no amber and no watch band — an in-between rating only ever meant "within a tolerance nobody agreed", and it let the same figure read three ways depending on a setting.</w:t>
       </w:r>
     </w:p>
     <w:p>
       <w:pPr>
         <w:spacing w:after="140"/>
       </w:pPr>
-      <w:r>
-        <w:t xml:space="preserve">There is no amber and no watch band — an in-between rating only ever meant "within a tolerance nobody agreed", and it let the same figure read three ways depending on a setting. </w:t>
-      </w:r>
       <w:r>
         <w:rPr>
           <w:rFonts w:ascii="Consolas" w:cs="Consolas" w:eastAsia="Consolas" w:hAnsi="Consolas"/>

</xml_diff>

<commit_message>
HK, UK and Corp Centre consolidate as business groups beside IWPB and CIB
Business groups are whatever Level 0 of the CountryHierarchy declares, and
the Group pack now declares five: IWPB, CIB, HK, UK and Corp Centre. Each
consolidates identically — the Group is the sum of all five, Corp Centre
negative and all, every group scopes every page, and per-group Definitions
read each group its own way with GROUP as the fallback. One resolution rule
made it work: a bare tab named after an entity group (a tab called UK)
resolves to the group named after itself even where the same name exists as
a country inside another business — the country tab inside a business says
the business in its name. A five-group fixture pins all of it.

Co-Authored-By: Claude Opus 5 <noreply@anthropic.com>
Claude-Session: https://claude.ai/code/session_01P4DDZgm6WRNJpLjFRThM8B
</commit_message>
<xml_diff>
--- a/iwpb-sg-dashboard/IWPB_SG_Dashboard_README.docx
+++ b/iwpb-sg-dashboard/IWPB_SG_Dashboard_README.docx
@@ -870,6 +870,81 @@
       </w:r>
       <w:r>
         <w:t xml:space="preserve">, never Group.</w:t>
+      </w:r>
+    </w:p>
+    <w:p>
+      <w:pPr>
+        <w:spacing w:after="140"/>
+      </w:pPr>
+      <w:r>
+        <w:rPr>
+          <w:b/>
+          <w:bCs/>
+        </w:rPr>
+        <w:t xml:space="preserve">Business groups are whatever the CountryHierarchy declares</w:t>
+      </w:r>
+      <w:r>
+        <w:t xml:space="preserve"> — its Level 0 values. IWPB and CIB are the classic global businesses, and entity groups sit beside them as peers: the Group pack declares </w:t>
+      </w:r>
+      <w:r>
+        <w:rPr>
+          <w:b/>
+          <w:bCs/>
+        </w:rPr>
+        <w:t xml:space="preserve">HK</w:t>
+      </w:r>
+      <w:r>
+        <w:t xml:space="preserve">, </w:t>
+      </w:r>
+      <w:r>
+        <w:rPr>
+          <w:b/>
+          <w:bCs/>
+        </w:rPr>
+        <w:t xml:space="preserve">UK</w:t>
+      </w:r>
+      <w:r>
+        <w:t xml:space="preserve"> and </w:t>
+      </w:r>
+      <w:r>
+        <w:rPr>
+          <w:b/>
+          <w:bCs/>
+        </w:rPr>
+        <w:t xml:space="preserve">Corp Centre</w:t>
+      </w:r>
+      <w:r>
+        <w:t xml:space="preserve">, each consolidating exactly the same way — the Group is the sum of all five (Corp Centre negative and all), each group scopes every page, and per-group Definitions read each group its own way with a </w:t>
+      </w:r>
+      <w:r>
+        <w:rPr>
+          <w:rFonts w:ascii="Consolas" w:cs="Consolas" w:eastAsia="Consolas" w:hAnsi="Consolas"/>
+          <w:shd w:fill="F2F1ED" w:val="clear"/>
+        </w:rPr>
+        <w:t xml:space="preserve">GROUP</w:t>
+      </w:r>
+      <w:r>
+        <w:t xml:space="preserve"> row as the fallback. A bare tab named after an entity group (a tab called </w:t>
+      </w:r>
+      <w:r>
+        <w:rPr>
+          <w:rFonts w:ascii="Consolas" w:cs="Consolas" w:eastAsia="Consolas" w:hAnsi="Consolas"/>
+          <w:shd w:fill="F2F1ED" w:val="clear"/>
+        </w:rPr>
+        <w:t xml:space="preserve">UK</w:t>
+      </w:r>
+      <w:r>
+        <w:t xml:space="preserve">) resolves to that group even where the same name exists as a country inside another business — the country tab inside a business carries the business in its name (</w:t>
+      </w:r>
+      <w:r>
+        <w:rPr>
+          <w:rFonts w:ascii="Consolas" w:cs="Consolas" w:eastAsia="Consolas" w:hAnsi="Consolas"/>
+          <w:shd w:fill="F2F1ED" w:val="clear"/>
+        </w:rPr>
+        <w:t xml:space="preserve">IWPB UK</w:t>
+      </w:r>
+      <w:r>
+        <w:t xml:space="preserve">).</w:t>
       </w:r>
     </w:p>
     <w:p>

</xml_diff>

<commit_message>
A Business performance table shows the consolidation as evidence
Beneath the Management Commentary the Summary now carries the rollup the
reader can check by eye: one row per region under its business, a Global
subtotal per business, the Group at the foot — P&L YTD through the last
actual month with the three comparisons, every figure computed over exactly
the rows that scope holds, so the regions visibly add to their Global line
and the Global lines to the Group. A business with one region skips the
region tier rather than repeating itself; rows no business mapping claims
show as an Unallocated line so the table always adds up; balances stay out;
the table hides on a single-business file. The five-group check now proves
the additions off the rendered table itself, and the fixture gains a second
IWPB region so the region tier genuinely demonstrates.

Co-Authored-By: Claude Opus 5 <noreply@anthropic.com>
Claude-Session: https://claude.ai/code/session_01P4DDZgm6WRNJpLjFRThM8B
</commit_message>
<xml_diff>
--- a/iwpb-sg-dashboard/IWPB_SG_Dashboard_README.docx
+++ b/iwpb-sg-dashboard/IWPB_SG_Dashboard_README.docx
@@ -945,6 +945,24 @@
       </w:r>
       <w:r>
         <w:t xml:space="preserve">).</w:t>
+      </w:r>
+    </w:p>
+    <w:p>
+      <w:pPr>
+        <w:spacing w:after="140"/>
+      </w:pPr>
+      <w:r>
+        <w:t xml:space="preserve">Beneath the Management Commentary the Summary carries a </w:t>
+      </w:r>
+      <w:r>
+        <w:rPr>
+          <w:b/>
+          <w:bCs/>
+        </w:rPr>
+        <w:t xml:space="preserve">Business performance</w:t>
+      </w:r>
+      <w:r>
+        <w:t xml:space="preserve"> table — the consolidation shown as evidence: one row per region under its business, a Global subtotal per business, the Group at the foot, each with the P&amp;L YTD and the three comparisons. The regions visibly add to their Global line and the Global lines to the Group; rows no business mapping claims appear as an Unallocated line so the table always adds up; balances stay out. The table reads the whole tree whatever geography is scoped elsewhere, and hides on a single-business file.</w:t>
       </w:r>
     </w:p>
     <w:p>

</xml_diff>

<commit_message>
The Business performance table is organised by tile
One column per KPI tile on the grid — Revenue, ECL, the cost lines —
with the same names and netting the tiles carry, read over the whole
tree. In every column the regions add to their Global business and the
businesses add to the Group; a line a group defines no reading for
shows a dash, and balance tiles keep their own closing column, never
added into P&L.

Co-Authored-By: Claude Fable 5 <noreply@anthropic.com>
Claude-Session: https://claude.ai/code/session_01P4DDZgm6WRNJpLjFRThM8B
</commit_message>
<xml_diff>
--- a/iwpb-sg-dashboard/IWPB_SG_Dashboard_README.docx
+++ b/iwpb-sg-dashboard/IWPB_SG_Dashboard_README.docx
@@ -962,7 +962,15 @@
         <w:t xml:space="preserve">Business performance</w:t>
       </w:r>
       <w:r>
-        <w:t xml:space="preserve"> table — the consolidation shown as evidence: one row per region under its business, a Global subtotal per business, the Group at the foot, each with the P&amp;L YTD and the three comparisons. The regions visibly add to their Global line and the Global lines to the Group; rows no business mapping claims appear as an Unallocated line so the table always adds up; balances stay out. The table reads the whole tree whatever geography is scoped elsewhere, and hides on a single-business file.</w:t>
+        <w:t xml:space="preserve"> table — the consolidation shown as evidence, organised by tile: one column per KPI tile on the grid (Revenue, ECL, the cost lines…), the same names and the same netting, and one row per region under its business, a Global subtotal per business and the Group at the foot.</w:t>
+      </w:r>
+    </w:p>
+    <w:p>
+      <w:pPr>
+        <w:spacing w:after="140"/>
+      </w:pPr>
+      <w:r>
+        <w:t xml:space="preserve">In every column the regions visibly add to their Global line and the Global lines to the Group; a line a group defines no reading for (a per-business Definition it never wrote) shows a dash rather than a borrowed figure; rows no business mapping claims appear as an Unallocated line so the table always adds up. Balance-sheet tiles keep their own column in the balance unit as closing positions — never added into a P&amp;L column. The table reads the whole tree whatever geography is scoped elsewhere, and hides on a single-business file.</w:t>
       </w:r>
     </w:p>
     <w:p>

</xml_diff>

<commit_message>
Business performance moves to the left pane, down to country, with an Excel export
The pane section is a rollup tree on the result line — countries under
their region, regions under their Global business, the Group at the
foot — cast exactly the way the big table was. Export to Excel writes
the full evidence table: every tile as a column, business / region /
country rows, memo and balance columns marked. The config packs' Period
label loses the stale '& RAG' the pane had already dropped.

Co-Authored-By: Claude Fable 5 <noreply@anthropic.com>
Claude-Session: https://claude.ai/code/session_01P4DDZgm6WRNJpLjFRThM8B
</commit_message>
<xml_diff>
--- a/iwpb-sg-dashboard/IWPB_SG_Dashboard_README.docx
+++ b/iwpb-sg-dashboard/IWPB_SG_Dashboard_README.docx
@@ -952,7 +952,7 @@
         <w:spacing w:after="140"/>
       </w:pPr>
       <w:r>
-        <w:t xml:space="preserve">Beneath the Management Commentary the Summary carries a </w:t>
+        <w:t xml:space="preserve">The left pane carries a </w:t>
       </w:r>
       <w:r>
         <w:rPr>
@@ -962,7 +962,7 @@
         <w:t xml:space="preserve">Business performance</w:t>
       </w:r>
       <w:r>
-        <w:t xml:space="preserve"> table — the consolidation shown as evidence, organised by tile: one column per KPI tile on the grid (Revenue, ECL, the cost lines…), the same names and the same netting, and one row per region under its business, a Global subtotal per business and the Group at the foot.</w:t>
+        <w:t xml:space="preserve"> section — the consolidation shown as evidence: a rollup tree on the result line (countries under their region, regions under their Global business, the Group at the foot) where every block casts exactly as displayed — the rounding point lands on the largest row, and the Group line reads exactly what its tile reads. A lone country that would just rename its region is skipped; rows no business mapping claims appear as an Unallocated line so the tree always adds up.</w:t>
       </w:r>
     </w:p>
     <w:p>
@@ -970,7 +970,27 @@
         <w:spacing w:after="140"/>
       </w:pPr>
       <w:r>
-        <w:t xml:space="preserve">In every column the regions visibly add to their Global line and the Global lines to the Group; a line a group defines no reading for (a per-business Definition it never wrote) shows a dash rather than a borrowed figure; rows no business mapping claims appear as an Unallocated line so the table always adds up. Balance-sheet tiles keep their own column in the balance unit as closing positions — never added into a P&amp;L column. The table reads the whole tree whatever geography is scoped elsewhere, and hides on a single-business file.</w:t>
+        <w:t xml:space="preserve">Its </w:t>
+      </w:r>
+      <w:r>
+        <w:rPr>
+          <w:b/>
+          <w:bCs/>
+        </w:rPr>
+        <w:t xml:space="preserve">Export to Excel</w:t>
+      </w:r>
+      <w:r>
+        <w:t xml:space="preserve"> writes the full table: one column per KPI tile on the grid (Revenue, ECL, the cost lines…, the same names and the same netting), one row per business / region / country. A line a group defines no reading for (a per-business Definition it never wrote) is blank rather than borrowing a figure; a line that sits wholly inside another (Banking NII inside Revenue) is headed </w:t>
+      </w:r>
+      <w:r>
+        <w:rPr>
+          <w:rFonts w:ascii="Consolas" w:cs="Consolas" w:eastAsia="Consolas" w:hAnsi="Consolas"/>
+          <w:shd w:fill="F2F1ED" w:val="clear"/>
+        </w:rPr>
+        <w:t xml:space="preserve">within Revenue</w:t>
+      </w:r>
+      <w:r>
+        <w:t xml:space="preserve"> so nobody adds the two; balance-sheet tiles keep their own column in the balance unit as closing positions — never added into a P&amp;L column. The section reads the whole tree whatever geography is scoped elsewhere, and hides on a single-business file.</w:t>
       </w:r>
     </w:p>
     <w:p>

</xml_diff>

<commit_message>
Business performance is a page of its own, off the left-hand nav
The link sits beside the Financial Summary and opens the full evidence
table in the main area: every tile as a column, rows down to country,
every column casting exactly, the Excel export on the page head. The
link only appears on a file carrying more than one business group; the
pane tree it replaces is gone.

Co-Authored-By: Claude Fable 5 <noreply@anthropic.com>
Claude-Session: https://claude.ai/code/session_01P4DDZgm6WRNJpLjFRThM8B
</commit_message>
<xml_diff>
--- a/iwpb-sg-dashboard/IWPB_SG_Dashboard_README.docx
+++ b/iwpb-sg-dashboard/IWPB_SG_Dashboard_README.docx
@@ -952,9 +952,6 @@
         <w:spacing w:after="140"/>
       </w:pPr>
       <w:r>
-        <w:t xml:space="preserve">The left pane carries a </w:t>
-      </w:r>
-      <w:r>
         <w:rPr>
           <w:b/>
           <w:bCs/>
@@ -962,7 +959,17 @@
         <w:t xml:space="preserve">Business performance</w:t>
       </w:r>
       <w:r>
-        <w:t xml:space="preserve"> section — the consolidation shown as evidence: a rollup tree on the result line (countries under their region, regions under their Global business, the Group at the foot) where every block casts exactly as displayed — the rounding point lands on the largest row, and the Group line reads exactly what its tile reads. A lone country that would just rename its region is skipped; rows no business mapping claims appear as an Unallocated line so the tree always adds up.</w:t>
+        <w:t xml:space="preserve"> is its own page off the left-hand nav, beside the Financial Summary — the consolidation shown as evidence: one column per KPI tile on the grid (Revenue, ECL, the cost lines…, the same names and the same netting), one row per business / region / country with a Global subtotal per business and the Group at the foot. Every column casts exactly as displayed — the rounding point lands on the largest row of each block, and the Group line reads exactly what its tile reads. A lone country that would just rename its region is skipped; rows no business mapping claims appear as an Unallocated line so the table always adds up. A line a group defines no reading for (a per-business Definition it never wrote) shows a dash rather than borrowing a figure; a line that sits wholly inside another (Banking NII inside Revenue) is headed </w:t>
+      </w:r>
+      <w:r>
+        <w:rPr>
+          <w:rFonts w:ascii="Consolas" w:cs="Consolas" w:eastAsia="Consolas" w:hAnsi="Consolas"/>
+          <w:shd w:fill="F2F1ED" w:val="clear"/>
+        </w:rPr>
+        <w:t xml:space="preserve">within Revenue</w:t>
+      </w:r>
+      <w:r>
+        <w:t xml:space="preserve"> so nobody adds the two; balance-sheet tiles keep their own column in the balance unit as closing positions — never added into a P&amp;L column.</w:t>
       </w:r>
     </w:p>
     <w:p>
@@ -970,9 +977,6 @@
         <w:spacing w:after="140"/>
       </w:pPr>
       <w:r>
-        <w:t xml:space="preserve">Its </w:t>
-      </w:r>
-      <w:r>
         <w:rPr>
           <w:b/>
           <w:bCs/>
@@ -980,17 +984,7 @@
         <w:t xml:space="preserve">Export to Excel</w:t>
       </w:r>
       <w:r>
-        <w:t xml:space="preserve"> writes the full table: one column per KPI tile on the grid (Revenue, ECL, the cost lines…, the same names and the same netting), one row per business / region / country. A line a group defines no reading for (a per-business Definition it never wrote) is blank rather than borrowing a figure; a line that sits wholly inside another (Banking NII inside Revenue) is headed </w:t>
-      </w:r>
-      <w:r>
-        <w:rPr>
-          <w:rFonts w:ascii="Consolas" w:cs="Consolas" w:eastAsia="Consolas" w:hAnsi="Consolas"/>
-          <w:shd w:fill="F2F1ED" w:val="clear"/>
-        </w:rPr>
-        <w:t xml:space="preserve">within Revenue</w:t>
-      </w:r>
-      <w:r>
-        <w:t xml:space="preserve"> so nobody adds the two; balance-sheet tiles keep their own column in the balance unit as closing positions — never added into a P&amp;L column. The section reads the whole tree whatever geography is scoped elsewhere, and hides on a single-business file.</w:t>
+        <w:t xml:space="preserve"> writes the same table as a workbook. The page reads the whole tree whatever geography is scoped elsewhere, and the nav link only appears on a file that carries more than one business group.</w:t>
       </w:r>
     </w:p>
     <w:p>

</xml_diff>

<commit_message>
Rows the hierarchy never mapped surface as their own (no region) tier
The field case behind 'CIB Egypt differs between the tiles and the
page': country rows split between a mapped region and rows with no
region mapping. The scope bar reads only the mapped slice; the page
was silently merging both into one country line. A business with one
named region beside unmapped rows now earns the region tier, with the
unmapped rows and their countries under (no region), so the split is
visible and casts to the Global line. Memo notes stop naming the
result line — 'within PBT' on every column said nothing.

Co-Authored-By: Claude Fable 5 <noreply@anthropic.com>
Claude-Session: https://claude.ai/code/session_01P4DDZgm6WRNJpLjFRThM8B
</commit_message>
<xml_diff>
--- a/iwpb-sg-dashboard/IWPB_SG_Dashboard_README.docx
+++ b/iwpb-sg-dashboard/IWPB_SG_Dashboard_README.docx
@@ -959,7 +959,25 @@
         <w:t xml:space="preserve">Business performance</w:t>
       </w:r>
       <w:r>
-        <w:t xml:space="preserve"> is its own page off the left-hand nav, beside the Financial Summary — the consolidation shown as evidence: one column per KPI tile on the grid (Revenue, ECL, the cost lines…, the same names and the same netting), one row per business / region / country with a Global subtotal per business and the Group at the foot. Every column casts exactly as displayed — the rounding point lands on the largest row of each block, and the Group line reads exactly what its tile reads. A lone country that would just rename its region is skipped; rows no business mapping claims appear as an Unallocated line so the table always adds up. A line a group defines no reading for (a per-business Definition it never wrote) shows a dash rather than borrowing a figure; a line that sits wholly inside another (Banking NII inside Revenue) is headed </w:t>
+        <w:t xml:space="preserve"> is its own page off the left-hand nav, beside the Financial Summary — the consolidation shown as evidence: one column per KPI tile on the grid (Revenue, ECL, the cost lines…, the same names and the same netting), one row per business / region / country with a Global subtotal per business and the Group at the foot. Every column casts exactly as displayed — the rounding point lands on the largest row of each block, and the Group line reads exactly what its tile reads. A lone country that would just rename its region is skipped; rows no business mapping claims appear as an Unallocated line, and rows whose region the hierarchy never mapped appear under their own </w:t>
+      </w:r>
+      <w:r>
+        <w:rPr>
+          <w:rFonts w:ascii="Consolas" w:cs="Consolas" w:eastAsia="Consolas" w:hAnsi="Consolas"/>
+          <w:shd w:fill="F2F1ED" w:val="clear"/>
+        </w:rPr>
+        <w:t xml:space="preserve">(no region)</w:t>
+      </w:r>
+      <w:r>
+        <w:t xml:space="preserve"> tier beside the named regions — never silently merged into a country line — so the table always adds up and any gap against the scoped tiles is visible.</w:t>
+      </w:r>
+    </w:p>
+    <w:p>
+      <w:pPr>
+        <w:spacing w:after="140"/>
+      </w:pPr>
+      <w:r>
+        <w:t xml:space="preserve">Note the scope bar and this page read differently by design: the tiles obey the full geographic scope, while this page always shows the whole tree. A line a group defines no reading for (a per-business Definition it never wrote) shows a dash rather than borrowing a figure; a line that sits wholly inside another (Banking NII inside Revenue) is headed </w:t>
       </w:r>
       <w:r>
         <w:rPr>

</xml_diff>

<commit_message>
The rollup counts only rows the hierarchy maps
The business confirmed the mapped slice is what reconciles to the data
file, so the Business performance sums read it alone: the Global lines
and the Group carry the same figures the scope bar reaches. Unmapped
rows — no business, or no region under a regionally-mapped business —
stay on the table as grey memo lines that never join the sums, so a
mapping gap shows itself instead of inflating a Global line.
bizperf_unmapped=add restores the old adding behaviour.

Co-Authored-By: Claude Fable 5 <noreply@anthropic.com>
Claude-Session: https://claude.ai/code/session_01P4DDZgm6WRNJpLjFRThM8B
</commit_message>
<xml_diff>
--- a/iwpb-sg-dashboard/IWPB_SG_Dashboard_README.docx
+++ b/iwpb-sg-dashboard/IWPB_SG_Dashboard_README.docx
@@ -959,7 +959,32 @@
         <w:t xml:space="preserve">Business performance</w:t>
       </w:r>
       <w:r>
-        <w:t xml:space="preserve"> is its own page off the left-hand nav, beside the Financial Summary — the consolidation shown as evidence: one column per KPI tile on the grid (Revenue, ECL, the cost lines…, the same names and the same netting), one row per business / region / country with a Global subtotal per business and the Group at the foot. Every column casts exactly as displayed — the rounding point lands on the largest row of each block, and the Group line reads exactly what its tile reads. A lone country that would just rename its region is skipped; rows no business mapping claims appear as an Unallocated line, and rows whose region the hierarchy never mapped appear under their own </w:t>
+        <w:t xml:space="preserve"> is its own page off the left-hand nav, beside the Financial Summary — the consolidation shown as evidence: one column per KPI tile on the grid (Revenue, ECL, the cost lines…, the same names and the same netting), one row per business / region / country with a Global subtotal per business and the Group at the foot. Every column casts exactly as displayed — the rounding point lands on the largest row of each block, and the Group line reads exactly what its tile reads. A lone country that would just rename its region is skipped.</w:t>
+      </w:r>
+    </w:p>
+    <w:p>
+      <w:pPr>
+        <w:spacing w:after="140"/>
+      </w:pPr>
+      <w:r>
+        <w:rPr>
+          <w:b/>
+          <w:bCs/>
+        </w:rPr>
+        <w:t xml:space="preserve">The rollup counts only rows the hierarchy maps</w:t>
+      </w:r>
+      <w:r>
+        <w:t xml:space="preserve"> — the same rows the scope bar can reach, the numbers the file itself consolidates to. Rows without a business mapping (an </w:t>
+      </w:r>
+      <w:r>
+        <w:rPr>
+          <w:rFonts w:ascii="Consolas" w:cs="Consolas" w:eastAsia="Consolas" w:hAnsi="Consolas"/>
+          <w:shd w:fill="F2F1ED" w:val="clear"/>
+        </w:rPr>
+        <w:t xml:space="preserve">Unallocated</w:t>
+      </w:r>
+      <w:r>
+        <w:t xml:space="preserve"> line) and rows whose region the hierarchy never mapped (a </w:t>
       </w:r>
       <w:r>
         <w:rPr>
@@ -969,15 +994,17 @@
         <w:t xml:space="preserve">(no region)</w:t>
       </w:r>
       <w:r>
-        <w:t xml:space="preserve"> tier beside the named regions — never silently merged into a country line — so the table always adds up and any gap against the scoped tiles is visible.</w:t>
-      </w:r>
-    </w:p>
-    <w:p>
-      <w:pPr>
-        <w:spacing w:after="140"/>
-      </w:pPr>
-      <w:r>
-        <w:t xml:space="preserve">Note the scope bar and this page read differently by design: the tiles obey the full geographic scope, while this page always shows the whole tree. A line a group defines no reading for (a per-business Definition it never wrote) shows a dash rather than borrowing a figure; a line that sits wholly inside another (Banking NII inside Revenue) is headed </w:t>
+        <w:t xml:space="preserve"> tier beside the named regions) stay visible as grey memo lines that never join the sums, so a mapping gap shows itself instead of silently inflating a Global line; setting </w:t>
+      </w:r>
+      <w:r>
+        <w:rPr>
+          <w:rFonts w:ascii="Consolas" w:cs="Consolas" w:eastAsia="Consolas" w:hAnsi="Consolas"/>
+          <w:shd w:fill="F2F1ED" w:val="clear"/>
+        </w:rPr>
+        <w:t xml:space="preserve">bizperf_unmapped=add</w:t>
+      </w:r>
+      <w:r>
+        <w:t xml:space="preserve"> restores adding them. Note the scope bar and this page read differently by design: the tiles obey the full geographic scope, while this page always shows the whole tree. A line a group defines no reading for (a per-business Definition it never wrote) shows a dash rather than borrowing a figure; a line that sits wholly inside another (Banking NII inside Revenue) is headed </w:t>
       </w:r>
       <w:r>
         <w:rPr>

</xml_diff>

<commit_message>
The literal Unmapped region is unmapped too
The hierarchy merge stamps 'Unmapped' — not a blank — on rows from a
tab the CountryHierarchy cannot place, so the memo rule now treats an
empty region cell and that literal the same way: an (unmapped) tier,
shown in grey, never in the sums. The field check covers both forms.

Co-Authored-By: Claude Fable 5 <noreply@anthropic.com>
Claude-Session: https://claude.ai/code/session_01P4DDZgm6WRNJpLjFRThM8B
</commit_message>
<xml_diff>
--- a/iwpb-sg-dashboard/IWPB_SG_Dashboard_README.docx
+++ b/iwpb-sg-dashboard/IWPB_SG_Dashboard_README.docx
@@ -984,14 +984,24 @@
         <w:t xml:space="preserve">Unallocated</w:t>
       </w:r>
       <w:r>
-        <w:t xml:space="preserve"> line) and rows whose region the hierarchy never mapped (a </w:t>
-      </w:r>
-      <w:r>
-        <w:rPr>
-          <w:rFonts w:ascii="Consolas" w:cs="Consolas" w:eastAsia="Consolas" w:hAnsi="Consolas"/>
-          <w:shd w:fill="F2F1ED" w:val="clear"/>
-        </w:rPr>
-        <w:t xml:space="preserve">(no region)</w:t>
+        <w:t xml:space="preserve"> line) and rows whose region the hierarchy never mapped — an empty region cell or the literal </w:t>
+      </w:r>
+      <w:r>
+        <w:rPr>
+          <w:rFonts w:ascii="Consolas" w:cs="Consolas" w:eastAsia="Consolas" w:hAnsi="Consolas"/>
+          <w:shd w:fill="F2F1ED" w:val="clear"/>
+        </w:rPr>
+        <w:t xml:space="preserve">Unmapped</w:t>
+      </w:r>
+      <w:r>
+        <w:t xml:space="preserve"> the merge stamps on a tab the CountryHierarchy cannot place (an </w:t>
+      </w:r>
+      <w:r>
+        <w:rPr>
+          <w:rFonts w:ascii="Consolas" w:cs="Consolas" w:eastAsia="Consolas" w:hAnsi="Consolas"/>
+          <w:shd w:fill="F2F1ED" w:val="clear"/>
+        </w:rPr>
+        <w:t xml:space="preserve">(unmapped)</w:t>
       </w:r>
       <w:r>
         <w:t xml:space="preserve"> tier beside the named regions) stay visible as grey memo lines that never join the sums, so a mapping gap shows itself instead of silently inflating a Global line; setting </w:t>

</xml_diff>

<commit_message>
The summary reads every cell through the tiles' own scope machinery
The tiles rolled up right while the Business performance page could
disagree, because the page selected rows with predicates of its own.
Now a cell is filteredRows() under that row's business/region/country
scope — the page and the tiles cannot diverge, whatever shape the file
takes. The Group line reads what the unscoped tiles read: the file's
own Group consolidation where present, with the gap against the
roll-up standing as an explicit Consolidation & eliminations line so
every column still casts in plain sight. A new fixture and check cover
the consolidation-gap case.

Co-Authored-By: Claude Fable 5 <noreply@anthropic.com>
Claude-Session: https://claude.ai/code/session_01P4DDZgm6WRNJpLjFRThM8B
</commit_message>
<xml_diff>
--- a/iwpb-sg-dashboard/IWPB_SG_Dashboard_README.docx
+++ b/iwpb-sg-dashboard/IWPB_SG_Dashboard_README.docx
@@ -971,10 +971,35 @@
           <w:b/>
           <w:bCs/>
         </w:rPr>
+        <w:t xml:space="preserve">Every cell reads through the same scope machinery the tiles read</w:t>
+      </w:r>
+      <w:r>
+        <w:t xml:space="preserve"> — a row's figure is exactly what the scope bar would show for that business / region / country, never a private row-selection of the page's own, so the page and the tiles cannot disagree. The Group line is what the unscoped tiles show: the file's own Group consolidation tab where it carries one, and any gap against the roll-up stands as an explicit </w:t>
+      </w:r>
+      <w:r>
+        <w:rPr>
+          <w:rFonts w:ascii="Consolas" w:cs="Consolas" w:eastAsia="Consolas" w:hAnsi="Consolas"/>
+          <w:shd w:fill="F2F1ED" w:val="clear"/>
+        </w:rPr>
+        <w:t xml:space="preserve">Consolidation &amp; eliminations</w:t>
+      </w:r>
+      <w:r>
+        <w:t xml:space="preserve"> line so the column still casts in plain sight.</w:t>
+      </w:r>
+    </w:p>
+    <w:p>
+      <w:pPr>
+        <w:spacing w:after="140"/>
+      </w:pPr>
+      <w:r>
+        <w:rPr>
+          <w:b/>
+          <w:bCs/>
+        </w:rPr>
         <w:t xml:space="preserve">The rollup counts only rows the hierarchy maps</w:t>
       </w:r>
       <w:r>
-        <w:t xml:space="preserve"> — the same rows the scope bar can reach, the numbers the file itself consolidates to. Rows without a business mapping (an </w:t>
+        <w:t xml:space="preserve"> — the same rows the scope bar can reach. Rows without a business mapping (an </w:t>
       </w:r>
       <w:r>
         <w:rPr>

</xml_diff>

<commit_message>
Add config-driven simulation scenarios with six pre-loaded Middle East cases
- New optional Scenarios sheet in the config pack (Scenario | Dim | Value |
  Dim2 | Value2 | Statement | Type | Change | From | To); rows sharing a
  name become one multi-rule scenario, seeded into the saved-scenario
  store on config load without overwriting user-saved names
- Simulation rules gain an optional second condition (line within a
  geography), shown on the rule row and honoured by the engine
- Group pack ships six Middle East crisis scenarios: Gulf rate cuts, EGP
  devaluation, deposit flight, Gulf inflows upside, trade disruption,
  oil-spike counter-case
- README + docx document the sheet

Co-Authored-By: Claude Fable 5 <noreply@anthropic.com>
Claude-Session: https://claude.ai/code/session_01P4DDZgm6WRNJpLjFRThM8B
</commit_message>
<xml_diff>
--- a/iwpb-sg-dashboard/IWPB_SG_Dashboard_README.docx
+++ b/iwpb-sg-dashboard/IWPB_SG_Dashboard_README.docx
@@ -7896,6 +7896,258 @@
     </w:p>
     <w:p>
       <w:pPr>
+        <w:spacing w:after="140"/>
+        <w:ind w:left="360"/>
+      </w:pPr>
+      <w:r>
+        <w:rPr>
+          <w:b/>
+          <w:bCs/>
+        </w:rPr>
+        <w:t xml:space="preserve">Pre-loaded scenarios from the config pack</w:t>
+      </w:r>
+      <w:r>
+        <w:t xml:space="preserve"> — an optional </w:t>
+      </w:r>
+      <w:r>
+        <w:rPr>
+          <w:rFonts w:ascii="Consolas" w:cs="Consolas" w:eastAsia="Consolas" w:hAnsi="Consolas"/>
+          <w:shd w:fill="F2F1ED" w:val="clear"/>
+        </w:rPr>
+        <w:t xml:space="preserve">Scenarios</w:t>
+      </w:r>
+      <w:r>
+        <w:t xml:space="preserve"> sheet in the configuration workbook ships ready-made scenarios to every user who opens the dashboard, instead of each living in one person's browser. Columns: </w:t>
+      </w:r>
+      <w:r>
+        <w:rPr>
+          <w:rFonts w:ascii="Consolas" w:cs="Consolas" w:eastAsia="Consolas" w:hAnsi="Consolas"/>
+          <w:shd w:fill="F2F1ED" w:val="clear"/>
+        </w:rPr>
+        <w:t xml:space="preserve">Scenario | Dim | Value | Dim2 | Value2 | Statement | Type | Change | From | To</w:t>
+      </w:r>
+      <w:r>
+        <w:t xml:space="preserve">. Rows sharing a Scenario name become one multi-rule scenario. </w:t>
+      </w:r>
+      <w:r>
+        <w:rPr>
+          <w:rFonts w:ascii="Consolas" w:cs="Consolas" w:eastAsia="Consolas" w:hAnsi="Consolas"/>
+          <w:shd w:fill="F2F1ED" w:val="clear"/>
+        </w:rPr>
+        <w:t xml:space="preserve">Dim</w:t>
+      </w:r>
+      <w:r>
+        <w:t xml:space="preserve">/</w:t>
+      </w:r>
+      <w:r>
+        <w:rPr>
+          <w:rFonts w:ascii="Consolas" w:cs="Consolas" w:eastAsia="Consolas" w:hAnsi="Consolas"/>
+          <w:shd w:fill="F2F1ED" w:val="clear"/>
+        </w:rPr>
+        <w:t xml:space="preserve">Value</w:t>
+      </w:r>
+      <w:r>
+        <w:t xml:space="preserve"> is the main scope (e.g. </w:t>
+      </w:r>
+      <w:r>
+        <w:rPr>
+          <w:rFonts w:ascii="Consolas" w:cs="Consolas" w:eastAsia="Consolas" w:hAnsi="Consolas"/>
+          <w:shd w:fill="F2F1ED" w:val="clear"/>
+        </w:rPr>
+        <w:t xml:space="preserve">MICA Level 3</w:t>
+      </w:r>
+      <w:r>
+        <w:t xml:space="preserve"> = </w:t>
+      </w:r>
+      <w:r>
+        <w:rPr>
+          <w:rFonts w:ascii="Consolas" w:cs="Consolas" w:eastAsia="Consolas" w:hAnsi="Consolas"/>
+          <w:shd w:fill="F2F1ED" w:val="clear"/>
+        </w:rPr>
+        <w:t xml:space="preserve">NII - Net Interest Income</w:t>
+      </w:r>
+      <w:r>
+        <w:t xml:space="preserve">); </w:t>
+      </w:r>
+      <w:r>
+        <w:rPr>
+          <w:rFonts w:ascii="Consolas" w:cs="Consolas" w:eastAsia="Consolas" w:hAnsi="Consolas"/>
+          <w:shd w:fill="F2F1ED" w:val="clear"/>
+        </w:rPr>
+        <w:t xml:space="preserve">Dim2</w:t>
+      </w:r>
+      <w:r>
+        <w:t xml:space="preserve">/</w:t>
+      </w:r>
+      <w:r>
+        <w:rPr>
+          <w:rFonts w:ascii="Consolas" w:cs="Consolas" w:eastAsia="Consolas" w:hAnsi="Consolas"/>
+          <w:shd w:fill="F2F1ED" w:val="clear"/>
+        </w:rPr>
+        <w:t xml:space="preserve">Value2</w:t>
+      </w:r>
+      <w:r>
+        <w:t xml:space="preserve"> is an optional second condition — a line </w:t>
+      </w:r>
+      <w:r>
+        <w:rPr>
+          <w:i/>
+          <w:iCs/>
+        </w:rPr>
+        <w:t xml:space="preserve">within</w:t>
+      </w:r>
+      <w:r>
+        <w:t xml:space="preserve"> a geography — shown on the rule as "· within Region = MENAT" (dims accepted: Country, Region, Business, MICA Level 1–4, Product Level 1–3).</w:t>
+      </w:r>
+    </w:p>
+    <w:p>
+      <w:pPr>
+        <w:spacing w:after="140"/>
+        <w:ind w:left="360"/>
+      </w:pPr>
+      <w:r>
+        <w:rPr>
+          <w:rFonts w:ascii="Consolas" w:cs="Consolas" w:eastAsia="Consolas" w:hAnsi="Consolas"/>
+          <w:shd w:fill="F2F1ED" w:val="clear"/>
+        </w:rPr>
+        <w:t xml:space="preserve">Statement</w:t>
+      </w:r>
+      <w:r>
+        <w:t xml:space="preserve"> is </w:t>
+      </w:r>
+      <w:r>
+        <w:rPr>
+          <w:rFonts w:ascii="Consolas" w:cs="Consolas" w:eastAsia="Consolas" w:hAnsi="Consolas"/>
+          <w:shd w:fill="F2F1ED" w:val="clear"/>
+        </w:rPr>
+        <w:t xml:space="preserve">pl</w:t>
+      </w:r>
+      <w:r>
+        <w:t xml:space="preserve">, </w:t>
+      </w:r>
+      <w:r>
+        <w:rPr>
+          <w:rFonts w:ascii="Consolas" w:cs="Consolas" w:eastAsia="Consolas" w:hAnsi="Consolas"/>
+          <w:shd w:fill="F2F1ED" w:val="clear"/>
+        </w:rPr>
+        <w:t xml:space="preserve">bs</w:t>
+      </w:r>
+      <w:r>
+        <w:t xml:space="preserve"> or </w:t>
+      </w:r>
+      <w:r>
+        <w:rPr>
+          <w:rFonts w:ascii="Consolas" w:cs="Consolas" w:eastAsia="Consolas" w:hAnsi="Consolas"/>
+          <w:shd w:fill="F2F1ED" w:val="clear"/>
+        </w:rPr>
+        <w:t xml:space="preserve">all</w:t>
+      </w:r>
+      <w:r>
+        <w:t xml:space="preserve">; </w:t>
+      </w:r>
+      <w:r>
+        <w:rPr>
+          <w:rFonts w:ascii="Consolas" w:cs="Consolas" w:eastAsia="Consolas" w:hAnsi="Consolas"/>
+          <w:shd w:fill="F2F1ED" w:val="clear"/>
+        </w:rPr>
+        <w:t xml:space="preserve">Type</w:t>
+      </w:r>
+      <w:r>
+        <w:t xml:space="preserve"> is </w:t>
+      </w:r>
+      <w:r>
+        <w:rPr>
+          <w:rFonts w:ascii="Consolas" w:cs="Consolas" w:eastAsia="Consolas" w:hAnsi="Consolas"/>
+          <w:shd w:fill="F2F1ED" w:val="clear"/>
+        </w:rPr>
+        <w:t xml:space="preserve">pct</w:t>
+      </w:r>
+      <w:r>
+        <w:t xml:space="preserve"> (% change), </w:t>
+      </w:r>
+      <w:r>
+        <w:rPr>
+          <w:rFonts w:ascii="Consolas" w:cs="Consolas" w:eastAsia="Consolas" w:hAnsi="Consolas"/>
+          <w:shd w:fill="F2F1ED" w:val="clear"/>
+        </w:rPr>
+        <w:t xml:space="preserve">pctfy</w:t>
+      </w:r>
+      <w:r>
+        <w:t xml:space="preserve"> (% of full year), </w:t>
+      </w:r>
+      <w:r>
+        <w:rPr>
+          <w:rFonts w:ascii="Consolas" w:cs="Consolas" w:eastAsia="Consolas" w:hAnsi="Consolas"/>
+          <w:shd w:fill="F2F1ED" w:val="clear"/>
+        </w:rPr>
+        <w:t xml:space="preserve">amt</w:t>
+      </w:r>
+      <w:r>
+        <w:t xml:space="preserve"> (add amount) or </w:t>
+      </w:r>
+      <w:r>
+        <w:rPr>
+          <w:rFonts w:ascii="Consolas" w:cs="Consolas" w:eastAsia="Consolas" w:hAnsi="Consolas"/>
+          <w:shd w:fill="F2F1ED" w:val="clear"/>
+        </w:rPr>
+        <w:t xml:space="preserve">setm</w:t>
+      </w:r>
+      <w:r>
+        <w:t xml:space="preserve"> (set monthly total); </w:t>
+      </w:r>
+      <w:r>
+        <w:rPr>
+          <w:rFonts w:ascii="Consolas" w:cs="Consolas" w:eastAsia="Consolas" w:hAnsi="Consolas"/>
+          <w:shd w:fill="F2F1ED" w:val="clear"/>
+        </w:rPr>
+        <w:t xml:space="preserve">Change</w:t>
+      </w:r>
+      <w:r>
+        <w:t xml:space="preserve"> is the number; </w:t>
+      </w:r>
+      <w:r>
+        <w:rPr>
+          <w:rFonts w:ascii="Consolas" w:cs="Consolas" w:eastAsia="Consolas" w:hAnsi="Consolas"/>
+          <w:shd w:fill="F2F1ED" w:val="clear"/>
+        </w:rPr>
+        <w:t xml:space="preserve">From</w:t>
+      </w:r>
+      <w:r>
+        <w:t xml:space="preserve">/</w:t>
+      </w:r>
+      <w:r>
+        <w:rPr>
+          <w:rFonts w:ascii="Consolas" w:cs="Consolas" w:eastAsia="Consolas" w:hAnsi="Consolas"/>
+          <w:shd w:fill="F2F1ED" w:val="clear"/>
+        </w:rPr>
+        <w:t xml:space="preserve">To</w:t>
+      </w:r>
+      <w:r>
+        <w:t xml:space="preserve"> are month names (</w:t>
+      </w:r>
+      <w:r>
+        <w:rPr>
+          <w:rFonts w:ascii="Consolas" w:cs="Consolas" w:eastAsia="Consolas" w:hAnsi="Consolas"/>
+          <w:shd w:fill="F2F1ED" w:val="clear"/>
+        </w:rPr>
+        <w:t xml:space="preserve">AUG</w:t>
+      </w:r>
+      <w:r>
+        <w:t xml:space="preserve">…</w:t>
+      </w:r>
+      <w:r>
+        <w:rPr>
+          <w:rFonts w:ascii="Consolas" w:cs="Consolas" w:eastAsia="Consolas" w:hAnsi="Consolas"/>
+          <w:shd w:fill="F2F1ED" w:val="clear"/>
+        </w:rPr>
+        <w:t xml:space="preserve">DEC</w:t>
+      </w:r>
+      <w:r>
+        <w:t xml:space="preserve">). Seeding happens when the config loads and never overwrites a scenario the user already saved under the same name; a seeded rule whose scope matches nothing in the loaded driller shows the usual "no rows match" note rather than silently doing nothing. The Group pack ships six Middle East crisis scenarios built this way (Gulf rate cuts, EGP devaluation, deposit flight, Gulf inflows upside, trade disruption, and an oil-spike counter-case).</w:t>
+      </w:r>
+    </w:p>
+    <w:p>
+      <w:pPr>
         <w:pStyle w:val="ListParagraph"/>
         <w:numPr>
           <w:ilvl w:val="0"/>

</xml_diff>

<commit_message>
Add five macroeconomic scenarios to the config pack
Global rate cuts, China hard landing, US/Europe recession, markets-rally
upside and stagflation join the six Middle East cases in the Scenarios
sheet (27 rows, 11 scenarios).

Co-Authored-By: Claude Fable 5 <noreply@anthropic.com>
Claude-Session: https://claude.ai/code/session_01P4DDZgm6WRNJpLjFRThM8B
</commit_message>
<xml_diff>
--- a/iwpb-sg-dashboard/IWPB_SG_Dashboard_README.docx
+++ b/iwpb-sg-dashboard/IWPB_SG_Dashboard_README.docx
@@ -8143,7 +8143,16 @@
         <w:t xml:space="preserve">DEC</w:t>
       </w:r>
       <w:r>
-        <w:t xml:space="preserve">). Seeding happens when the config loads and never overwrites a scenario the user already saved under the same name; a seeded rule whose scope matches nothing in the loaded driller shows the usual "no rows match" note rather than silently doing nothing. The Group pack ships six Middle East crisis scenarios built this way (Gulf rate cuts, EGP devaluation, deposit flight, Gulf inflows upside, trade disruption, and an oil-spike counter-case).</w:t>
+        <w:t xml:space="preserve">). Seeding happens when the config loads and never overwrites a scenario the user already saved under the same name; a seeded rule whose scope matches nothing in the loaded driller shows the usual "no rows match" note rather than silently doing nothing.</w:t>
+      </w:r>
+    </w:p>
+    <w:p>
+      <w:pPr>
+        <w:spacing w:after="140"/>
+        <w:ind w:left="360"/>
+      </w:pPr>
+      <w:r>
+        <w:t xml:space="preserve">The Group pack ships eleven scenarios built this way: six Middle East crisis cases (Gulf rate cuts, EGP devaluation, deposit flight, Gulf inflows upside, trade disruption, and an oil-spike counter-case) and five broader macroeconomic cases (global rate cuts, China hard landing, US/Europe recession, a markets-rally upside, and stagflation).</w:t>
       </w:r>
     </w:p>
     <w:p>

</xml_diff>

<commit_message>
Rename scenarios to simulations, and add five cost simulations
- Every user-facing 'scenario' on the Simulation page becomes 'simulation':
  the name field, Save/Saved/Delete controls, the rules and compare panel
  headings, the alerts and the Excel export titles
- The config sheet is now called Simulations, with a Simulation first
  column; a pack still using the old Scenarios name and header is read
  the same way, so packs in circulation keep working
- Five cost simulations join the pack: pay review, variable pay true-up,
  savings programme, indirect cost inflation, and an offshoring footprint
  shift that lowers UK direct costs while raising Asia's (33 rows,
  16 simulations)
- README + docx updated

Co-Authored-By: Claude Fable 5 <noreply@anthropic.com>
Claude-Session: https://claude.ai/code/session_01P4DDZgm6WRNJpLjFRThM8B
</commit_message>
<xml_diff>
--- a/iwpb-sg-dashboard/IWPB_SG_Dashboard_README.docx
+++ b/iwpb-sg-dashboard/IWPB_SG_Dashboard_README.docx
@@ -1542,7 +1542,7 @@
         <w:t xml:space="preserve">movUp</w:t>
       </w:r>
       <w:r>
-        <w:t xml:space="preserve">), which every one of those surfaces calls, so they cannot drift apart again; a chart category or a scenario line, which has rows but no KPI record, derives the same flags from its own rows.</w:t>
+        <w:t xml:space="preserve">), which every one of those surfaces calls, so they cannot drift apart again; a chart category or a simulation line, which has rows but no KPI record, derives the same flags from its own rows.</w:t>
       </w:r>
     </w:p>
     <w:p>
@@ -7862,7 +7862,7 @@
         <w:t xml:space="preserve">Simulation Assistant</w:t>
       </w:r>
       <w:r>
-        <w:t xml:space="preserve"> — what-if scenarios on the forecast months. Build any number of ordered rules, each scoped to any dimension value (or all rows) with three adjustment types: % change, add amount (spread over the chosen months, pro-rata across matching rows), or set the monthly total. Each rule also carries an </w:t>
+        <w:t xml:space="preserve"> — what-if simulations on the forecast months. Build any number of ordered rules, each scoped to any dimension value (or all rows) with three adjustment types: % change, add amount (spread over the chosen months, pro-rata across matching rows), or set the monthly total. Each rule also carries an </w:t>
       </w:r>
       <w:r>
         <w:rPr>
@@ -7881,7 +7881,7 @@
         <w:ind w:left="360"/>
       </w:pPr>
       <w:r>
-        <w:t xml:space="preserve">The prior forecast stays untouched; the page shows prior vs simulated FY outlook, the delta, both against the FY target, a monthly chart (actuals, prior forecast, simulated forecast) and an impact table listing only the lines the scenario actually moves, with Excel export. A scenario whose scope is entirely balance-sheet rows reports on the closing-balance basis in </w:t>
+        <w:t xml:space="preserve">The prior forecast stays untouched; the page shows prior vs simulated FY outlook, the delta, both against the FY target, a monthly chart (actuals, prior forecast, simulated forecast) and an impact table listing only the lines the simulation actually moves, with Excel export. A simulation whose scope is entirely balance-sheet rows reports on the closing-balance basis in </w:t>
       </w:r>
       <w:r>
         <w:rPr>
@@ -7891,7 +7891,7 @@
         <w:t xml:space="preserve">US$bn</w:t>
       </w:r>
       <w:r>
-        <w:t xml:space="preserve"> — the last forecast month's closing position, never a sum of monthly balances — and mixed scopes total the P&amp;L side only, with balances stated separately. Scenarios save by name (localStorage) for reload; the work-in-progress scenario survives refreshes.</w:t>
+        <w:t xml:space="preserve"> — the last forecast month's closing position, never a sum of monthly balances — and mixed scopes total the P&amp;L side only, with balances stated separately. Simulations save by name (localStorage) for reload; the work-in-progress simulation survives refreshes.</w:t>
       </w:r>
     </w:p>
     <w:p>
@@ -7904,7 +7904,7 @@
           <w:b/>
           <w:bCs/>
         </w:rPr>
-        <w:t xml:space="preserve">Pre-loaded scenarios from the config pack</w:t>
+        <w:t xml:space="preserve">Pre-loaded simulations from the config pack</w:t>
       </w:r>
       <w:r>
         <w:t xml:space="preserve"> — an optional </w:t>
@@ -7914,20 +7914,30 @@
           <w:rFonts w:ascii="Consolas" w:cs="Consolas" w:eastAsia="Consolas" w:hAnsi="Consolas"/>
           <w:shd w:fill="F2F1ED" w:val="clear"/>
         </w:rPr>
+        <w:t xml:space="preserve">Simulations</w:t>
+      </w:r>
+      <w:r>
+        <w:t xml:space="preserve"> sheet in the configuration workbook ships ready-made simulations to every user who opens the dashboard, instead of each living in one person's browser. Columns: </w:t>
+      </w:r>
+      <w:r>
+        <w:rPr>
+          <w:rFonts w:ascii="Consolas" w:cs="Consolas" w:eastAsia="Consolas" w:hAnsi="Consolas"/>
+          <w:shd w:fill="F2F1ED" w:val="clear"/>
+        </w:rPr>
+        <w:t xml:space="preserve">Simulation | Dim | Value | Dim2 | Value2 | Statement | Type | Change | From | To</w:t>
+      </w:r>
+      <w:r>
+        <w:t xml:space="preserve">. Rows sharing a Simulation name become one multi-rule simulation. (A sheet still named </w:t>
+      </w:r>
+      <w:r>
+        <w:rPr>
+          <w:rFonts w:ascii="Consolas" w:cs="Consolas" w:eastAsia="Consolas" w:hAnsi="Consolas"/>
+          <w:shd w:fill="F2F1ED" w:val="clear"/>
+        </w:rPr>
         <w:t xml:space="preserve">Scenarios</w:t>
       </w:r>
       <w:r>
-        <w:t xml:space="preserve"> sheet in the configuration workbook ships ready-made scenarios to every user who opens the dashboard, instead of each living in one person's browser. Columns: </w:t>
-      </w:r>
-      <w:r>
-        <w:rPr>
-          <w:rFonts w:ascii="Consolas" w:cs="Consolas" w:eastAsia="Consolas" w:hAnsi="Consolas"/>
-          <w:shd w:fill="F2F1ED" w:val="clear"/>
-        </w:rPr>
-        <w:t xml:space="preserve">Scenario | Dim | Value | Dim2 | Value2 | Statement | Type | Change | From | To</w:t>
-      </w:r>
-      <w:r>
-        <w:t xml:space="preserve">. Rows sharing a Scenario name become one multi-rule scenario. </w:t>
+        <w:t xml:space="preserve">, the tab's earlier name, is read exactly the same way, so packs already in circulation keep working.) </w:t>
       </w:r>
       <w:r>
         <w:rPr>
@@ -8143,7 +8153,7 @@
         <w:t xml:space="preserve">DEC</w:t>
       </w:r>
       <w:r>
-        <w:t xml:space="preserve">). Seeding happens when the config loads and never overwrites a scenario the user already saved under the same name; a seeded rule whose scope matches nothing in the loaded driller shows the usual "no rows match" note rather than silently doing nothing.</w:t>
+        <w:t xml:space="preserve">). Seeding happens when the config loads and never overwrites a simulation the user already saved under the same name; a seeded rule whose scope matches nothing in the loaded driller shows the usual "no rows match" note rather than silently doing nothing.</w:t>
       </w:r>
     </w:p>
     <w:p>
@@ -8152,7 +8162,7 @@
         <w:ind w:left="360"/>
       </w:pPr>
       <w:r>
-        <w:t xml:space="preserve">The Group pack ships eleven scenarios built this way: six Middle East crisis cases (Gulf rate cuts, EGP devaluation, deposit flight, Gulf inflows upside, trade disruption, and an oil-spike counter-case) and five broader macroeconomic cases (global rate cuts, China hard landing, US/Europe recession, a markets-rally upside, and stagflation).</w:t>
+        <w:t xml:space="preserve">The Group pack ships sixteen simulations built this way: six Middle East crisis cases (Gulf rate cuts, EGP devaluation, deposit flight, Gulf inflows upside, trade disruption, and an oil-spike counter-case), five macroeconomic cases (global rate cuts, China hard landing, US/Europe recession, a markets-rally upside, and stagflation), and five cost cases (pay review, variable pay true-up, savings programme, indirect cost inflation, and an offshoring footprint shift that lowers UK direct costs while raising Asia's).</w:t>
       </w:r>
     </w:p>
     <w:p>
@@ -9449,7 +9459,7 @@
         <w:t xml:space="preserve">Extra2</w:t>
       </w:r>
       <w:r>
-        <w:t xml:space="preserve"> = Y/N — every dimension defaults to Y, and the derived hierarchy levels are always offered, so a scenario can scope on any non-numeric field in the file; a blank cell inherits the default, an explicit N excludes).</w:t>
+        <w:t xml:space="preserve"> = Y/N — every dimension defaults to Y, and the derived hierarchy levels are always offered, so a simulation can scope on any non-numeric field in the file; a blank cell inherits the default, an explicit N excludes).</w:t>
       </w:r>
     </w:p>
     <w:p>

</xml_diff>

<commit_message>
Simulations carry a category, and the saved list files itself by it
- New Category column on the Simulations sheet; the five cost cases are
  filed as Cost, the macro five as Macroeconomic and the Middle East six
  as Geopolitical
- The Saved simulations dropdown and the compare picker group under those
  headings, with anything a person saved themselves last under
  My simulations; saving over a configured simulation keeps its category
- Column is appended, so a pack without it still loads
- README + docx updated

Co-Authored-By: Claude Fable 5 <noreply@anthropic.com>
Claude-Session: https://claude.ai/code/session_01P4DDZgm6WRNJpLjFRThM8B
</commit_message>
<xml_diff>
--- a/iwpb-sg-dashboard/IWPB_SG_Dashboard_README.docx
+++ b/iwpb-sg-dashboard/IWPB_SG_Dashboard_README.docx
@@ -7924,10 +7924,39 @@
           <w:rFonts w:ascii="Consolas" w:cs="Consolas" w:eastAsia="Consolas" w:hAnsi="Consolas"/>
           <w:shd w:fill="F2F1ED" w:val="clear"/>
         </w:rPr>
-        <w:t xml:space="preserve">Simulation | Dim | Value | Dim2 | Value2 | Statement | Type | Change | From | To</w:t>
-      </w:r>
-      <w:r>
-        <w:t xml:space="preserve">. Rows sharing a Simulation name become one multi-rule simulation. (A sheet still named </w:t>
+        <w:t xml:space="preserve">Simulation | Dim | Value | Dim2 | Value2 | Statement | Type | Change | From | To | Category</w:t>
+      </w:r>
+      <w:r>
+        <w:t xml:space="preserve">.</w:t>
+      </w:r>
+    </w:p>
+    <w:p>
+      <w:pPr>
+        <w:spacing w:after="140"/>
+        <w:ind w:left="360"/>
+      </w:pPr>
+      <w:r>
+        <w:t xml:space="preserve">Rows sharing a Simulation name become one multi-rule simulation, and </w:t>
+      </w:r>
+      <w:r>
+        <w:rPr>
+          <w:rFonts w:ascii="Consolas" w:cs="Consolas" w:eastAsia="Consolas" w:hAnsi="Consolas"/>
+          <w:shd w:fill="F2F1ED" w:val="clear"/>
+        </w:rPr>
+        <w:t xml:space="preserve">Category</w:t>
+      </w:r>
+      <w:r>
+        <w:t xml:space="preserve"> files it on the page — the Saved simulations list and the compare picker group under those headings (Cost, Macroeconomic, Geopolitical, or whatever the sheet says), with anything a person saved themselves last under </w:t>
+      </w:r>
+      <w:r>
+        <w:rPr>
+          <w:b/>
+          <w:bCs/>
+        </w:rPr>
+        <w:t xml:space="preserve">My simulations</w:t>
+      </w:r>
+      <w:r>
+        <w:t xml:space="preserve">. (A sheet still named </w:t>
       </w:r>
       <w:r>
         <w:rPr>
@@ -8162,7 +8191,7 @@
         <w:ind w:left="360"/>
       </w:pPr>
       <w:r>
-        <w:t xml:space="preserve">The Group pack ships sixteen simulations built this way: six Middle East crisis cases (Gulf rate cuts, EGP devaluation, deposit flight, Gulf inflows upside, trade disruption, and an oil-spike counter-case), five macroeconomic cases (global rate cuts, China hard landing, US/Europe recession, a markets-rally upside, and stagflation), and five cost cases (pay review, variable pay true-up, savings programme, indirect cost inflation, and an offshoring footprint shift that lowers UK direct costs while raising Asia's).</w:t>
+        <w:t xml:space="preserve">The Group pack ships sixteen simulations built this way: six Middle East crisis cases (Gulf rate cuts, EGP devaluation, deposit flight, Gulf inflows upside, trade disruption, and an oil-spike counter-case), five macroeconomic cases (global rate cuts, China hard landing, US/Europe recession, a markets-rally upside, and stagflation), and five cost cases (pay review, variable pay true-up, savings programme, indirect cost inflation, and an offshoring footprint shift that lowers UK direct costs while raising Asia's), filed on the sheet as Geopolitical, Macroeconomic and Cost respectively.</w:t>
       </w:r>
     </w:p>
     <w:p>

</xml_diff>

<commit_message>
The file being loaded is a TM1 extract, not a driller file
- Ingest page heading, drop zone, upload text and the left-pane button all
  read Ingest TM1 Extract; the heading and drop zone gain label keys
  (ingest_title, ingest_drop) so the wording stays config-driven
- Parse errors, the MI assistant's replies and the config templates name
  the TM1 extract too, so one vocabulary runs through the page
- Labels sheet updated in the Group, IWPB and CIB packs
- README + docx follow, leaving sample filenames and the product name
  untouched

Co-Authored-By: Claude Fable 5 <noreply@anthropic.com>
Claude-Session: https://claude.ai/code/session_01P4DDZgm6WRNJpLjFRThM8B
</commit_message>
<xml_diff>
--- a/iwpb-sg-dashboard/IWPB_SG_Dashboard_README.docx
+++ b/iwpb-sg-dashboard/IWPB_SG_Dashboard_README.docx
@@ -63,7 +63,7 @@
         <w:spacing w:after="140"/>
       </w:pPr>
       <w:r>
-        <w:t xml:space="preserve">A self-contained, single-file web app that ingests the IWPB Singapore driller extract and shows a </w:t>
+        <w:t xml:space="preserve">A self-contained, single-file web app that ingests the IWPB Singapore TM1 extract extract and shows a </w:t>
       </w:r>
       <w:r>
         <w:rPr>
@@ -133,7 +133,7 @@
         <w:spacing w:after="80"/>
       </w:pPr>
       <w:r>
-        <w:t xml:space="preserve">Drop the driller file (</w:t>
+        <w:t xml:space="preserve">Drop the TM1 extract (</w:t>
       </w:r>
       <w:r>
         <w:rPr>
@@ -315,7 +315,7 @@
           <w:b/>
           <w:bCs/>
         </w:rPr>
-        <w:t xml:space="preserve">any other column in the driller can be declared as a dimension</w:t>
+        <w:t xml:space="preserve">any other column in the TM1 extract can be declared as a dimension</w:t>
       </w:r>
       <w:r>
         <w:t xml:space="preserve"> through the config's Dimensions section (see below) and then behaves like the rest everywhere — filters, Financial Summary cascade, drag &amp; drop charts, dashboards, commentary.</w:t>
@@ -510,7 +510,7 @@
         <w:t xml:space="preserve">Multi-country workbooks</w:t>
       </w:r>
       <w:r>
-        <w:t xml:space="preserve"> — a regional driller can carry </w:t>
+        <w:t xml:space="preserve"> — a regional TM1 extract can carry </w:t>
       </w:r>
       <w:r>
         <w:rPr>
@@ -520,7 +520,7 @@
         <w:t xml:space="preserve">one country per tab</w:t>
       </w:r>
       <w:r>
-        <w:t xml:space="preserve">: every tab that parses as a driller becomes a country (named after its tab), while Control/Mapping/notes tabs are skipped as before. The countries merge into one model with a </w:t>
+        <w:t xml:space="preserve">: every tab that parses as a TM1 extract becomes a country (named after its tab), while Control/Mapping/notes tabs are skipped as before. The countries merge into one model with a </w:t>
       </w:r>
       <w:r>
         <w:rPr>
@@ -824,7 +824,7 @@
         <w:spacing w:after="140"/>
       </w:pPr>
       <w:r>
-        <w:t xml:space="preserve">The hierarchy never leaks the other way: an entry with no tab in the loaded file — a country or a whole region the CountryHierarchy knows but this month's driller does not carry — is not offered in any dropdown, strip row or picker. The hierarchy places what is loaded; it never invents entries.</w:t>
+        <w:t xml:space="preserve">The hierarchy never leaks the other way: an entry with no tab in the loaded file — a country or a whole region the CountryHierarchy knows but this month's TM1 extract does not carry — is not offered in any dropdown, strip row or picker. The hierarchy places what is loaded; it never invents entries.</w:t>
       </w:r>
     </w:p>
     <w:p>
@@ -1387,7 +1387,7 @@
         <w:t xml:space="preserve">KPI summary</w:t>
       </w:r>
       <w:r>
-        <w:t xml:space="preserve"> — driller-style financial-dashboard tiles: one per MICA Level 1 rollup (Revenue, Costs, ECL, …) plus a Total P&amp;L tile (files with a single Level 1 value fall back to Level 2 tiles), each with the KPI name and headline YTD value, then compact comparison rows (</w:t>
+        <w:t xml:space="preserve"> — financial-dashboard tiles: one per MICA Level 1 rollup (Revenue, Costs, ECL, …) plus a Total P&amp;L tile (files with a single Level 1 value fall back to Level 2 tiles), each with the KPI name and headline YTD value, then compact comparison rows (</w:t>
       </w:r>
       <w:r>
         <w:rPr>
@@ -1562,7 +1562,7 @@
         <w:t xml:space="preserve">The result line is opened up</w:t>
       </w:r>
       <w:r>
-        <w:t xml:space="preserve"> — on a driller whose only P&amp;L rollup is a single Level 1 line (a PBT beside Deposits and Loans), the tile grid would otherwise show that one result and the balance sheet, and nothing of what drove it. Its Level 2 lines lead the grid in statement order — revenue, the cost lines, the charge — with the result behind them and the balance-sheet lines last. Files with several P&amp;L rollups are unaffected. Switch it off with </w:t>
+        <w:t xml:space="preserve"> — on a TM1 extract whose only P&amp;L rollup is a single Level 1 line (a PBT beside Deposits and Loans), the tile grid would otherwise show that one result and the balance sheet, and nothing of what drove it. Its Level 2 lines lead the grid in statement order — revenue, the cost lines, the charge — with the result behind them and the balance-sheet lines last. Files with several P&amp;L rollups are unaffected. Switch it off with </w:t>
       </w:r>
       <w:r>
         <w:rPr>
@@ -2858,7 +2858,7 @@
         <w:ind w:left="360"/>
       </w:pPr>
       <w:r>
-        <w:t xml:space="preserve">A driller carrying Deposits or Loans beside a result gets no total tile, no total row and no total in its commentary, because adding a balance to a result is not a figure; a P&amp;L-only driller keeps its bottom line as before. </w:t>
+        <w:t xml:space="preserve">A TM1 extract carrying Deposits or Loans beside a result gets no total tile, no total row and no total in its commentary, because adding a balance to a result is not a figure; a P&amp;L-only TM1 extract keeps its bottom line as before. </w:t>
       </w:r>
       <w:r>
         <w:rPr>
@@ -2908,7 +2908,7 @@
         <w:t xml:space="preserve">fsum_sections</w:t>
       </w:r>
       <w:r>
-        <w:t xml:space="preserve"> also drops it. Lines the priority patterns do not recognise are ordered as they appear in the driller rather than by size, so a balance-sheet line is not hoisted above the P&amp;L. Lines </w:t>
+        <w:t xml:space="preserve"> also drops it. Lines the priority patterns do not recognise are ordered as they appear in the TM1 extract rather than by size, so a balance-sheet line is not hoisted above the P&amp;L. Lines </w:t>
       </w:r>
       <w:r>
         <w:rPr>
@@ -2918,7 +2918,7 @@
         <w:t xml:space="preserve">within</w:t>
       </w:r>
       <w:r>
-        <w:t xml:space="preserve"> a statement — the Level 2 lines under a rollup — always read in the driller's own sequence, so revenue sits with the cost lines in statement order rather than being reshuffled by whichever moved most; the "driven by" openers still name the biggest movers first.</w:t>
+        <w:t xml:space="preserve"> a statement — the Level 2 lines under a rollup — always read in the TM1 extract's own sequence, so revenue sits with the cost lines in statement order rather than being reshuffled by whichever moved most; the "driven by" openers still name the biggest movers first.</w:t>
       </w:r>
     </w:p>
     <w:p>
@@ -3106,7 +3106,7 @@
         <w:ind w:left="360"/>
       </w:pPr>
       <w:r>
-        <w:t xml:space="preserve">Excel and PowerPoint exports follow the selection (percentages and the raw driller-row export are never restated), and simulation amounts are typed in whatever unit is on screen. Configurable via </w:t>
+        <w:t xml:space="preserve">Excel and PowerPoint exports follow the selection (percentages and the raw source-row export are never restated), and simulation amounts are typed in whatever unit is on screen. Configurable via </w:t>
       </w:r>
       <w:r>
         <w:rPr>
@@ -3156,7 +3156,7 @@
         <w:t xml:space="preserve">Financial Summary</w:t>
       </w:r>
       <w:r>
-        <w:t xml:space="preserve"> — the management-reporting layout: three column bands over the P&amp;L cascade taken from the driller's own hierarchy. </w:t>
+        <w:t xml:space="preserve"> — the management-reporting layout: three column bands over the P&amp;L cascade taken from the TM1 extract's own hierarchy. </w:t>
       </w:r>
       <w:r>
         <w:rPr>
@@ -4689,7 +4689,7 @@
         <w:t xml:space="preserve">Expand all</w:t>
       </w:r>
       <w:r>
-        <w:t xml:space="preserve"> opens or closes every section, and the strip above says what the commentary was written from — month-end, basis, scope, the driller and how many written lines the file carries.</w:t>
+        <w:t xml:space="preserve"> opens or closes every section, and the strip above says what the commentary was written from — month-end, basis, scope, the TM1 extract and how many written lines the file carries.</w:t>
       </w:r>
     </w:p>
     <w:p>
@@ -4754,7 +4754,7 @@
         <w:t xml:space="preserve">Commentary</w:t>
       </w:r>
       <w:r>
-        <w:t xml:space="preserve"> rows in the single-sheet CSV. The driller stays figures only; nothing is loaded separately; the words live in the pack the business already owns. (A tab named </w:t>
+        <w:t xml:space="preserve"> rows in the single-sheet CSV. The TM1 extract stays figures only; nothing is loaded separately; the words live in the pack the business already owns. (A tab named </w:t>
       </w:r>
       <w:r>
         <w:rPr>
@@ -4764,7 +4764,7 @@
         <w:t xml:space="preserve">Commentary</w:t>
       </w:r>
       <w:r>
-        <w:t xml:space="preserve"> inside a driller is still never parsed as data — it is simply ignored.)</w:t>
+        <w:t xml:space="preserve"> inside a TM1 extract is still never parsed as data — it is simply ignored.)</w:t>
       </w:r>
     </w:p>
     <w:p>
@@ -4803,7 +4803,7 @@
         <w:t xml:space="preserve">Bare paragraphs are unstructured commentary</w:t>
       </w:r>
       <w:r>
-        <w:t xml:space="preserve">: each is matched against the names the driller itself carries (see below), so the pack's narrative pastes straight into a column with no tagging of any kind. A paragraph covering several lines is split so each sentence keeps its own; a paragraph naming nothing belongs to the view.</w:t>
+        <w:t xml:space="preserve">: each is matched against the names the TM1 extract itself carries (see below), so the pack's narrative pastes straight into a column with no tagging of any kind. A paragraph covering several lines is split so each sentence keeps its own; a paragraph naming nothing belongs to the view.</w:t>
       </w:r>
     </w:p>
     <w:p>
@@ -4819,7 +4819,7 @@
         <w:t xml:space="preserve">The words are kept, not the answers.</w:t>
       </w:r>
       <w:r>
-        <w:t xml:space="preserve"> The paragraphs are stored as written and matched afresh every time they are read — next month's driller re-matches the same paragraphs against next month's names with nobody tagging a thing, and the left pane's commentary note always says how many matched, how many were addressed by hand, and what the filters are holding back.</w:t>
+        <w:t xml:space="preserve"> The paragraphs are stored as written and matched afresh every time they are read — next month's TM1 extract re-matches the same paragraphs against next month's names with nobody tagging a thing, and the left pane's commentary note always says how many matched, how many were addressed by hand, and what the filters are holding back.</w:t>
       </w:r>
     </w:p>
     <w:p>
@@ -5606,7 +5606,7 @@
         <w:t xml:space="preserve">Style | View | Pattern</w:t>
       </w:r>
       <w:r>
-        <w:t xml:space="preserve">). A pattern is a sentence with tokens the page fills per statement line from the driller's own figures under the selected variance period —</w:t>
+        <w:t xml:space="preserve">). A pattern is a sentence with tokens the page fills per statement line from the TM1 extract's own figures under the selected variance period —</w:t>
       </w:r>
     </w:p>
     <w:p>
@@ -7252,7 +7252,7 @@
         <w:t xml:space="preserve">Keeping statements apart</w:t>
       </w:r>
       <w:r>
-        <w:t xml:space="preserve"> — a driller carrying both a P&amp;L and balance sheet must not add them together. </w:t>
+        <w:t xml:space="preserve"> — a TM1 extract carrying both a P&amp;L and balance sheet must not add them together. </w:t>
       </w:r>
       <w:r>
         <w:rPr>
@@ -7778,7 +7778,7 @@
         <w:t xml:space="preserve">plain language</w:t>
       </w:r>
       <w:r>
-        <w:t xml:space="preserve">: type the question in your own words and a comprehension layer works out the intent (how are we doing, why did it move, what is behind, break it down by X, monthly trend, costs, ECL, target) together with anything the question names — a line, product, business line, region or country. Names are matched against the values actually in the loaded file, longest first, with the Global Business dimensions (business line, region, country) winning over the same text in an ordinary driller column — so "iwpb" reads as the business line, not the CG Level 1 code. Case does not matter except for codes that are also ordinary words (</w:t>
+        <w:t xml:space="preserve">: type the question in your own words and a comprehension layer works out the intent (how are we doing, why did it move, what is behind, break it down by X, monthly trend, costs, ECL, target) together with anything the question names — a line, product, business line, region or country. Names are matched against the values actually in the loaded file, longest first, with the Global Business dimensions (business line, region, country) winning over the same text in an ordinary TM1 extract column — so "iwpb" reads as the business line, not the CG Level 1 code. Case does not matter except for codes that are also ordinary words (</w:t>
       </w:r>
       <w:r>
         <w:rPr>
@@ -8182,7 +8182,7 @@
         <w:t xml:space="preserve">DEC</w:t>
       </w:r>
       <w:r>
-        <w:t xml:space="preserve">). Seeding happens when the config loads and never overwrites a simulation the user already saved under the same name; a seeded rule whose scope matches nothing in the loaded driller shows the usual "no rows match" note rather than silently doing nothing.</w:t>
+        <w:t xml:space="preserve">). Seeding happens when the config loads and never overwrites a simulation the user already saved under the same name; a seeded rule whose scope matches nothing in the loaded TM1 extract shows the usual "no rows match" note rather than silently doing nothing.</w:t>
       </w:r>
     </w:p>
     <w:p>
@@ -9018,7 +9018,7 @@
         <w:t xml:space="preserve">Match</w:t>
       </w:r>
       <w:r>
-        <w:t xml:space="preserve"> lists the driller line names that roll into the deepest level. Uploaded rows replace the defaults wholesale.</w:t>
+        <w:t xml:space="preserve"> lists the TM1 extract line names that roll into the deepest level. Uploaded rows replace the defaults wholesale.</w:t>
       </w:r>
     </w:p>
     <w:p>
@@ -9527,7 +9527,7 @@
         <w:t xml:space="preserve">Extra3</w:t>
       </w:r>
       <w:r>
-        <w:t xml:space="preserve"> holds the text to match against the driller's column headers (falling back to the label, then the key — matching ignores case, spaces and underscores). E.g. </w:t>
+        <w:t xml:space="preserve"> holds the text to match against the TM1 extract's column headers (falling back to the label, then the key — matching ignores case, spaces and underscores). E.g. </w:t>
       </w:r>
       <w:r>
         <w:rPr>
@@ -9596,7 +9596,7 @@
         <w:ind w:left="360"/>
       </w:pPr>
       <w:r>
-        <w:t xml:space="preserve">Revenue foots as Banking NII + Fees and Other Income, Operating Expenses as its four cost lines, and PBT as Revenue + ECLs + Operating Expenses — the same arithmetic as the pack slide. The app binds them at load: each driller row's line names (matched against the columns in </w:t>
+        <w:t xml:space="preserve">Revenue foots as Banking NII + Fees and Other Income, Operating Expenses as its four cost lines, and PBT as Revenue + ECLs + Operating Expenses — the same arithmetic as the pack slide. The app binds them at load: each TM1 extract row's line names (matched against the columns in </w:t>
       </w:r>
       <w:r>
         <w:rPr>
@@ -9636,7 +9636,7 @@
         <w:t xml:space="preserve">Prod Hier L1–L5</w:t>
       </w:r>
       <w:r>
-        <w:t xml:space="preserve"> — usable in the drag &amp; drop chart builder, dynamic dashboard widgets, Financial Summary cascade, commentary Driven-by and Mix analysis exactly like a driller column.</w:t>
+        <w:t xml:space="preserve"> — usable in the drag &amp; drop chart builder, dynamic dashboard widgets, Financial Summary cascade, commentary Driven-by and Mix analysis exactly like a TM1 extract column.</w:t>
       </w:r>
     </w:p>
     <w:p>
@@ -9662,7 +9662,7 @@
           <w:b/>
           <w:bCs/>
         </w:rPr>
-        <w:t xml:space="preserve">stitches the node to the driller's MICA lines</w:t>
+        <w:t xml:space="preserve">stitches the node to the TM1 extract's MICA lines</w:t>
       </w:r>
       <w:r>
         <w:t xml:space="preserve">: a </w:t>
@@ -9874,7 +9874,7 @@
         <w:t xml:space="preserve">PB Wealth Balance</w:t>
       </w:r>
       <w:r>
-        <w:t xml:space="preserve">). Twelve ship by default: Revenue, Banking NII, Wealth Fees, PBT, Direct Cost ex VP CC GT, ECL, Deposits, Loans and Advances, Retail &amp; Premier / PB Wealth Balances, NNM and FY ROTE (the last needs a ROTE line in the driller). A metric a file cannot serve simply doesn't appear.</w:t>
+        <w:t xml:space="preserve">). Twelve ship by default: Revenue, Banking NII, Wealth Fees, PBT, Direct Cost ex VP CC GT, ECL, Deposits, Loans and Advances, Retail &amp; Premier / PB Wealth Balances, NNM and FY ROTE (the last needs a ROTE line in the TM1 extract). A metric a file cannot serve simply doesn't appear.</w:t>
       </w:r>
     </w:p>
     <w:p>
@@ -10224,7 +10224,7 @@
         <w:t xml:space="preserve">sample/IWPB_SG_Jun26_SixBasis_Commentary.docx</w:t>
       </w:r>
       <w:r>
-        <w:t xml:space="preserve"> is what the ⤓ Word download produces from that driller and pack together — a worked example of the six bases as a document.</w:t>
+        <w:t xml:space="preserve"> is what the ⤓ Word download produces from that TM1 extract and pack together — a worked example of the six bases as a document.</w:t>
       </w:r>
     </w:p>
     <w:p>
@@ -10246,7 +10246,7 @@
         <w:spacing w:after="140"/>
       </w:pPr>
       <w:r>
-        <w:t xml:space="preserve">Two config workbooks in the repo root carry a real pack's structure end to end, each with a driller in </w:t>
+        <w:t xml:space="preserve">Two config workbooks in the repo root carry a real pack's structure end to end, each with a TM1 extract in </w:t>
       </w:r>
       <w:r>
         <w:rPr>
@@ -10442,7 +10442,7 @@
         <w:t xml:space="preserve">Match</w:t>
       </w:r>
       <w:r>
-        <w:t xml:space="preserve"> column in AccountHierarchy is an exact list of the names a driller uses for that line, separated by </w:t>
+        <w:t xml:space="preserve"> column in AccountHierarchy is an exact list of the names a TM1 extract uses for that line, separated by </w:t>
       </w:r>
       <w:r>
         <w:rPr>

</xml_diff>

<commit_message>
Tile size comes from the configuration
tile_height sets the height every tile shares and tile_min_width sets the
narrowest a tile may become before the grid drops a column, so a pack can
make the summary roomier or fit more tiles per row without touching the
page. Both are registered settings, so they reach the downloadable
template, and unusable values fall back rather than breaking the grid.

Also fixes a doubled word the TM1 rename left in the README opening.

Co-Authored-By: Claude Fable 5 <noreply@anthropic.com>
Claude-Session: https://claude.ai/code/session_01P4DDZgm6WRNJpLjFRThM8B
</commit_message>
<xml_diff>
--- a/iwpb-sg-dashboard/IWPB_SG_Dashboard_README.docx
+++ b/iwpb-sg-dashboard/IWPB_SG_Dashboard_README.docx
@@ -63,7 +63,7 @@
         <w:spacing w:after="140"/>
       </w:pPr>
       <w:r>
-        <w:t xml:space="preserve">A self-contained, single-file web app that ingests the IWPB Singapore TM1 extract extract and shows a </w:t>
+        <w:t xml:space="preserve">A self-contained, single-file web app that ingests the IWPB Singapore TM1 extract and shows a </w:t>
       </w:r>
       <w:r>
         <w:rPr>
@@ -8933,6 +8933,92 @@
     </w:p>
     <w:p>
       <w:pPr>
+        <w:spacing w:after="140"/>
+        <w:ind w:left="360"/>
+      </w:pPr>
+      <w:r>
+        <w:rPr>
+          <w:b/>
+          <w:bCs/>
+        </w:rPr>
+        <w:t xml:space="preserve">Tile size</w:t>
+      </w:r>
+      <w:r>
+        <w:t xml:space="preserve"> is configurable too: </w:t>
+      </w:r>
+      <w:r>
+        <w:rPr>
+          <w:rFonts w:ascii="Consolas" w:cs="Consolas" w:eastAsia="Consolas" w:hAnsi="Consolas"/>
+          <w:shd w:fill="F2F1ED" w:val="clear"/>
+        </w:rPr>
+        <w:t xml:space="preserve">tile_height</w:t>
+      </w:r>
+      <w:r>
+        <w:t xml:space="preserve"> (default </w:t>
+      </w:r>
+      <w:r>
+        <w:rPr>
+          <w:rFonts w:ascii="Consolas" w:cs="Consolas" w:eastAsia="Consolas" w:hAnsi="Consolas"/>
+          <w:shd w:fill="F2F1ED" w:val="clear"/>
+        </w:rPr>
+        <w:t xml:space="preserve">124</w:t>
+      </w:r>
+      <w:r>
+        <w:t xml:space="preserve">) is the height in pixels every tile shares, and </w:t>
+      </w:r>
+      <w:r>
+        <w:rPr>
+          <w:rFonts w:ascii="Consolas" w:cs="Consolas" w:eastAsia="Consolas" w:hAnsi="Consolas"/>
+          <w:shd w:fill="F2F1ED" w:val="clear"/>
+        </w:rPr>
+        <w:t xml:space="preserve">tile_min_width</w:t>
+      </w:r>
+      <w:r>
+        <w:t xml:space="preserve"> (default </w:t>
+      </w:r>
+      <w:r>
+        <w:rPr>
+          <w:rFonts w:ascii="Consolas" w:cs="Consolas" w:eastAsia="Consolas" w:hAnsi="Consolas"/>
+          <w:shd w:fill="F2F1ED" w:val="clear"/>
+        </w:rPr>
+        <w:t xml:space="preserve">236</w:t>
+      </w:r>
+      <w:r>
+        <w:t xml:space="preserve">) is the narrowest a tile may become before the grid drops a column — so it governs how many tiles sit in a row, and therefore how many rows the summary needs. Raise </w:t>
+      </w:r>
+      <w:r>
+        <w:rPr>
+          <w:rFonts w:ascii="Consolas" w:cs="Consolas" w:eastAsia="Consolas" w:hAnsi="Consolas"/>
+          <w:shd w:fill="F2F1ED" w:val="clear"/>
+        </w:rPr>
+        <w:t xml:space="preserve">tile_height</w:t>
+      </w:r>
+      <w:r>
+        <w:t xml:space="preserve"> for a roomier grid; raise </w:t>
+      </w:r>
+      <w:r>
+        <w:rPr>
+          <w:rFonts w:ascii="Consolas" w:cs="Consolas" w:eastAsia="Consolas" w:hAnsi="Consolas"/>
+          <w:shd w:fill="F2F1ED" w:val="clear"/>
+        </w:rPr>
+        <w:t xml:space="preserve">tile_min_width</w:t>
+      </w:r>
+      <w:r>
+        <w:t xml:space="preserve"> for fewer, wider tiles. </w:t>
+      </w:r>
+      <w:r>
+        <w:rPr>
+          <w:rFonts w:ascii="Consolas" w:cs="Consolas" w:eastAsia="Consolas" w:hAnsi="Consolas"/>
+          <w:shd w:fill="F2F1ED" w:val="clear"/>
+        </w:rPr>
+        <w:t xml:space="preserve">tile_height</w:t>
+      </w:r>
+      <w:r>
+        <w:t xml:space="preserve"> is a floor rather than a cap: a tile whose content needs more room still grows, so setting it very low simply lets the tiles find their natural height. Values that are not numbers, or below the workable minimums (60px high, 150px wide), fall back to the defaults rather than breaking the grid.</w:t>
+      </w:r>
+    </w:p>
+    <w:p>
+      <w:pPr>
         <w:pStyle w:val="ListParagraph"/>
         <w:numPr>
           <w:ilvl w:val="0"/>

</xml_diff>

<commit_message>
The disclaimer stands under every generated commentary
It sat only under the All commentaries page. The Management commentary on
the KPI summary and the Financial Summary's own words now carry it too,
worded once from commentary_disclaimer so a pack's approved sentence
reaches every surface. On the summary it folds away with the commentary it
belongs to, and both Word exports carry it out with the words.

Co-Authored-By: Claude Fable 5 <noreply@anthropic.com>
Claude-Session: https://claude.ai/code/session_01P4DDZgm6WRNJpLjFRThM8B
</commit_message>
<xml_diff>
--- a/iwpb-sg-dashboard/IWPB_SG_Dashboard_README.docx
+++ b/iwpb-sg-dashboard/IWPB_SG_Dashboard_README.docx
@@ -4633,7 +4633,26 @@
         <w:t xml:space="preserve">"PBT (Reported) is $101m down on YTD vs target, $18m down on the month vs forecast and $307m down on the full year vs target."</w:t>
       </w:r>
       <w:r>
-        <w:t xml:space="preserve"> The standard disclaimer stands under the commentary once there is one to disclaim. Its wording is the config file's to own — a </w:t>
+        <w:t xml:space="preserve"> The standard disclaimer stands under the commentary once there is one to disclaim — under </w:t>
+      </w:r>
+      <w:r>
+        <w:rPr>
+          <w:b/>
+          <w:bCs/>
+        </w:rPr>
+        <w:t xml:space="preserve">every</w:t>
+      </w:r>
+      <w:r>
+        <w:t xml:space="preserve"> generated commentary, not just this page: the Management commentary on the KPI summary, the Financial Summary's own words and the All commentaries page each carry it, and on the summary it folds away with the commentary it belongs to.</w:t>
+      </w:r>
+    </w:p>
+    <w:p>
+      <w:pPr>
+        <w:spacing w:after="140"/>
+        <w:ind w:left="360"/>
+      </w:pPr>
+      <w:r>
+        <w:t xml:space="preserve">Its wording is the config file's to own — a </w:t>
       </w:r>
       <w:r>
         <w:rPr>
@@ -4653,7 +4672,7 @@
         <w:t xml:space="preserve">Settings</w:t>
       </w:r>
       <w:r>
-        <w:t xml:space="preserve"> sheet — so each business ships its approved words in its pack, the Word export carries the same words, and leaving the row out keeps the standard text. The CIB pack carries its own wording as a worked example.</w:t>
+        <w:t xml:space="preserve"> sheet — so each business ships its approved words in its pack, every surface and the Word exports carry the same words, and leaving the row out keeps the standard text. The CIB pack carries its own wording as a worked example.</w:t>
       </w:r>
     </w:p>
     <w:p>

</xml_diff>

<commit_message>
One type scale across every PowerPoint export
Sizes were chosen per slide, so the same element printed differently
depending on which deck and which layout branch it landed in: slide titles
at 16, 18 and 20, headings at 10.5 and 11.5, commentary at 9.5, 10 and 12.
They now come from a single PPT_FS scale.

The KPI tiles were the visible part: each tile sized its own text off its
own string length, so a short line printed larger than a long one beside
it. The three tile sizes are settled once across the whole grid.

The Financial Summary's dense table keeps fitting itself to its column
count — the one deliberate exception, and always smaller than the body.

Co-Authored-By: Claude Fable 5 <noreply@anthropic.com>
Claude-Session: https://claude.ai/code/session_01P4DDZgm6WRNJpLjFRThM8B
</commit_message>
<xml_diff>
--- a/iwpb-sg-dashboard/IWPB_SG_Dashboard_README.docx
+++ b/iwpb-sg-dashboard/IWPB_SG_Dashboard_README.docx
@@ -10900,6 +10900,31 @@
         <w:t xml:space="preserve"> takes every widget across all pages — charts as high-resolution images, KPI cards and breakdowns as styled tables — with titles, the red accent rule and the filter context in the footer.</w:t>
       </w:r>
     </w:p>
+    <w:p>
+      <w:pPr>
+        <w:spacing w:after="140"/>
+      </w:pPr>
+      <w:r>
+        <w:rPr>
+          <w:b/>
+          <w:bCs/>
+        </w:rPr>
+        <w:t xml:space="preserve">One type scale across every deck.</w:t>
+      </w:r>
+      <w:r>
+        <w:t xml:space="preserve"> A slide title is the same size whether it opens a deck or continues it, and headings, paragraphs, notes, legends and table cells match from one export to the next — the sizes live in a single </w:t>
+      </w:r>
+      <w:r>
+        <w:rPr>
+          <w:rFonts w:ascii="Consolas" w:cs="Consolas" w:eastAsia="Consolas" w:hAnsi="Consolas"/>
+          <w:shd w:fill="F2F1ED" w:val="clear"/>
+        </w:rPr>
+        <w:t xml:space="preserve">PPT_FS</w:t>
+      </w:r>
+      <w:r>
+        <w:t xml:space="preserve"> scale rather than being chosen per slide. The KPI tiles settle their own three sizes once across the whole grid, off the longest name, value and comparison in the set, so a short line no longer prints larger than a long one beside it. The Financial Summary's dense table is the deliberate exception: it still fits itself to its column count, always smaller than the body size.</w:t>
+      </w:r>
+    </w:p>
     <w:sectPr>
       <w:footerReference w:type="default" r:id="rId7"/>
       <w:pgSz w:w="11906" w:h="16838" w:orient="portrait"/>

</xml_diff>

<commit_message>
The trajectory note is written on the page, not only into the deck
It was generated into a hidden host inside the decisions panel purely so
the PowerPoint export could read its text, which left the deck printing a
sentence the screen never showed. It now sits under the chart it
describes, where it reads as commentary and can be edited and kept like
any other block. It costs almost no height: the trajectory panel was
already stretching to match the decisions panel beside it, so the note
fills space that was empty.

Co-Authored-By: Claude Fable 5 <noreply@anthropic.com>
Claude-Session: https://claude.ai/code/session_01P4DDZgm6WRNJpLjFRThM8B
</commit_message>
<xml_diff>
--- a/iwpb-sg-dashboard/IWPB_SG_Dashboard_README.docx
+++ b/iwpb-sg-dashboard/IWPB_SG_Dashboard_README.docx
@@ -1417,7 +1417,17 @@
         <w:t xml:space="preserve">vs Target</w:t>
       </w:r>
       <w:r>
-        <w:t xml:space="preserve">) showing the variance amount and % with direction triangles — the triangle tracks the business movement (revenue up ▲, cost up ▲) and the colour the favourability (green favourable, red unfavourable).</w:t>
+        <w:t xml:space="preserve">) showing the variance amount and % with direction triangles — the triangle tracks the business movement (revenue up ▲, cost up ▲) and the colour the favourability (green favourable, red unfavourable). The </w:t>
+      </w:r>
+      <w:r>
+        <w:rPr>
+          <w:b/>
+          <w:bCs/>
+        </w:rPr>
+        <w:t xml:space="preserve">⤓ PPT</w:t>
+      </w:r>
+      <w:r>
+        <w:t xml:space="preserve"> button beside Export to Excel produces the same tile grid as a single widescreen slide, built natively in PowerPoint.</w:t>
       </w:r>
     </w:p>
     <w:p>
@@ -1426,17 +1436,7 @@
         <w:ind w:left="360"/>
       </w:pPr>
       <w:r>
-        <w:t xml:space="preserve">The </w:t>
-      </w:r>
-      <w:r>
-        <w:rPr>
-          <w:b/>
-          <w:bCs/>
-        </w:rPr>
-        <w:t xml:space="preserve">⤓ PPT</w:t>
-      </w:r>
-      <w:r>
-        <w:t xml:space="preserve"> button beside Export to Excel produces the same tile grid as a single widescreen slide, built natively in PowerPoint. The deck mirrors the screen exactly: the tiles the summary is showing right now, in their rendered order — a tile behind "Show all" or parked stays off the deck, and a panel the screen hides never becomes a slide — followed by the page's own commentary: the hero line, the trajectory and Mix notes where those panels are visible, and the Management Commentary on its own slides.</w:t>
+        <w:t xml:space="preserve">The deck mirrors the screen exactly: the tiles the summary is showing right now, in their rendered order — a tile behind "Show all" or parked stays off the deck, and a panel the screen hides never becomes a slide — followed by the page's own commentary: the hero line, the trajectory and Mix notes where those panels are visible, and the Management Commentary on its own slides. The trajectory's note is written under the chart on the page itself — the selected line's movement against its baseline, its strongest actual month and the outlook against target — so what the deck prints is what the screen already shows, and it can be edited and kept like any other commentary block before exporting.</w:t>
       </w:r>
     </w:p>
     <w:p>

</xml_diff>

<commit_message>
The opening line above the KPI summary is gone
The sentence that stood above the page title is removed. It is a setting
(summary_lede) rather than deleted code, so a pack that wants it can set Y,
and the PowerPoint export follows the page either way rather than printing
a line the screen no longer shows.

Co-Authored-By: Claude Fable 5 <noreply@anthropic.com>
Claude-Session: https://claude.ai/code/session_01P4DDZgm6WRNJpLjFRThM8B
</commit_message>
<xml_diff>
--- a/iwpb-sg-dashboard/IWPB_SG_Dashboard_README.docx
+++ b/iwpb-sg-dashboard/IWPB_SG_Dashboard_README.docx
@@ -8956,6 +8956,45 @@
         <w:ind w:left="360"/>
       </w:pPr>
       <w:r>
+        <w:t xml:space="preserve">The </w:t>
+      </w:r>
+      <w:r>
+        <w:rPr>
+          <w:b/>
+          <w:bCs/>
+        </w:rPr>
+        <w:t xml:space="preserve">opening line</w:t>
+      </w:r>
+      <w:r>
+        <w:t xml:space="preserve"> that used to stand above the page title — the one sentence naming the lead line, its movement and the outlook against target — is off by default (</w:t>
+      </w:r>
+      <w:r>
+        <w:rPr>
+          <w:rFonts w:ascii="Consolas" w:cs="Consolas" w:eastAsia="Consolas" w:hAnsi="Consolas"/>
+          <w:shd w:fill="F2F1ED" w:val="clear"/>
+        </w:rPr>
+        <w:t xml:space="preserve">summary_lede</w:t>
+      </w:r>
+      <w:r>
+        <w:t xml:space="preserve">). Set it to </w:t>
+      </w:r>
+      <w:r>
+        <w:rPr>
+          <w:rFonts w:ascii="Consolas" w:cs="Consolas" w:eastAsia="Consolas" w:hAnsi="Consolas"/>
+          <w:shd w:fill="F2F1ED" w:val="clear"/>
+        </w:rPr>
+        <w:t xml:space="preserve">Y</w:t>
+      </w:r>
+      <w:r>
+        <w:t xml:space="preserve"> to bring it back; the PowerPoint export follows the page either way.</w:t>
+      </w:r>
+    </w:p>
+    <w:p>
+      <w:pPr>
+        <w:spacing w:after="140"/>
+        <w:ind w:left="360"/>
+      </w:pPr>
+      <w:r>
         <w:rPr>
           <w:b/>
           <w:bCs/>

</xml_diff>

<commit_message>
The left pane is worded entirely from the configuration
Every heading and label in the rail was already bound to a key, but the
control surface was incomplete and partly fictional: sect_comtpl, lbl_year
and lbl_tplpick reached no pack, the CIB pack carried one label row, and
sect_kpis, sect_filters, sect_output and nav_table were offered in the
template and the packs while nothing on the page read them.

The defaults now hold only keys the page consumes, and all three packs carry
that exact set with their own wording preserved, so a row in the Labels sheet
always does something and every heading in the pane can be renamed from it.

Co-Authored-By: Claude Fable 5 <noreply@anthropic.com>
Claude-Session: https://claude.ai/code/session_01P4DDZgm6WRNJpLjFRThM8B
</commit_message>
<xml_diff>
--- a/iwpb-sg-dashboard/IWPB_SG_Dashboard_README.docx
+++ b/iwpb-sg-dashboard/IWPB_SG_Dashboard_README.docx
@@ -8619,6 +8619,166 @@
           <w:ilvl w:val="0"/>
           <w:numId w:val="3"/>
         </w:numPr>
+        <w:spacing w:after="80"/>
+      </w:pPr>
+      <w:r>
+        <w:rPr>
+          <w:b/>
+          <w:bCs/>
+        </w:rPr>
+        <w:t xml:space="preserve">Labels</w:t>
+      </w:r>
+      <w:r>
+        <w:t xml:space="preserve"> — every heading, section title and control label the page shows, one </w:t>
+      </w:r>
+      <w:r>
+        <w:rPr>
+          <w:rFonts w:ascii="Consolas" w:cs="Consolas" w:eastAsia="Consolas" w:hAnsi="Consolas"/>
+          <w:shd w:fill="F2F1ED" w:val="clear"/>
+        </w:rPr>
+        <w:t xml:space="preserve">Key | Text</w:t>
+      </w:r>
+      <w:r>
+        <w:t xml:space="preserve"> row each. The whole left rail is worded here: the section headings (</w:t>
+      </w:r>
+      <w:r>
+        <w:rPr>
+          <w:rFonts w:ascii="Consolas" w:cs="Consolas" w:eastAsia="Consolas" w:hAnsi="Consolas"/>
+          <w:shd w:fill="F2F1ED" w:val="clear"/>
+        </w:rPr>
+        <w:t xml:space="preserve">sect_dashboards</w:t>
+      </w:r>
+      <w:r>
+        <w:t xml:space="preserve">, </w:t>
+      </w:r>
+      <w:r>
+        <w:rPr>
+          <w:rFonts w:ascii="Consolas" w:cs="Consolas" w:eastAsia="Consolas" w:hAnsi="Consolas"/>
+          <w:shd w:fill="F2F1ED" w:val="clear"/>
+        </w:rPr>
+        <w:t xml:space="preserve">sect_config</w:t>
+      </w:r>
+      <w:r>
+        <w:t xml:space="preserve">, </w:t>
+      </w:r>
+      <w:r>
+        <w:rPr>
+          <w:rFonts w:ascii="Consolas" w:cs="Consolas" w:eastAsia="Consolas" w:hAnsi="Consolas"/>
+          <w:shd w:fill="F2F1ED" w:val="clear"/>
+        </w:rPr>
+        <w:t xml:space="preserve">sect_period</w:t>
+      </w:r>
+      <w:r>
+        <w:t xml:space="preserve">, </w:t>
+      </w:r>
+      <w:r>
+        <w:rPr>
+          <w:rFonts w:ascii="Consolas" w:cs="Consolas" w:eastAsia="Consolas" w:hAnsi="Consolas"/>
+          <w:shd w:fill="F2F1ED" w:val="clear"/>
+        </w:rPr>
+        <w:t xml:space="preserve">sect_comtpl</w:t>
+      </w:r>
+      <w:r>
+        <w:t xml:space="preserve">), every navigation entry (</w:t>
+      </w:r>
+      <w:r>
+        <w:rPr>
+          <w:rFonts w:ascii="Consolas" w:cs="Consolas" w:eastAsia="Consolas" w:hAnsi="Consolas"/>
+          <w:shd w:fill="F2F1ED" w:val="clear"/>
+        </w:rPr>
+        <w:t xml:space="preserve">nav_*</w:t>
+      </w:r>
+      <w:r>
+        <w:t xml:space="preserve">), the ingest button and page (</w:t>
+      </w:r>
+      <w:r>
+        <w:rPr>
+          <w:rFonts w:ascii="Consolas" w:cs="Consolas" w:eastAsia="Consolas" w:hAnsi="Consolas"/>
+          <w:shd w:fill="F2F1ED" w:val="clear"/>
+        </w:rPr>
+        <w:t xml:space="preserve">btn_newfile</w:t>
+      </w:r>
+      <w:r>
+        <w:t xml:space="preserve">, </w:t>
+      </w:r>
+      <w:r>
+        <w:rPr>
+          <w:rFonts w:ascii="Consolas" w:cs="Consolas" w:eastAsia="Consolas" w:hAnsi="Consolas"/>
+          <w:shd w:fill="F2F1ED" w:val="clear"/>
+        </w:rPr>
+        <w:t xml:space="preserve">ingest_title</w:t>
+      </w:r>
+      <w:r>
+        <w:t xml:space="preserve">, </w:t>
+      </w:r>
+      <w:r>
+        <w:rPr>
+          <w:rFonts w:ascii="Consolas" w:cs="Consolas" w:eastAsia="Consolas" w:hAnsi="Consolas"/>
+          <w:shd w:fill="F2F1ED" w:val="clear"/>
+        </w:rPr>
+        <w:t xml:space="preserve">ingest_drop</w:t>
+      </w:r>
+      <w:r>
+        <w:t xml:space="preserve">) and the period controls (</w:t>
+      </w:r>
+      <w:r>
+        <w:rPr>
+          <w:rFonts w:ascii="Consolas" w:cs="Consolas" w:eastAsia="Consolas" w:hAnsi="Consolas"/>
+          <w:shd w:fill="F2F1ED" w:val="clear"/>
+        </w:rPr>
+        <w:t xml:space="preserve">lbl_year</w:t>
+      </w:r>
+      <w:r>
+        <w:t xml:space="preserve">, </w:t>
+      </w:r>
+      <w:r>
+        <w:rPr>
+          <w:rFonts w:ascii="Consolas" w:cs="Consolas" w:eastAsia="Consolas" w:hAnsi="Consolas"/>
+          <w:shd w:fill="F2F1ED" w:val="clear"/>
+        </w:rPr>
+        <w:t xml:space="preserve">lbl_ytd</w:t>
+      </w:r>
+      <w:r>
+        <w:t xml:space="preserve">, </w:t>
+      </w:r>
+      <w:r>
+        <w:rPr>
+          <w:rFonts w:ascii="Consolas" w:cs="Consolas" w:eastAsia="Consolas" w:hAnsi="Consolas"/>
+          <w:shd w:fill="F2F1ED" w:val="clear"/>
+        </w:rPr>
+        <w:t xml:space="preserve">lbl_varper</w:t>
+      </w:r>
+      <w:r>
+        <w:t xml:space="preserve">, </w:t>
+      </w:r>
+      <w:r>
+        <w:rPr>
+          <w:rFonts w:ascii="Consolas" w:cs="Consolas" w:eastAsia="Consolas" w:hAnsi="Consolas"/>
+          <w:shd w:fill="F2F1ED" w:val="clear"/>
+        </w:rPr>
+        <w:t xml:space="preserve">lbl_units</w:t>
+      </w:r>
+      <w:r>
+        <w:t xml:space="preserve">). Change a row and the pane follows on the next config load — nothing in the rail is hard-coded. The three packs carry the complete set, and </w:t>
+      </w:r>
+      <w:r>
+        <w:rPr>
+          <w:b/>
+          <w:bCs/>
+        </w:rPr>
+        <w:t xml:space="preserve">Download template CSV</w:t>
+      </w:r>
+      <w:r>
+        <w:t xml:space="preserve"> lists every key with its default, so the full surface is discoverable without reading the page source.</w:t>
+      </w:r>
+    </w:p>
+    <w:p>
+      <w:pPr>
+        <w:pStyle w:val="ListParagraph"/>
+        <w:numPr>
+          <w:ilvl w:val="0"/>
+          <w:numId w:val="3"/>
+        </w:numPr>
         <w:spacing w:after="100"/>
       </w:pPr>
       <w:r>

</xml_diff>

<commit_message>
The simulation shows the forecast month by month, and exports it
Every forecast month with its prior figure, its simulated figure and the
movement between them, under the impact table. A P&L foots to the sum of
those months; a balance foots to the closing month, since each month is a
closing position and adding them would overstate. The Excel export carries
the impact on one sheet and the months on another.

Co-Authored-By: Claude Fable 5 <noreply@anthropic.com>
Claude-Session: https://claude.ai/code/session_01P4DDZgm6WRNJpLjFRThM8B
</commit_message>
<xml_diff>
--- a/iwpb-sg-dashboard/IWPB_SG_Dashboard_README.docx
+++ b/iwpb-sg-dashboard/IWPB_SG_Dashboard_README.docx
@@ -7910,7 +7910,33 @@
         <w:t xml:space="preserve">US$bn</w:t>
       </w:r>
       <w:r>
-        <w:t xml:space="preserve"> — the last forecast month's closing position, never a sum of monthly balances — and mixed scopes total the P&amp;L side only, with balances stated separately. Simulations save by name (localStorage) for reload; the work-in-progress simulation survives refreshes.</w:t>
+        <w:t xml:space="preserve"> — the last forecast month's closing position, never a sum of monthly balances — and mixed scopes total the P&amp;L side only, with balances stated separately. A </w:t>
+      </w:r>
+      <w:r>
+        <w:rPr>
+          <w:b/>
+          <w:bCs/>
+        </w:rPr>
+        <w:t xml:space="preserve">Forecast by month</w:t>
+      </w:r>
+      <w:r>
+        <w:t xml:space="preserve"> table sits under the impact table: every forecast month with its prior forecast, its simulated figure and the movement between them. A P&amp;L foots to the sum of those months; a balance never does — each month is a closing position and the foot is the closing month, so the months are never added up.</w:t>
+      </w:r>
+    </w:p>
+    <w:p>
+      <w:pPr>
+        <w:spacing w:after="100"/>
+        <w:ind w:left="360"/>
+      </w:pPr>
+      <w:r>
+        <w:rPr>
+          <w:b/>
+          <w:bCs/>
+        </w:rPr>
+        <w:t xml:space="preserve">⤓ Excel</w:t>
+      </w:r>
+      <w:r>
+        <w:t xml:space="preserve"> carries both tables, the impact on one sheet and the month-by-month on another. Simulations save by name (localStorage) for reload; the work-in-progress simulation survives refreshes.</w:t>
       </w:r>
     </w:p>
     <w:p>

</xml_diff>

<commit_message>
The comparison reads by month, and its export carries the same
The comparison held each simulation's monthly path for the chart but
tabulated only FY totals. A Comparison by month table now sets the prior
forecast path against each simulation, a column each, footing to the sum of
the forecast months — a balance-based simulation shows its months but stays
out of the footing, since balances are never added up.

Its Excel carries the FY comparison and the months on separate sheets, each
opening with the scope, units and a rule table naming how every simulation
in the comparison is applied.

Also fixes the comparison commentary bracketing a negative twice — fmt
already brackets, so a shortfall read as ((150)).

Co-Authored-By: Claude Fable 5 <noreply@anthropic.com>
Claude-Session: https://claude.ai/code/session_01P4DDZgm6WRNJpLjFRThM8B
</commit_message>
<xml_diff>
--- a/iwpb-sg-dashboard/IWPB_SG_Dashboard_README.docx
+++ b/iwpb-sg-dashboard/IWPB_SG_Dashboard_README.docx
@@ -7936,7 +7936,43 @@
         <w:t xml:space="preserve">⤓ Excel</w:t>
       </w:r>
       <w:r>
-        <w:t xml:space="preserve"> sits on the result itself and carries both tables, the impact on one sheet and the month-by-month on another. Each sheet opens with what was run and over what: the simulation's name and category, the scope in force (business, region, country, month), the basis and units, the forecast months and the source file — then a rule table setting out how it was applied, one row per rule with its scope, its second condition, the statement it touches, the adjustment, the change and the months — and then the figures. Simulations save by name (localStorage) for reload; the work-in-progress simulation survives refreshes.</w:t>
+        <w:t xml:space="preserve"> sits on the result itself and carries both tables, the impact on one sheet and the month-by-month on another. Each sheet opens with what was run and over what: the simulation's name and category, the scope in force (business, region, country, month), the basis and units, the forecast months and the source file — then a rule table setting out how it was applied, one row per rule with its scope, its second condition, the statement it touches, the adjustment, the change and the months — and then the figures.</w:t>
+      </w:r>
+    </w:p>
+    <w:p>
+      <w:pPr>
+        <w:spacing w:after="100"/>
+        <w:ind w:left="360"/>
+      </w:pPr>
+      <w:r>
+        <w:rPr>
+          <w:b/>
+          <w:bCs/>
+        </w:rPr>
+        <w:t xml:space="preserve">Compare simulations</w:t>
+      </w:r>
+      <w:r>
+        <w:t xml:space="preserve"> runs any number of saved simulations side by side against the prior forecast — the picker groups them by their Category — with a chart, an FY outlook table and a </w:t>
+      </w:r>
+      <w:r>
+        <w:rPr>
+          <w:b/>
+          <w:bCs/>
+        </w:rPr>
+        <w:t xml:space="preserve">Comparison by month</w:t>
+      </w:r>
+      <w:r>
+        <w:t xml:space="preserve"> table: the prior forecast path with each simulation in its own column, footing to the sum of the forecast months. Its </w:t>
+      </w:r>
+      <w:r>
+        <w:rPr>
+          <w:b/>
+          <w:bCs/>
+        </w:rPr>
+        <w:t xml:space="preserve">⤓ Excel</w:t>
+      </w:r>
+      <w:r>
+        <w:t xml:space="preserve"> carries the FY comparison on one sheet and the month-by-month on another, each opening with the scope, units and a rule table naming how every simulation in the comparison is applied. Simulations save by name (localStorage) for reload; the work-in-progress simulation survives refreshes.</w:t>
       </w:r>
     </w:p>
     <w:p>

</xml_diff>

<commit_message>
A count scales from units, not from the file's currency scale
Money and a count start from different places, so they cannot divide the same
way. Money is stated against the file's own unit: a file in US$m carrying a
line declared US$m divides by one, and one declared US$bn by a thousand. A
count has no such base — 162,369 customers is 162,369 units — so a count
declared in millions divides by a million and prints as 0.16mn.

A count is also named the way a pack writes it, with no currency in front:
"mn", not "m" and not "US$m". And a figure scaled below one keeps two
decimals rather than rounding itself away, so 0.16 does not read as 0.2.

Co-Authored-By: Claude Opus 5 <noreply@anthropic.com>
Claude-Session: https://claude.ai/code/session_01P4DDZgm6WRNJpLjFRThM8B
</commit_message>
<xml_diff>
--- a/iwpb-sg-dashboard/IWPB_SG_Dashboard_README.docx
+++ b/iwpb-sg-dashboard/IWPB_SG_Dashboard_README.docx
@@ -11044,7 +11044,7 @@
               <w:spacing w:after="0"/>
             </w:pPr>
             <w:r>
-              <w:t xml:space="preserve">m, bn, k</w:t>
+              <w:t xml:space="preserve">mn, bn, k</w:t>
             </w:r>
           </w:p>
         </w:tc>
@@ -11314,6 +11314,82 @@
       <w:pPr>
         <w:spacing w:after="160"/>
       </w:pPr>
+    </w:p>
+    <w:p>
+      <w:pPr>
+        <w:spacing w:after="140"/>
+        <w:ind w:left="360"/>
+      </w:pPr>
+      <w:r>
+        <w:rPr>
+          <w:b/>
+          <w:bCs/>
+        </w:rPr>
+        <w:t xml:space="preserve">The two kinds scale from different bases</w:t>
+      </w:r>
+      <w:r>
+        <w:t xml:space="preserve">, because they start from different places. Money is stated against the file's own unit — a file in US$m carrying a line declared </w:t>
+      </w:r>
+      <w:r>
+        <w:rPr>
+          <w:rFonts w:ascii="Consolas" w:cs="Consolas" w:eastAsia="Consolas" w:hAnsi="Consolas"/>
+          <w:shd w:fill="F2F1ED" w:val="clear"/>
+        </w:rPr>
+        <w:t xml:space="preserve">US$m</w:t>
+      </w:r>
+      <w:r>
+        <w:t xml:space="preserve"> divides by one, and one declared </w:t>
+      </w:r>
+      <w:r>
+        <w:rPr>
+          <w:rFonts w:ascii="Consolas" w:cs="Consolas" w:eastAsia="Consolas" w:hAnsi="Consolas"/>
+          <w:shd w:fill="F2F1ED" w:val="clear"/>
+        </w:rPr>
+        <w:t xml:space="preserve">US$bn</w:t>
+      </w:r>
+      <w:r>
+        <w:t xml:space="preserve"> by a thousand. A count has no such base: 162,369 customers is 162,369 units, so a count declared </w:t>
+      </w:r>
+      <w:r>
+        <w:rPr>
+          <w:rFonts w:ascii="Consolas" w:cs="Consolas" w:eastAsia="Consolas" w:hAnsi="Consolas"/>
+          <w:shd w:fill="F2F1ED" w:val="clear"/>
+        </w:rPr>
+        <w:t xml:space="preserve">mn</w:t>
+      </w:r>
+      <w:r>
+        <w:t xml:space="preserve"> divides by a </w:t>
+      </w:r>
+      <w:r>
+        <w:rPr>
+          <w:b/>
+          <w:bCs/>
+        </w:rPr>
+        <w:t xml:space="preserve">million</w:t>
+      </w:r>
+      <w:r>
+        <w:t xml:space="preserve"> and prints as </w:t>
+      </w:r>
+      <w:r>
+        <w:rPr>
+          <w:rFonts w:ascii="Consolas" w:cs="Consolas" w:eastAsia="Consolas" w:hAnsi="Consolas"/>
+          <w:shd w:fill="F2F1ED" w:val="clear"/>
+        </w:rPr>
+        <w:t xml:space="preserve">0.16mn</w:t>
+      </w:r>
+      <w:r>
+        <w:t xml:space="preserve">. A count declared </w:t>
+      </w:r>
+      <w:r>
+        <w:rPr>
+          <w:rFonts w:ascii="Consolas" w:cs="Consolas" w:eastAsia="Consolas" w:hAnsi="Consolas"/>
+          <w:shd w:fill="F2F1ED" w:val="clear"/>
+        </w:rPr>
+        <w:t xml:space="preserve">Absolute</w:t>
+      </w:r>
+      <w:r>
+        <w:t xml:space="preserve"> divides by one. A figure scaled below one keeps two decimals rather than rounding itself away.</w:t>
+      </w:r>
     </w:p>
     <w:p>
       <w:pPr>

</xml_diff>

<commit_message>
A row's unit survives the tab merge, and a ratio says why it has no total
A file with one tab per country builds its rows afresh on a merged column
grid, and that merge was dropping the unit each row came with. On such a file
a ratio reported per country was neither declared nor gated, and three
countries' CER could have been added into a group figure of 1.5579. The unit
now travels with the row, so the rule reads never and the gate blocks the
sum, exactly as it does on a single-tab file.

A scope that carries no total now says why in the words that fit it: a ratio
is read at the level it is reported rather than added; counts of different
things are never added together; anything else names the units it found.

Co-Authored-By: Claude Opus 5 <noreply@anthropic.com>
Claude-Session: https://claude.ai/code/session_01P4DDZgm6WRNJpLjFRThM8B
</commit_message>
<xml_diff>
--- a/iwpb-sg-dashboard/IWPB_SG_Dashboard_README.docx
+++ b/iwpb-sg-dashboard/IWPB_SG_Dashboard_README.docx
@@ -12943,6 +12943,21 @@
           <w:rFonts w:ascii="Consolas" w:cs="Consolas" w:eastAsia="Consolas" w:hAnsi="Consolas"/>
           <w:shd w:fill="F2F1ED" w:val="clear"/>
         </w:rPr>
+        <w:t xml:space="preserve">sample/IWPB_CER_ThreeCountries.xlsx</w:t>
+      </w:r>
+      <w:r>
+        <w:t xml:space="preserve"> is the same extract split across Singapore, Malaysia and Vietnam, each reporting its own CER%. Load it to see a ratio refuse to roll up: the three read 0.4526, 0.5470 and 0.5583, and the Group tile shows no figure at all rather than the 1.5579 they would sum to.</w:t>
+      </w:r>
+    </w:p>
+    <w:p>
+      <w:pPr>
+        <w:spacing w:after="140"/>
+      </w:pPr>
+      <w:r>
+        <w:rPr>
+          <w:rFonts w:ascii="Consolas" w:cs="Consolas" w:eastAsia="Consolas" w:hAnsi="Consolas"/>
+          <w:shd w:fill="F2F1ED" w:val="clear"/>
+        </w:rPr>
         <w:t xml:space="preserve">sample/IWPB_UnitColumn_Driller.xlsx</w:t>
       </w:r>
       <w:r>

</xml_diff>